<commit_message>
Refactor: Remove all comments across HTML, CSS, and JS files; update code docx
</commit_message>
<xml_diff>
--- a/API_Monitoring_Source_Code.docx
+++ b/API_Monitoring_Source_Code.docx
@@ -209,32 +209,6 @@
           <w:color w:val="1E293B"/>
           <w:sz w:val="17"/>
         </w:rPr>
-        <w:t xml:space="preserve"> </w:t>
-      </w:r>
-    </w:p>
-    <w:p>
-      <w:pPr>
-        <w:spacing w:before="0" w:after="0" w:line="210" w:lineRule="exact"/>
-      </w:pPr>
-      <w:r>
-        <w:rPr>
-          <w:rFonts w:ascii="Consolas" w:hAnsi="Consolas"/>
-          <w:color w:val="1E293B"/>
-          <w:sz w:val="17"/>
-        </w:rPr>
-        <w:t xml:space="preserve">    &lt;!-- Sidebar Navigation --&gt;</w:t>
-      </w:r>
-    </w:p>
-    <w:p>
-      <w:pPr>
-        <w:spacing w:before="0" w:after="0" w:line="210" w:lineRule="exact"/>
-      </w:pPr>
-      <w:r>
-        <w:rPr>
-          <w:rFonts w:ascii="Consolas" w:hAnsi="Consolas"/>
-          <w:color w:val="1E293B"/>
-          <w:sz w:val="17"/>
-        </w:rPr>
         <w:t xml:space="preserve">    &lt;aside class="sidebar" id="sidebar"&gt;</w:t>
       </w:r>
     </w:p>
@@ -534,32 +508,6 @@
           <w:color w:val="1E293B"/>
           <w:sz w:val="17"/>
         </w:rPr>
-        <w:t xml:space="preserve"> </w:t>
-      </w:r>
-    </w:p>
-    <w:p>
-      <w:pPr>
-        <w:spacing w:before="0" w:after="0" w:line="210" w:lineRule="exact"/>
-      </w:pPr>
-      <w:r>
-        <w:rPr>
-          <w:rFonts w:ascii="Consolas" w:hAnsi="Consolas"/>
-          <w:color w:val="1E293B"/>
-          <w:sz w:val="17"/>
-        </w:rPr>
-        <w:t xml:space="preserve">    &lt;!-- Mobile Header --&gt;</w:t>
-      </w:r>
-    </w:p>
-    <w:p>
-      <w:pPr>
-        <w:spacing w:before="0" w:after="0" w:line="210" w:lineRule="exact"/>
-      </w:pPr>
-      <w:r>
-        <w:rPr>
-          <w:rFonts w:ascii="Consolas" w:hAnsi="Consolas"/>
-          <w:color w:val="1E293B"/>
-          <w:sz w:val="17"/>
-        </w:rPr>
         <w:t xml:space="preserve">    &lt;header class="mobile-header" id="mobile-header"&gt;</w:t>
       </w:r>
     </w:p>
@@ -664,19 +612,6 @@
           <w:color w:val="1E293B"/>
           <w:sz w:val="17"/>
         </w:rPr>
-        <w:t xml:space="preserve"> </w:t>
-      </w:r>
-    </w:p>
-    <w:p>
-      <w:pPr>
-        <w:spacing w:before="0" w:after="0" w:line="210" w:lineRule="exact"/>
-      </w:pPr>
-      <w:r>
-        <w:rPr>
-          <w:rFonts w:ascii="Consolas" w:hAnsi="Consolas"/>
-          <w:color w:val="1E293B"/>
-          <w:sz w:val="17"/>
-        </w:rPr>
         <w:t xml:space="preserve">    &lt;div class="sidebar-overlay" id="sidebar-overlay"&gt;&lt;/div&gt;</w:t>
       </w:r>
     </w:p>
@@ -690,32 +625,6 @@
           <w:color w:val="1E293B"/>
           <w:sz w:val="17"/>
         </w:rPr>
-        <w:t xml:space="preserve"> </w:t>
-      </w:r>
-    </w:p>
-    <w:p>
-      <w:pPr>
-        <w:spacing w:before="0" w:after="0" w:line="210" w:lineRule="exact"/>
-      </w:pPr>
-      <w:r>
-        <w:rPr>
-          <w:rFonts w:ascii="Consolas" w:hAnsi="Consolas"/>
-          <w:color w:val="1E293B"/>
-          <w:sz w:val="17"/>
-        </w:rPr>
-        <w:t xml:space="preserve">    &lt;!-- Main Canvas --&gt;</w:t>
-      </w:r>
-    </w:p>
-    <w:p>
-      <w:pPr>
-        <w:spacing w:before="0" w:after="0" w:line="210" w:lineRule="exact"/>
-      </w:pPr>
-      <w:r>
-        <w:rPr>
-          <w:rFonts w:ascii="Consolas" w:hAnsi="Consolas"/>
-          <w:color w:val="1E293B"/>
-          <w:sz w:val="17"/>
-        </w:rPr>
         <w:t xml:space="preserve">    &lt;main class="main-content" id="main-content"&gt;</w:t>
       </w:r>
     </w:p>
@@ -729,32 +638,6 @@
           <w:color w:val="1E293B"/>
           <w:sz w:val="17"/>
         </w:rPr>
-        <w:t xml:space="preserve"> </w:t>
-      </w:r>
-    </w:p>
-    <w:p>
-      <w:pPr>
-        <w:spacing w:before="0" w:after="0" w:line="210" w:lineRule="exact"/>
-      </w:pPr>
-      <w:r>
-        <w:rPr>
-          <w:rFonts w:ascii="Consolas" w:hAnsi="Consolas"/>
-          <w:color w:val="1E293B"/>
-          <w:sz w:val="17"/>
-        </w:rPr>
-        <w:t xml:space="preserve">        &lt;!-- Top Navigation --&gt;</w:t>
-      </w:r>
-    </w:p>
-    <w:p>
-      <w:pPr>
-        <w:spacing w:before="0" w:after="0" w:line="210" w:lineRule="exact"/>
-      </w:pPr>
-      <w:r>
-        <w:rPr>
-          <w:rFonts w:ascii="Consolas" w:hAnsi="Consolas"/>
-          <w:color w:val="1E293B"/>
-          <w:sz w:val="17"/>
-        </w:rPr>
         <w:t xml:space="preserve">        &lt;div class="top-nav-bar"&gt;</w:t>
       </w:r>
     </w:p>
@@ -1041,32 +924,6 @@
           <w:color w:val="1E293B"/>
           <w:sz w:val="17"/>
         </w:rPr>
-        <w:t xml:space="preserve"> </w:t>
-      </w:r>
-    </w:p>
-    <w:p>
-      <w:pPr>
-        <w:spacing w:before="0" w:after="0" w:line="210" w:lineRule="exact"/>
-      </w:pPr>
-      <w:r>
-        <w:rPr>
-          <w:rFonts w:ascii="Consolas" w:hAnsi="Consolas"/>
-          <w:color w:val="1E293B"/>
-          <w:sz w:val="17"/>
-        </w:rPr>
-        <w:t xml:space="preserve">        &lt;!-- 1. DASHBOARD PAGE --&gt;</w:t>
-      </w:r>
-    </w:p>
-    <w:p>
-      <w:pPr>
-        <w:spacing w:before="0" w:after="0" w:line="210" w:lineRule="exact"/>
-      </w:pPr>
-      <w:r>
-        <w:rPr>
-          <w:rFonts w:ascii="Consolas" w:hAnsi="Consolas"/>
-          <w:color w:val="1E293B"/>
-          <w:sz w:val="17"/>
-        </w:rPr>
         <w:t xml:space="preserve">        &lt;section class="page active" id="page-dashboard"&gt;</w:t>
       </w:r>
     </w:p>
@@ -1106,19 +963,6 @@
           <w:color w:val="1E293B"/>
           <w:sz w:val="17"/>
         </w:rPr>
-        <w:t xml:space="preserve">                    &lt;!-- Hero Cards Row --&gt;</w:t>
-      </w:r>
-    </w:p>
-    <w:p>
-      <w:pPr>
-        <w:spacing w:before="0" w:after="0" w:line="210" w:lineRule="exact"/>
-      </w:pPr>
-      <w:r>
-        <w:rPr>
-          <w:rFonts w:ascii="Consolas" w:hAnsi="Consolas"/>
-          <w:color w:val="1E293B"/>
-          <w:sz w:val="17"/>
-        </w:rPr>
         <w:t xml:space="preserve">                    &lt;div class="ref-hero-row"&gt;</w:t>
       </w:r>
     </w:p>
@@ -1132,19 +976,6 @@
           <w:color w:val="1E293B"/>
           <w:sz w:val="17"/>
         </w:rPr>
-        <w:t xml:space="preserve">                        &lt;!-- Hero Sunset Wave Card --&gt;</w:t>
-      </w:r>
-    </w:p>
-    <w:p>
-      <w:pPr>
-        <w:spacing w:before="0" w:after="0" w:line="210" w:lineRule="exact"/>
-      </w:pPr>
-      <w:r>
-        <w:rPr>
-          <w:rFonts w:ascii="Consolas" w:hAnsi="Consolas"/>
-          <w:color w:val="1E293B"/>
-          <w:sz w:val="17"/>
-        </w:rPr>
         <w:t xml:space="preserve">                        &lt;div class="ref-card gradient-hero-card"&gt;</w:t>
       </w:r>
     </w:p>
@@ -1314,32 +1145,6 @@
           <w:color w:val="1E293B"/>
           <w:sz w:val="17"/>
         </w:rPr>
-        <w:t xml:space="preserve"> </w:t>
-      </w:r>
-    </w:p>
-    <w:p>
-      <w:pPr>
-        <w:spacing w:before="0" w:after="0" w:line="210" w:lineRule="exact"/>
-      </w:pPr>
-      <w:r>
-        <w:rPr>
-          <w:rFonts w:ascii="Consolas" w:hAnsi="Consolas"/>
-          <w:color w:val="1E293B"/>
-          <w:sz w:val="17"/>
-        </w:rPr>
-        <w:t xml:space="preserve">                        &lt;!-- Donut Breakdown Card --&gt;</w:t>
-      </w:r>
-    </w:p>
-    <w:p>
-      <w:pPr>
-        <w:spacing w:before="0" w:after="0" w:line="210" w:lineRule="exact"/>
-      </w:pPr>
-      <w:r>
-        <w:rPr>
-          <w:rFonts w:ascii="Consolas" w:hAnsi="Consolas"/>
-          <w:color w:val="1E293B"/>
-          <w:sz w:val="17"/>
-        </w:rPr>
         <w:t xml:space="preserve">                        &lt;div class="ref-card donut-breakdown-card"&gt;</w:t>
       </w:r>
     </w:p>
@@ -1652,32 +1457,6 @@
           <w:color w:val="1E293B"/>
           <w:sz w:val="17"/>
         </w:rPr>
-        <w:t xml:space="preserve"> </w:t>
-      </w:r>
-    </w:p>
-    <w:p>
-      <w:pPr>
-        <w:spacing w:before="0" w:after="0" w:line="210" w:lineRule="exact"/>
-      </w:pPr>
-      <w:r>
-        <w:rPr>
-          <w:rFonts w:ascii="Consolas" w:hAnsi="Consolas"/>
-          <w:color w:val="1E293B"/>
-          <w:sz w:val="17"/>
-        </w:rPr>
-        <w:t xml:space="preserve">                    &lt;!-- Activity Tabs &amp; List --&gt;</w:t>
-      </w:r>
-    </w:p>
-    <w:p>
-      <w:pPr>
-        <w:spacing w:before="0" w:after="0" w:line="210" w:lineRule="exact"/>
-      </w:pPr>
-      <w:r>
-        <w:rPr>
-          <w:rFonts w:ascii="Consolas" w:hAnsi="Consolas"/>
-          <w:color w:val="1E293B"/>
-          <w:sz w:val="17"/>
-        </w:rPr>
         <w:t xml:space="preserve">                    &lt;div class="ref-activity-section"&gt;</w:t>
       </w:r>
     </w:p>
@@ -1834,32 +1613,6 @@
           <w:color w:val="1E293B"/>
           <w:sz w:val="17"/>
         </w:rPr>
-        <w:t xml:space="preserve"> </w:t>
-      </w:r>
-    </w:p>
-    <w:p>
-      <w:pPr>
-        <w:spacing w:before="0" w:after="0" w:line="210" w:lineRule="exact"/>
-      </w:pPr>
-      <w:r>
-        <w:rPr>
-          <w:rFonts w:ascii="Consolas" w:hAnsi="Consolas"/>
-          <w:color w:val="1E293B"/>
-          <w:sz w:val="17"/>
-        </w:rPr>
-        <w:t xml:space="preserve">                &lt;!-- Right Column Cards --&gt;</w:t>
-      </w:r>
-    </w:p>
-    <w:p>
-      <w:pPr>
-        <w:spacing w:before="0" w:after="0" w:line="210" w:lineRule="exact"/>
-      </w:pPr>
-      <w:r>
-        <w:rPr>
-          <w:rFonts w:ascii="Consolas" w:hAnsi="Consolas"/>
-          <w:color w:val="1E293B"/>
-          <w:sz w:val="17"/>
-        </w:rPr>
         <w:t xml:space="preserve">                &lt;div class="ref-side-col"&gt;</w:t>
       </w:r>
     </w:p>
@@ -2003,19 +1756,6 @@
           <w:color w:val="1E293B"/>
           <w:sz w:val="17"/>
         </w:rPr>
-        <w:t xml:space="preserve"> </w:t>
-      </w:r>
-    </w:p>
-    <w:p>
-      <w:pPr>
-        <w:spacing w:before="0" w:after="0" w:line="210" w:lineRule="exact"/>
-      </w:pPr>
-      <w:r>
-        <w:rPr>
-          <w:rFonts w:ascii="Consolas" w:hAnsi="Consolas"/>
-          <w:color w:val="1E293B"/>
-          <w:sz w:val="17"/>
-        </w:rPr>
         <w:t xml:space="preserve">                    &lt;div class="ref-card stats-bars-card"&gt;</w:t>
       </w:r>
     </w:p>
@@ -2198,19 +1938,6 @@
           <w:color w:val="1E293B"/>
           <w:sz w:val="17"/>
         </w:rPr>
-        <w:t xml:space="preserve"> </w:t>
-      </w:r>
-    </w:p>
-    <w:p>
-      <w:pPr>
-        <w:spacing w:before="0" w:after="0" w:line="210" w:lineRule="exact"/>
-      </w:pPr>
-      <w:r>
-        <w:rPr>
-          <w:rFonts w:ascii="Consolas" w:hAnsi="Consolas"/>
-          <w:color w:val="1E293B"/>
-          <w:sz w:val="17"/>
-        </w:rPr>
         <w:t xml:space="preserve">                    &lt;div class="ref-card mini-metric-card"&gt;</w:t>
       </w:r>
     </w:p>
@@ -2380,32 +2107,6 @@
           <w:color w:val="1E293B"/>
           <w:sz w:val="17"/>
         </w:rPr>
-        <w:t xml:space="preserve"> </w:t>
-      </w:r>
-    </w:p>
-    <w:p>
-      <w:pPr>
-        <w:spacing w:before="0" w:after="0" w:line="210" w:lineRule="exact"/>
-      </w:pPr>
-      <w:r>
-        <w:rPr>
-          <w:rFonts w:ascii="Consolas" w:hAnsi="Consolas"/>
-          <w:color w:val="1E293B"/>
-          <w:sz w:val="17"/>
-        </w:rPr>
-        <w:t xml:space="preserve">        &lt;!-- 2. APIs MANAGEMENT PAGE --&gt;</w:t>
-      </w:r>
-    </w:p>
-    <w:p>
-      <w:pPr>
-        <w:spacing w:before="0" w:after="0" w:line="210" w:lineRule="exact"/>
-      </w:pPr>
-      <w:r>
-        <w:rPr>
-          <w:rFonts w:ascii="Consolas" w:hAnsi="Consolas"/>
-          <w:color w:val="1E293B"/>
-          <w:sz w:val="17"/>
-        </w:rPr>
         <w:t xml:space="preserve">        &lt;section class="page" id="page-apis"&gt;</w:t>
       </w:r>
     </w:p>
@@ -2822,32 +2523,6 @@
           <w:color w:val="1E293B"/>
           <w:sz w:val="17"/>
         </w:rPr>
-        <w:t xml:space="preserve"> </w:t>
-      </w:r>
-    </w:p>
-    <w:p>
-      <w:pPr>
-        <w:spacing w:before="0" w:after="0" w:line="210" w:lineRule="exact"/>
-      </w:pPr>
-      <w:r>
-        <w:rPr>
-          <w:rFonts w:ascii="Consolas" w:hAnsi="Consolas"/>
-          <w:color w:val="1E293B"/>
-          <w:sz w:val="17"/>
-        </w:rPr>
-        <w:t xml:space="preserve">        &lt;!-- 3. MONITOR PAGE --&gt;</w:t>
-      </w:r>
-    </w:p>
-    <w:p>
-      <w:pPr>
-        <w:spacing w:before="0" w:after="0" w:line="210" w:lineRule="exact"/>
-      </w:pPr>
-      <w:r>
-        <w:rPr>
-          <w:rFonts w:ascii="Consolas" w:hAnsi="Consolas"/>
-          <w:color w:val="1E293B"/>
-          <w:sz w:val="17"/>
-        </w:rPr>
         <w:t xml:space="preserve">        &lt;section class="page" id="page-monitor"&gt;</w:t>
       </w:r>
     </w:p>
@@ -2939,32 +2614,6 @@
           <w:color w:val="1E293B"/>
           <w:sz w:val="17"/>
         </w:rPr>
-        <w:t xml:space="preserve"> </w:t>
-      </w:r>
-    </w:p>
-    <w:p>
-      <w:pPr>
-        <w:spacing w:before="0" w:after="0" w:line="210" w:lineRule="exact"/>
-      </w:pPr>
-      <w:r>
-        <w:rPr>
-          <w:rFonts w:ascii="Consolas" w:hAnsi="Consolas"/>
-          <w:color w:val="1E293B"/>
-          <w:sz w:val="17"/>
-        </w:rPr>
-        <w:t xml:space="preserve">        &lt;!-- 4. HISTORY PAGE --&gt;</w:t>
-      </w:r>
-    </w:p>
-    <w:p>
-      <w:pPr>
-        <w:spacing w:before="0" w:after="0" w:line="210" w:lineRule="exact"/>
-      </w:pPr>
-      <w:r>
-        <w:rPr>
-          <w:rFonts w:ascii="Consolas" w:hAnsi="Consolas"/>
-          <w:color w:val="1E293B"/>
-          <w:sz w:val="17"/>
-        </w:rPr>
         <w:t xml:space="preserve">        &lt;section class="page" id="page-history"&gt;</w:t>
       </w:r>
     </w:p>
@@ -3095,32 +2744,6 @@
           <w:color w:val="1E293B"/>
           <w:sz w:val="17"/>
         </w:rPr>
-        <w:t xml:space="preserve"> </w:t>
-      </w:r>
-    </w:p>
-    <w:p>
-      <w:pPr>
-        <w:spacing w:before="0" w:after="0" w:line="210" w:lineRule="exact"/>
-      </w:pPr>
-      <w:r>
-        <w:rPr>
-          <w:rFonts w:ascii="Consolas" w:hAnsi="Consolas"/>
-          <w:color w:val="1E293B"/>
-          <w:sz w:val="17"/>
-        </w:rPr>
-        <w:t xml:space="preserve">        &lt;!-- 5. ANALYTICS PAGE --&gt;</w:t>
-      </w:r>
-    </w:p>
-    <w:p>
-      <w:pPr>
-        <w:spacing w:before="0" w:after="0" w:line="210" w:lineRule="exact"/>
-      </w:pPr>
-      <w:r>
-        <w:rPr>
-          <w:rFonts w:ascii="Consolas" w:hAnsi="Consolas"/>
-          <w:color w:val="1E293B"/>
-          <w:sz w:val="17"/>
-        </w:rPr>
         <w:t xml:space="preserve">        &lt;section class="page" id="page-analytics"&gt;</w:t>
       </w:r>
     </w:p>
@@ -3342,19 +2965,6 @@
           <w:color w:val="1E293B"/>
           <w:sz w:val="17"/>
         </w:rPr>
-        <w:t xml:space="preserve"> </w:t>
-      </w:r>
-    </w:p>
-    <w:p>
-      <w:pPr>
-        <w:spacing w:before="0" w:after="0" w:line="210" w:lineRule="exact"/>
-      </w:pPr>
-      <w:r>
-        <w:rPr>
-          <w:rFonts w:ascii="Consolas" w:hAnsi="Consolas"/>
-          <w:color w:val="1E293B"/>
-          <w:sz w:val="17"/>
-        </w:rPr>
         <w:t xml:space="preserve">    &lt;/main&gt;</w:t>
       </w:r>
     </w:p>
@@ -3368,32 +2978,6 @@
           <w:color w:val="1E293B"/>
           <w:sz w:val="17"/>
         </w:rPr>
-        <w:t xml:space="preserve"> </w:t>
-      </w:r>
-    </w:p>
-    <w:p>
-      <w:pPr>
-        <w:spacing w:before="0" w:after="0" w:line="210" w:lineRule="exact"/>
-      </w:pPr>
-      <w:r>
-        <w:rPr>
-          <w:rFonts w:ascii="Consolas" w:hAnsi="Consolas"/>
-          <w:color w:val="1E293B"/>
-          <w:sz w:val="17"/>
-        </w:rPr>
-        <w:t xml:space="preserve">    &lt;!-- Toast &amp; Modal Containers --&gt;</w:t>
-      </w:r>
-    </w:p>
-    <w:p>
-      <w:pPr>
-        <w:spacing w:before="0" w:after="0" w:line="210" w:lineRule="exact"/>
-      </w:pPr>
-      <w:r>
-        <w:rPr>
-          <w:rFonts w:ascii="Consolas" w:hAnsi="Consolas"/>
-          <w:color w:val="1E293B"/>
-          <w:sz w:val="17"/>
-        </w:rPr>
         <w:t xml:space="preserve">    &lt;div class="toast-container" id="toast-container"&gt;&lt;/div&gt;</w:t>
       </w:r>
     </w:p>
@@ -3486,19 +3070,6 @@
           <w:sz w:val="17"/>
         </w:rPr>
         <w:t xml:space="preserve">    &lt;/div&gt;</w:t>
-      </w:r>
-    </w:p>
-    <w:p>
-      <w:pPr>
-        <w:spacing w:before="0" w:after="0" w:line="210" w:lineRule="exact"/>
-      </w:pPr>
-      <w:r>
-        <w:rPr>
-          <w:rFonts w:ascii="Consolas" w:hAnsi="Consolas"/>
-          <w:color w:val="1E293B"/>
-          <w:sz w:val="17"/>
-        </w:rPr>
-        <w:t xml:space="preserve"> </w:t>
       </w:r>
     </w:p>
     <w:p>
@@ -3570,45 +3141,6 @@
           <w:color w:val="1E293B"/>
           <w:sz w:val="17"/>
         </w:rPr>
-        <w:t>/* ==========================================================================</w:t>
-      </w:r>
-    </w:p>
-    <w:p>
-      <w:pPr>
-        <w:spacing w:before="0" w:after="0" w:line="210" w:lineRule="exact"/>
-      </w:pPr>
-      <w:r>
-        <w:rPr>
-          <w:rFonts w:ascii="Consolas" w:hAnsi="Consolas"/>
-          <w:color w:val="1E293B"/>
-          <w:sz w:val="17"/>
-        </w:rPr>
-        <w:t xml:space="preserve">   API MONITOR — CONCISE STYLESHEET (Streamlined &amp; Minimal)</w:t>
-      </w:r>
-    </w:p>
-    <w:p>
-      <w:pPr>
-        <w:spacing w:before="0" w:after="0" w:line="210" w:lineRule="exact"/>
-      </w:pPr>
-      <w:r>
-        <w:rPr>
-          <w:rFonts w:ascii="Consolas" w:hAnsi="Consolas"/>
-          <w:color w:val="1E293B"/>
-          <w:sz w:val="17"/>
-        </w:rPr>
-        <w:t xml:space="preserve">   ========================================================================== */</w:t>
-      </w:r>
-    </w:p>
-    <w:p>
-      <w:pPr>
-        <w:spacing w:before="0" w:after="0" w:line="210" w:lineRule="exact"/>
-      </w:pPr>
-      <w:r>
-        <w:rPr>
-          <w:rFonts w:ascii="Consolas" w:hAnsi="Consolas"/>
-          <w:color w:val="1E293B"/>
-          <w:sz w:val="17"/>
-        </w:rPr>
         <w:t>:root {</w:t>
       </w:r>
     </w:p>
@@ -3986,19 +3518,6 @@
           <w:color w:val="1E293B"/>
           <w:sz w:val="17"/>
         </w:rPr>
-        <w:t xml:space="preserve"> </w:t>
-      </w:r>
-    </w:p>
-    <w:p>
-      <w:pPr>
-        <w:spacing w:before="0" w:after="0" w:line="210" w:lineRule="exact"/>
-      </w:pPr>
-      <w:r>
-        <w:rPr>
-          <w:rFonts w:ascii="Consolas" w:hAnsi="Consolas"/>
-          <w:color w:val="1E293B"/>
-          <w:sz w:val="17"/>
-        </w:rPr>
         <w:t>body.dark-mode {</w:t>
       </w:r>
     </w:p>
@@ -4233,32 +3752,6 @@
           <w:color w:val="1E293B"/>
           <w:sz w:val="17"/>
         </w:rPr>
-        <w:t xml:space="preserve"> </w:t>
-      </w:r>
-    </w:p>
-    <w:p>
-      <w:pPr>
-        <w:spacing w:before="0" w:after="0" w:line="210" w:lineRule="exact"/>
-      </w:pPr>
-      <w:r>
-        <w:rPr>
-          <w:rFonts w:ascii="Consolas" w:hAnsi="Consolas"/>
-          <w:color w:val="1E293B"/>
-          <w:sz w:val="17"/>
-        </w:rPr>
-        <w:t>/* Reset &amp; Base */</w:t>
-      </w:r>
-    </w:p>
-    <w:p>
-      <w:pPr>
-        <w:spacing w:before="0" w:after="0" w:line="210" w:lineRule="exact"/>
-      </w:pPr>
-      <w:r>
-        <w:rPr>
-          <w:rFonts w:ascii="Consolas" w:hAnsi="Consolas"/>
-          <w:color w:val="1E293B"/>
-          <w:sz w:val="17"/>
-        </w:rPr>
         <w:t>*, *::before, *::after { margin: 0; padding: 0; box-sizing: border-box; }</w:t>
       </w:r>
     </w:p>
@@ -4402,32 +3895,6 @@
           <w:color w:val="1E293B"/>
           <w:sz w:val="17"/>
         </w:rPr>
-        <w:t xml:space="preserve"> </w:t>
-      </w:r>
-    </w:p>
-    <w:p>
-      <w:pPr>
-        <w:spacing w:before="0" w:after="0" w:line="210" w:lineRule="exact"/>
-      </w:pPr>
-      <w:r>
-        <w:rPr>
-          <w:rFonts w:ascii="Consolas" w:hAnsi="Consolas"/>
-          <w:color w:val="1E293B"/>
-          <w:sz w:val="17"/>
-        </w:rPr>
-        <w:t>/* Custom Scrollbar */</w:t>
-      </w:r>
-    </w:p>
-    <w:p>
-      <w:pPr>
-        <w:spacing w:before="0" w:after="0" w:line="210" w:lineRule="exact"/>
-      </w:pPr>
-      <w:r>
-        <w:rPr>
-          <w:rFonts w:ascii="Consolas" w:hAnsi="Consolas"/>
-          <w:color w:val="1E293B"/>
-          <w:sz w:val="17"/>
-        </w:rPr>
         <w:t>::-webkit-scrollbar { width: 5px; height: 5px; }</w:t>
       </w:r>
     </w:p>
@@ -4454,32 +3921,6 @@
           <w:color w:val="1E293B"/>
           <w:sz w:val="17"/>
         </w:rPr>
-        <w:t xml:space="preserve"> </w:t>
-      </w:r>
-    </w:p>
-    <w:p>
-      <w:pPr>
-        <w:spacing w:before="0" w:after="0" w:line="210" w:lineRule="exact"/>
-      </w:pPr>
-      <w:r>
-        <w:rPr>
-          <w:rFonts w:ascii="Consolas" w:hAnsi="Consolas"/>
-          <w:color w:val="1E293B"/>
-          <w:sz w:val="17"/>
-        </w:rPr>
-        <w:t>/* Sidebar */</w:t>
-      </w:r>
-    </w:p>
-    <w:p>
-      <w:pPr>
-        <w:spacing w:before="0" w:after="0" w:line="210" w:lineRule="exact"/>
-      </w:pPr>
-      <w:r>
-        <w:rPr>
-          <w:rFonts w:ascii="Consolas" w:hAnsi="Consolas"/>
-          <w:color w:val="1E293B"/>
-          <w:sz w:val="17"/>
-        </w:rPr>
         <w:t>.sidebar {</w:t>
       </w:r>
     </w:p>
@@ -4870,32 +4311,6 @@
           <w:color w:val="1E293B"/>
           <w:sz w:val="17"/>
         </w:rPr>
-        <w:t xml:space="preserve"> </w:t>
-      </w:r>
-    </w:p>
-    <w:p>
-      <w:pPr>
-        <w:spacing w:before="0" w:after="0" w:line="210" w:lineRule="exact"/>
-      </w:pPr>
-      <w:r>
-        <w:rPr>
-          <w:rFonts w:ascii="Consolas" w:hAnsi="Consolas"/>
-          <w:color w:val="1E293B"/>
-          <w:sz w:val="17"/>
-        </w:rPr>
-        <w:t>/* Mobile Header */</w:t>
-      </w:r>
-    </w:p>
-    <w:p>
-      <w:pPr>
-        <w:spacing w:before="0" w:after="0" w:line="210" w:lineRule="exact"/>
-      </w:pPr>
-      <w:r>
-        <w:rPr>
-          <w:rFonts w:ascii="Consolas" w:hAnsi="Consolas"/>
-          <w:color w:val="1E293B"/>
-          <w:sz w:val="17"/>
-        </w:rPr>
         <w:t>.mobile-header {</w:t>
       </w:r>
     </w:p>
@@ -5039,32 +4454,6 @@
           <w:color w:val="1E293B"/>
           <w:sz w:val="17"/>
         </w:rPr>
-        <w:t xml:space="preserve"> </w:t>
-      </w:r>
-    </w:p>
-    <w:p>
-      <w:pPr>
-        <w:spacing w:before="0" w:after="0" w:line="210" w:lineRule="exact"/>
-      </w:pPr>
-      <w:r>
-        <w:rPr>
-          <w:rFonts w:ascii="Consolas" w:hAnsi="Consolas"/>
-          <w:color w:val="1E293B"/>
-          <w:sz w:val="17"/>
-        </w:rPr>
-        <w:t>/* Main Content &amp; Centered Layout */</w:t>
-      </w:r>
-    </w:p>
-    <w:p>
-      <w:pPr>
-        <w:spacing w:before="0" w:after="0" w:line="210" w:lineRule="exact"/>
-      </w:pPr>
-      <w:r>
-        <w:rPr>
-          <w:rFonts w:ascii="Consolas" w:hAnsi="Consolas"/>
-          <w:color w:val="1E293B"/>
-          <w:sz w:val="17"/>
-        </w:rPr>
         <w:t>.main-content {</w:t>
       </w:r>
     </w:p>
@@ -5169,32 +4558,6 @@
           <w:color w:val="1E293B"/>
           <w:sz w:val="17"/>
         </w:rPr>
-        <w:t xml:space="preserve"> </w:t>
-      </w:r>
-    </w:p>
-    <w:p>
-      <w:pPr>
-        <w:spacing w:before="0" w:after="0" w:line="210" w:lineRule="exact"/>
-      </w:pPr>
-      <w:r>
-        <w:rPr>
-          <w:rFonts w:ascii="Consolas" w:hAnsi="Consolas"/>
-          <w:color w:val="1E293B"/>
-          <w:sz w:val="17"/>
-        </w:rPr>
-        <w:t>/* Top Nav Bar */</w:t>
-      </w:r>
-    </w:p>
-    <w:p>
-      <w:pPr>
-        <w:spacing w:before="0" w:after="0" w:line="210" w:lineRule="exact"/>
-      </w:pPr>
-      <w:r>
-        <w:rPr>
-          <w:rFonts w:ascii="Consolas" w:hAnsi="Consolas"/>
-          <w:color w:val="1E293B"/>
-          <w:sz w:val="17"/>
-        </w:rPr>
         <w:t>.top-nav-bar {</w:t>
       </w:r>
     </w:p>
@@ -5715,32 +5078,6 @@
           <w:color w:val="1E293B"/>
           <w:sz w:val="17"/>
         </w:rPr>
-        <w:t xml:space="preserve"> </w:t>
-      </w:r>
-    </w:p>
-    <w:p>
-      <w:pPr>
-        <w:spacing w:before="0" w:after="0" w:line="210" w:lineRule="exact"/>
-      </w:pPr>
-      <w:r>
-        <w:rPr>
-          <w:rFonts w:ascii="Consolas" w:hAnsi="Consolas"/>
-          <w:color w:val="1E293B"/>
-          <w:sz w:val="17"/>
-        </w:rPr>
-        <w:t>/* Dashboard Grid Layout */</w:t>
-      </w:r>
-    </w:p>
-    <w:p>
-      <w:pPr>
-        <w:spacing w:before="0" w:after="0" w:line="210" w:lineRule="exact"/>
-      </w:pPr>
-      <w:r>
-        <w:rPr>
-          <w:rFonts w:ascii="Consolas" w:hAnsi="Consolas"/>
-          <w:color w:val="1E293B"/>
-          <w:sz w:val="17"/>
-        </w:rPr>
         <w:t>.ref-dashboard-container { display: grid; grid-template-columns: 1fr 380px; gap: 28px; align-items: start; width: 100%; }</w:t>
       </w:r>
     </w:p>
@@ -5819,32 +5156,6 @@
           <w:color w:val="1E293B"/>
           <w:sz w:val="17"/>
         </w:rPr>
-        <w:t xml:space="preserve"> </w:t>
-      </w:r>
-    </w:p>
-    <w:p>
-      <w:pPr>
-        <w:spacing w:before="0" w:after="0" w:line="210" w:lineRule="exact"/>
-      </w:pPr>
-      <w:r>
-        <w:rPr>
-          <w:rFonts w:ascii="Consolas" w:hAnsi="Consolas"/>
-          <w:color w:val="1E293B"/>
-          <w:sz w:val="17"/>
-        </w:rPr>
-        <w:t>/* Hero Cards */</w:t>
-      </w:r>
-    </w:p>
-    <w:p>
-      <w:pPr>
-        <w:spacing w:before="0" w:after="0" w:line="210" w:lineRule="exact"/>
-      </w:pPr>
-      <w:r>
-        <w:rPr>
-          <w:rFonts w:ascii="Consolas" w:hAnsi="Consolas"/>
-          <w:color w:val="1E293B"/>
-          <w:sz w:val="17"/>
-        </w:rPr>
         <w:t>.ref-hero-row { display: grid; grid-template-columns: 1.15fr 1fr; gap: 24px; }</w:t>
       </w:r>
     </w:p>
@@ -6053,32 +5364,6 @@
           <w:color w:val="1E293B"/>
           <w:sz w:val="17"/>
         </w:rPr>
-        <w:t xml:space="preserve"> </w:t>
-      </w:r>
-    </w:p>
-    <w:p>
-      <w:pPr>
-        <w:spacing w:before="0" w:after="0" w:line="210" w:lineRule="exact"/>
-      </w:pPr>
-      <w:r>
-        <w:rPr>
-          <w:rFonts w:ascii="Consolas" w:hAnsi="Consolas"/>
-          <w:color w:val="1E293B"/>
-          <w:sz w:val="17"/>
-        </w:rPr>
-        <w:t>/* Donut Breakdown Card */</w:t>
-      </w:r>
-    </w:p>
-    <w:p>
-      <w:pPr>
-        <w:spacing w:before="0" w:after="0" w:line="210" w:lineRule="exact"/>
-      </w:pPr>
-      <w:r>
-        <w:rPr>
-          <w:rFonts w:ascii="Consolas" w:hAnsi="Consolas"/>
-          <w:color w:val="1E293B"/>
-          <w:sz w:val="17"/>
-        </w:rPr>
         <w:t>.donut-breakdown-card { padding: 26px 28px; display: flex; flex-direction: column; justify-content: space-between; }</w:t>
       </w:r>
     </w:p>
@@ -6313,32 +5598,6 @@
           <w:color w:val="1E293B"/>
           <w:sz w:val="17"/>
         </w:rPr>
-        <w:t xml:space="preserve"> </w:t>
-      </w:r>
-    </w:p>
-    <w:p>
-      <w:pPr>
-        <w:spacing w:before="0" w:after="0" w:line="210" w:lineRule="exact"/>
-      </w:pPr>
-      <w:r>
-        <w:rPr>
-          <w:rFonts w:ascii="Consolas" w:hAnsi="Consolas"/>
-          <w:color w:val="1E293B"/>
-          <w:sz w:val="17"/>
-        </w:rPr>
-        <w:t>/* Activity Section &amp; Tabs */</w:t>
-      </w:r>
-    </w:p>
-    <w:p>
-      <w:pPr>
-        <w:spacing w:before="0" w:after="0" w:line="210" w:lineRule="exact"/>
-      </w:pPr>
-      <w:r>
-        <w:rPr>
-          <w:rFonts w:ascii="Consolas" w:hAnsi="Consolas"/>
-          <w:color w:val="1E293B"/>
-          <w:sz w:val="17"/>
-        </w:rPr>
         <w:t>.ref-activity-section { display: flex; flex-direction: column; gap: 16px; }</w:t>
       </w:r>
     </w:p>
@@ -6755,32 +6014,6 @@
           <w:color w:val="1E293B"/>
           <w:sz w:val="17"/>
         </w:rPr>
-        <w:t xml:space="preserve"> </w:t>
-      </w:r>
-    </w:p>
-    <w:p>
-      <w:pPr>
-        <w:spacing w:before="0" w:after="0" w:line="210" w:lineRule="exact"/>
-      </w:pPr>
-      <w:r>
-        <w:rPr>
-          <w:rFonts w:ascii="Consolas" w:hAnsi="Consolas"/>
-          <w:color w:val="1E293B"/>
-          <w:sz w:val="17"/>
-        </w:rPr>
-        <w:t>/* Right Column Cards */</w:t>
-      </w:r>
-    </w:p>
-    <w:p>
-      <w:pPr>
-        <w:spacing w:before="0" w:after="0" w:line="210" w:lineRule="exact"/>
-      </w:pPr>
-      <w:r>
-        <w:rPr>
-          <w:rFonts w:ascii="Consolas" w:hAnsi="Consolas"/>
-          <w:color w:val="1E293B"/>
-          <w:sz w:val="17"/>
-        </w:rPr>
         <w:t>.mini-metric-card { padding: 22px 24px; display: flex; align-items: center; justify-content: space-between; gap: 16px; }</w:t>
       </w:r>
     </w:p>
@@ -7015,32 +6248,6 @@
           <w:color w:val="1E293B"/>
           <w:sz w:val="17"/>
         </w:rPr>
-        <w:t xml:space="preserve"> </w:t>
-      </w:r>
-    </w:p>
-    <w:p>
-      <w:pPr>
-        <w:spacing w:before="0" w:after="0" w:line="210" w:lineRule="exact"/>
-      </w:pPr>
-      <w:r>
-        <w:rPr>
-          <w:rFonts w:ascii="Consolas" w:hAnsi="Consolas"/>
-          <w:color w:val="1E293B"/>
-          <w:sz w:val="17"/>
-        </w:rPr>
-        <w:t>/* Subpages: APIs, Monitor, History, Analytics */</w:t>
-      </w:r>
-    </w:p>
-    <w:p>
-      <w:pPr>
-        <w:spacing w:before="0" w:after="0" w:line="210" w:lineRule="exact"/>
-      </w:pPr>
-      <w:r>
-        <w:rPr>
-          <w:rFonts w:ascii="Consolas" w:hAnsi="Consolas"/>
-          <w:color w:val="1E293B"/>
-          <w:sz w:val="17"/>
-        </w:rPr>
         <w:t>.page-header { display: flex; justify-content: space-between; align-items: center; margin-bottom: 24px; flex-wrap: wrap; gap: 14px; }</w:t>
       </w:r>
     </w:p>
@@ -7184,32 +6391,6 @@
           <w:color w:val="1E293B"/>
           <w:sz w:val="17"/>
         </w:rPr>
-        <w:t xml:space="preserve"> </w:t>
-      </w:r>
-    </w:p>
-    <w:p>
-      <w:pPr>
-        <w:spacing w:before="0" w:after="0" w:line="210" w:lineRule="exact"/>
-      </w:pPr>
-      <w:r>
-        <w:rPr>
-          <w:rFonts w:ascii="Consolas" w:hAnsi="Consolas"/>
-          <w:color w:val="1E293B"/>
-          <w:sz w:val="17"/>
-        </w:rPr>
-        <w:t>/* Forms &amp; Tables */</w:t>
-      </w:r>
-    </w:p>
-    <w:p>
-      <w:pPr>
-        <w:spacing w:before="0" w:after="0" w:line="210" w:lineRule="exact"/>
-      </w:pPr>
-      <w:r>
-        <w:rPr>
-          <w:rFonts w:ascii="Consolas" w:hAnsi="Consolas"/>
-          <w:color w:val="1E293B"/>
-          <w:sz w:val="17"/>
-        </w:rPr>
         <w:t>.apis-layout { display: grid; grid-template-columns: 380px 1fr; gap: 26px; align-items: start; }</w:t>
       </w:r>
     </w:p>
@@ -7535,32 +6716,6 @@
           <w:color w:val="1E293B"/>
           <w:sz w:val="17"/>
         </w:rPr>
-        <w:t xml:space="preserve"> </w:t>
-      </w:r>
-    </w:p>
-    <w:p>
-      <w:pPr>
-        <w:spacing w:before="0" w:after="0" w:line="210" w:lineRule="exact"/>
-      </w:pPr>
-      <w:r>
-        <w:rPr>
-          <w:rFonts w:ascii="Consolas" w:hAnsi="Consolas"/>
-          <w:color w:val="1E293B"/>
-          <w:sz w:val="17"/>
-        </w:rPr>
-        <w:t>/* Badges */</w:t>
-      </w:r>
-    </w:p>
-    <w:p>
-      <w:pPr>
-        <w:spacing w:before="0" w:after="0" w:line="210" w:lineRule="exact"/>
-      </w:pPr>
-      <w:r>
-        <w:rPr>
-          <w:rFonts w:ascii="Consolas" w:hAnsi="Consolas"/>
-          <w:color w:val="1E293B"/>
-          <w:sz w:val="17"/>
-        </w:rPr>
         <w:t>.api-method-badge { font-size: 0.72rem; font-weight: 800; padding: 4px 10px; border-radius: 6px; text-transform: uppercase; }</w:t>
       </w:r>
     </w:p>
@@ -7691,32 +6846,6 @@
           <w:color w:val="1E293B"/>
           <w:sz w:val="17"/>
         </w:rPr>
-        <w:t xml:space="preserve"> </w:t>
-      </w:r>
-    </w:p>
-    <w:p>
-      <w:pPr>
-        <w:spacing w:before="0" w:after="0" w:line="210" w:lineRule="exact"/>
-      </w:pPr>
-      <w:r>
-        <w:rPr>
-          <w:rFonts w:ascii="Consolas" w:hAnsi="Consolas"/>
-          <w:color w:val="1E293B"/>
-          <w:sz w:val="17"/>
-        </w:rPr>
-        <w:t>/* Monitor &amp; Analytics */</w:t>
-      </w:r>
-    </w:p>
-    <w:p>
-      <w:pPr>
-        <w:spacing w:before="0" w:after="0" w:line="210" w:lineRule="exact"/>
-      </w:pPr>
-      <w:r>
-        <w:rPr>
-          <w:rFonts w:ascii="Consolas" w:hAnsi="Consolas"/>
-          <w:color w:val="1E293B"/>
-          <w:sz w:val="17"/>
-        </w:rPr>
         <w:t>.monitor-grid { display: grid; grid-template-columns: repeat(auto-fill, minmax(340px, 1fr)); gap: 22px; }</w:t>
       </w:r>
     </w:p>
@@ -7899,32 +7028,6 @@
           <w:color w:val="1E293B"/>
           <w:sz w:val="17"/>
         </w:rPr>
-        <w:t xml:space="preserve"> </w:t>
-      </w:r>
-    </w:p>
-    <w:p>
-      <w:pPr>
-        <w:spacing w:before="0" w:after="0" w:line="210" w:lineRule="exact"/>
-      </w:pPr>
-      <w:r>
-        <w:rPr>
-          <w:rFonts w:ascii="Consolas" w:hAnsi="Consolas"/>
-          <w:color w:val="1E293B"/>
-          <w:sz w:val="17"/>
-        </w:rPr>
-        <w:t>/* Filter &amp; Analytics */</w:t>
-      </w:r>
-    </w:p>
-    <w:p>
-      <w:pPr>
-        <w:spacing w:before="0" w:after="0" w:line="210" w:lineRule="exact"/>
-      </w:pPr>
-      <w:r>
-        <w:rPr>
-          <w:rFonts w:ascii="Consolas" w:hAnsi="Consolas"/>
-          <w:color w:val="1E293B"/>
-          <w:sz w:val="17"/>
-        </w:rPr>
         <w:t>.filter-group { display: flex; gap: 10px; }</w:t>
       </w:r>
     </w:p>
@@ -8133,32 +7236,6 @@
           <w:color w:val="1E293B"/>
           <w:sz w:val="17"/>
         </w:rPr>
-        <w:t xml:space="preserve"> </w:t>
-      </w:r>
-    </w:p>
-    <w:p>
-      <w:pPr>
-        <w:spacing w:before="0" w:after="0" w:line="210" w:lineRule="exact"/>
-      </w:pPr>
-      <w:r>
-        <w:rPr>
-          <w:rFonts w:ascii="Consolas" w:hAnsi="Consolas"/>
-          <w:color w:val="1E293B"/>
-          <w:sz w:val="17"/>
-        </w:rPr>
-        <w:t>/* Empty, Toast, Modal */</w:t>
-      </w:r>
-    </w:p>
-    <w:p>
-      <w:pPr>
-        <w:spacing w:before="0" w:after="0" w:line="210" w:lineRule="exact"/>
-      </w:pPr>
-      <w:r>
-        <w:rPr>
-          <w:rFonts w:ascii="Consolas" w:hAnsi="Consolas"/>
-          <w:color w:val="1E293B"/>
-          <w:sz w:val="17"/>
-        </w:rPr>
         <w:t>.empty-state { text-align: center; padding: 48px 24px; color: var(--text-muted); }</w:t>
       </w:r>
     </w:p>
@@ -8355,32 +7432,6 @@
           <w:sz w:val="17"/>
         </w:rPr>
         <w:t>.modal-footer { display: flex; gap: 12px; justify-content: flex-end; padding: 16px 24px; border-top: 1px solid var(--border-subtle); }</w:t>
-      </w:r>
-    </w:p>
-    <w:p>
-      <w:pPr>
-        <w:spacing w:before="0" w:after="0" w:line="210" w:lineRule="exact"/>
-      </w:pPr>
-      <w:r>
-        <w:rPr>
-          <w:rFonts w:ascii="Consolas" w:hAnsi="Consolas"/>
-          <w:color w:val="1E293B"/>
-          <w:sz w:val="17"/>
-        </w:rPr>
-        <w:t xml:space="preserve"> </w:t>
-      </w:r>
-    </w:p>
-    <w:p>
-      <w:pPr>
-        <w:spacing w:before="0" w:after="0" w:line="210" w:lineRule="exact"/>
-      </w:pPr>
-      <w:r>
-        <w:rPr>
-          <w:rFonts w:ascii="Consolas" w:hAnsi="Consolas"/>
-          <w:color w:val="1E293B"/>
-          <w:sz w:val="17"/>
-        </w:rPr>
-        <w:t>/* Responsive Media Queries */</w:t>
       </w:r>
     </w:p>
     <w:p>
@@ -8686,71 +7737,6 @@
           <w:color w:val="1E293B"/>
           <w:sz w:val="17"/>
         </w:rPr>
-        <w:t>/* ==========================================================================</w:t>
-      </w:r>
-    </w:p>
-    <w:p>
-      <w:pPr>
-        <w:spacing w:before="0" w:after="0" w:line="210" w:lineRule="exact"/>
-      </w:pPr>
-      <w:r>
-        <w:rPr>
-          <w:rFonts w:ascii="Consolas" w:hAnsi="Consolas"/>
-          <w:color w:val="1E293B"/>
-          <w:sz w:val="17"/>
-        </w:rPr>
-        <w:t xml:space="preserve">   API MONITOR — CONCISE APPLICATION LOGIC (Clean &amp; Minimal)</w:t>
-      </w:r>
-    </w:p>
-    <w:p>
-      <w:pPr>
-        <w:spacing w:before="0" w:after="0" w:line="210" w:lineRule="exact"/>
-      </w:pPr>
-      <w:r>
-        <w:rPr>
-          <w:rFonts w:ascii="Consolas" w:hAnsi="Consolas"/>
-          <w:color w:val="1E293B"/>
-          <w:sz w:val="17"/>
-        </w:rPr>
-        <w:t xml:space="preserve">   ========================================================================== */</w:t>
-      </w:r>
-    </w:p>
-    <w:p>
-      <w:pPr>
-        <w:spacing w:before="0" w:after="0" w:line="210" w:lineRule="exact"/>
-      </w:pPr>
-      <w:r>
-        <w:rPr>
-          <w:rFonts w:ascii="Consolas" w:hAnsi="Consolas"/>
-          <w:color w:val="1E293B"/>
-          <w:sz w:val="17"/>
-        </w:rPr>
-        <w:t xml:space="preserve"> </w:t>
-      </w:r>
-    </w:p>
-    <w:p>
-      <w:pPr>
-        <w:spacing w:before="0" w:after="0" w:line="210" w:lineRule="exact"/>
-      </w:pPr>
-      <w:r>
-        <w:rPr>
-          <w:rFonts w:ascii="Consolas" w:hAnsi="Consolas"/>
-          <w:color w:val="1E293B"/>
-          <w:sz w:val="17"/>
-        </w:rPr>
-        <w:t>// Mock Data</w:t>
-      </w:r>
-    </w:p>
-    <w:p>
-      <w:pPr>
-        <w:spacing w:before="0" w:after="0" w:line="210" w:lineRule="exact"/>
-      </w:pPr>
-      <w:r>
-        <w:rPr>
-          <w:rFonts w:ascii="Consolas" w:hAnsi="Consolas"/>
-          <w:color w:val="1E293B"/>
-          <w:sz w:val="17"/>
-        </w:rPr>
         <w:t>let apiList = [</w:t>
       </w:r>
     </w:p>
@@ -8842,19 +7828,6 @@
           <w:color w:val="1E293B"/>
           <w:sz w:val="17"/>
         </w:rPr>
-        <w:t xml:space="preserve"> </w:t>
-      </w:r>
-    </w:p>
-    <w:p>
-      <w:pPr>
-        <w:spacing w:before="0" w:after="0" w:line="210" w:lineRule="exact"/>
-      </w:pPr>
-      <w:r>
-        <w:rPr>
-          <w:rFonts w:ascii="Consolas" w:hAnsi="Consolas"/>
-          <w:color w:val="1E293B"/>
-          <w:sz w:val="17"/>
-        </w:rPr>
         <w:t>let monitorHistory = [</w:t>
       </w:r>
     </w:p>
@@ -9011,19 +7984,6 @@
           <w:color w:val="1E293B"/>
           <w:sz w:val="17"/>
         </w:rPr>
-        <w:t xml:space="preserve"> </w:t>
-      </w:r>
-    </w:p>
-    <w:p>
-      <w:pPr>
-        <w:spacing w:before="0" w:after="0" w:line="210" w:lineRule="exact"/>
-      </w:pPr>
-      <w:r>
-        <w:rPr>
-          <w:rFonts w:ascii="Consolas" w:hAnsi="Consolas"/>
-          <w:color w:val="1E293B"/>
-          <w:sz w:val="17"/>
-        </w:rPr>
         <w:t>let nextApiId = 6, nextHistoryId = 11, currentTab = 'activity', searchQuery = '', pendingDeleteId = null;</w:t>
       </w:r>
     </w:p>
@@ -9050,32 +8010,6 @@
           <w:color w:val="1E293B"/>
           <w:sz w:val="17"/>
         </w:rPr>
-        <w:t xml:space="preserve"> </w:t>
-      </w:r>
-    </w:p>
-    <w:p>
-      <w:pPr>
-        <w:spacing w:before="0" w:after="0" w:line="210" w:lineRule="exact"/>
-      </w:pPr>
-      <w:r>
-        <w:rPr>
-          <w:rFonts w:ascii="Consolas" w:hAnsi="Consolas"/>
-          <w:color w:val="1E293B"/>
-          <w:sz w:val="17"/>
-        </w:rPr>
-        <w:t>// DOM Selectors Helper</w:t>
-      </w:r>
-    </w:p>
-    <w:p>
-      <w:pPr>
-        <w:spacing w:before="0" w:after="0" w:line="210" w:lineRule="exact"/>
-      </w:pPr>
-      <w:r>
-        <w:rPr>
-          <w:rFonts w:ascii="Consolas" w:hAnsi="Consolas"/>
-          <w:color w:val="1E293B"/>
-          <w:sz w:val="17"/>
-        </w:rPr>
         <w:t>const $ = (id) =&gt; document.getElementById(id);</w:t>
       </w:r>
     </w:p>
@@ -9102,32 +8036,6 @@
           <w:color w:val="1E293B"/>
           <w:sz w:val="17"/>
         </w:rPr>
-        <w:t xml:space="preserve"> </w:t>
-      </w:r>
-    </w:p>
-    <w:p>
-      <w:pPr>
-        <w:spacing w:before="0" w:after="0" w:line="210" w:lineRule="exact"/>
-      </w:pPr>
-      <w:r>
-        <w:rPr>
-          <w:rFonts w:ascii="Consolas" w:hAnsi="Consolas"/>
-          <w:color w:val="1E293B"/>
-          <w:sz w:val="17"/>
-        </w:rPr>
-        <w:t>// Navigation</w:t>
-      </w:r>
-    </w:p>
-    <w:p>
-      <w:pPr>
-        <w:spacing w:before="0" w:after="0" w:line="210" w:lineRule="exact"/>
-      </w:pPr>
-      <w:r>
-        <w:rPr>
-          <w:rFonts w:ascii="Consolas" w:hAnsi="Consolas"/>
-          <w:color w:val="1E293B"/>
-          <w:sz w:val="17"/>
-        </w:rPr>
         <w:t>function navigateTo(page) {</w:t>
       </w:r>
     </w:p>
@@ -9258,19 +8166,6 @@
           <w:color w:val="1E293B"/>
           <w:sz w:val="17"/>
         </w:rPr>
-        <w:t xml:space="preserve"> </w:t>
-      </w:r>
-    </w:p>
-    <w:p>
-      <w:pPr>
-        <w:spacing w:before="0" w:after="0" w:line="210" w:lineRule="exact"/>
-      </w:pPr>
-      <w:r>
-        <w:rPr>
-          <w:rFonts w:ascii="Consolas" w:hAnsi="Consolas"/>
-          <w:color w:val="1E293B"/>
-          <w:sz w:val="17"/>
-        </w:rPr>
         <w:t>$$('.sidebar-nav .nav-link').forEach(link =&gt; {</w:t>
       </w:r>
     </w:p>
@@ -9388,32 +8283,6 @@
           <w:color w:val="1E293B"/>
           <w:sz w:val="17"/>
         </w:rPr>
-        <w:t xml:space="preserve"> </w:t>
-      </w:r>
-    </w:p>
-    <w:p>
-      <w:pPr>
-        <w:spacing w:before="0" w:after="0" w:line="210" w:lineRule="exact"/>
-      </w:pPr>
-      <w:r>
-        <w:rPr>
-          <w:rFonts w:ascii="Consolas" w:hAnsi="Consolas"/>
-          <w:color w:val="1E293B"/>
-          <w:sz w:val="17"/>
-        </w:rPr>
-        <w:t>// Global Search &amp; Tabs</w:t>
-      </w:r>
-    </w:p>
-    <w:p>
-      <w:pPr>
-        <w:spacing w:before="0" w:after="0" w:line="210" w:lineRule="exact"/>
-      </w:pPr>
-      <w:r>
-        <w:rPr>
-          <w:rFonts w:ascii="Consolas" w:hAnsi="Consolas"/>
-          <w:color w:val="1E293B"/>
-          <w:sz w:val="17"/>
-        </w:rPr>
         <w:t>$('global-search-input')?.addEventListener('input', (e) =&gt; {</w:t>
       </w:r>
     </w:p>
@@ -9479,19 +8348,6 @@
           <w:color w:val="1E293B"/>
           <w:sz w:val="17"/>
         </w:rPr>
-        <w:t xml:space="preserve"> </w:t>
-      </w:r>
-    </w:p>
-    <w:p>
-      <w:pPr>
-        <w:spacing w:before="0" w:after="0" w:line="210" w:lineRule="exact"/>
-      </w:pPr>
-      <w:r>
-        <w:rPr>
-          <w:rFonts w:ascii="Consolas" w:hAnsi="Consolas"/>
-          <w:color w:val="1E293B"/>
-          <w:sz w:val="17"/>
-        </w:rPr>
         <w:t>$$('.tab-btn').forEach(btn =&gt; {</w:t>
       </w:r>
     </w:p>
@@ -9596,32 +8452,6 @@
           <w:color w:val="1E293B"/>
           <w:sz w:val="17"/>
         </w:rPr>
-        <w:t xml:space="preserve"> </w:t>
-      </w:r>
-    </w:p>
-    <w:p>
-      <w:pPr>
-        <w:spacing w:before="0" w:after="0" w:line="210" w:lineRule="exact"/>
-      </w:pPr>
-      <w:r>
-        <w:rPr>
-          <w:rFonts w:ascii="Consolas" w:hAnsi="Consolas"/>
-          <w:color w:val="1E293B"/>
-          <w:sz w:val="17"/>
-        </w:rPr>
-        <w:t>// Dark/Light Theme</w:t>
-      </w:r>
-    </w:p>
-    <w:p>
-      <w:pPr>
-        <w:spacing w:before="0" w:after="0" w:line="210" w:lineRule="exact"/>
-      </w:pPr>
-      <w:r>
-        <w:rPr>
-          <w:rFonts w:ascii="Consolas" w:hAnsi="Consolas"/>
-          <w:color w:val="1E293B"/>
-          <w:sz w:val="17"/>
-        </w:rPr>
         <w:t>function setTheme(isDark) {</w:t>
       </w:r>
     </w:p>
@@ -9791,32 +8621,6 @@
           <w:color w:val="1E293B"/>
           <w:sz w:val="17"/>
         </w:rPr>
-        <w:t xml:space="preserve"> </w:t>
-      </w:r>
-    </w:p>
-    <w:p>
-      <w:pPr>
-        <w:spacing w:before="0" w:after="0" w:line="210" w:lineRule="exact"/>
-      </w:pPr>
-      <w:r>
-        <w:rPr>
-          <w:rFonts w:ascii="Consolas" w:hAnsi="Consolas"/>
-          <w:color w:val="1E293B"/>
-          <w:sz w:val="17"/>
-        </w:rPr>
-        <w:t>// Refresh Page Dispatcher</w:t>
-      </w:r>
-    </w:p>
-    <w:p>
-      <w:pPr>
-        <w:spacing w:before="0" w:after="0" w:line="210" w:lineRule="exact"/>
-      </w:pPr>
-      <w:r>
-        <w:rPr>
-          <w:rFonts w:ascii="Consolas" w:hAnsi="Consolas"/>
-          <w:color w:val="1E293B"/>
-          <w:sz w:val="17"/>
-        </w:rPr>
         <w:t>function refreshPageData(page) {</w:t>
       </w:r>
     </w:p>
@@ -9999,32 +8803,6 @@
           <w:color w:val="1E293B"/>
           <w:sz w:val="17"/>
         </w:rPr>
-        <w:t xml:space="preserve"> </w:t>
-      </w:r>
-    </w:p>
-    <w:p>
-      <w:pPr>
-        <w:spacing w:before="0" w:after="0" w:line="210" w:lineRule="exact"/>
-      </w:pPr>
-      <w:r>
-        <w:rPr>
-          <w:rFonts w:ascii="Consolas" w:hAnsi="Consolas"/>
-          <w:color w:val="1E293B"/>
-          <w:sz w:val="17"/>
-        </w:rPr>
-        <w:t>// Dashboard Metrics</w:t>
-      </w:r>
-    </w:p>
-    <w:p>
-      <w:pPr>
-        <w:spacing w:before="0" w:after="0" w:line="210" w:lineRule="exact"/>
-      </w:pPr>
-      <w:r>
-        <w:rPr>
-          <w:rFonts w:ascii="Consolas" w:hAnsi="Consolas"/>
-          <w:color w:val="1E293B"/>
-          <w:sz w:val="17"/>
-        </w:rPr>
         <w:t>function updateDashboardMetrics() {</w:t>
       </w:r>
     </w:p>
@@ -10129,19 +8907,6 @@
           <w:color w:val="1E293B"/>
           <w:sz w:val="17"/>
         </w:rPr>
-        <w:t xml:space="preserve"> </w:t>
-      </w:r>
-    </w:p>
-    <w:p>
-      <w:pPr>
-        <w:spacing w:before="0" w:after="0" w:line="210" w:lineRule="exact"/>
-      </w:pPr>
-      <w:r>
-        <w:rPr>
-          <w:rFonts w:ascii="Consolas" w:hAnsi="Consolas"/>
-          <w:color w:val="1E293B"/>
-          <w:sz w:val="17"/>
-        </w:rPr>
         <w:t xml:space="preserve">    if ($('hero-total-number')) $('hero-total-number').textContent = `${(total * 4.6).toFixed(4)}K`;</w:t>
       </w:r>
     </w:p>
@@ -10389,32 +9154,6 @@
           <w:color w:val="1E293B"/>
           <w:sz w:val="17"/>
         </w:rPr>
-        <w:t xml:space="preserve"> </w:t>
-      </w:r>
-    </w:p>
-    <w:p>
-      <w:pPr>
-        <w:spacing w:before="0" w:after="0" w:line="210" w:lineRule="exact"/>
-      </w:pPr>
-      <w:r>
-        <w:rPr>
-          <w:rFonts w:ascii="Consolas" w:hAnsi="Consolas"/>
-          <w:color w:val="1E293B"/>
-          <w:sz w:val="17"/>
-        </w:rPr>
-        <w:t>// Activity Rows</w:t>
-      </w:r>
-    </w:p>
-    <w:p>
-      <w:pPr>
-        <w:spacing w:before="0" w:after="0" w:line="210" w:lineRule="exact"/>
-      </w:pPr>
-      <w:r>
-        <w:rPr>
-          <w:rFonts w:ascii="Consolas" w:hAnsi="Consolas"/>
-          <w:color w:val="1E293B"/>
-          <w:sz w:val="17"/>
-        </w:rPr>
         <w:t>function renderActivityRows() {</w:t>
       </w:r>
     </w:p>
@@ -10662,19 +9401,6 @@
           <w:color w:val="1E293B"/>
           <w:sz w:val="17"/>
         </w:rPr>
-        <w:t xml:space="preserve"> </w:t>
-      </w:r>
-    </w:p>
-    <w:p>
-      <w:pPr>
-        <w:spacing w:before="0" w:after="0" w:line="210" w:lineRule="exact"/>
-      </w:pPr>
-      <w:r>
-        <w:rPr>
-          <w:rFonts w:ascii="Consolas" w:hAnsi="Consolas"/>
-          <w:color w:val="1E293B"/>
-          <w:sz w:val="17"/>
-        </w:rPr>
         <w:t xml:space="preserve">    wrap.innerHTML = list.map(item =&gt; `</w:t>
       </w:r>
     </w:p>
@@ -10883,32 +9609,6 @@
           <w:color w:val="1E293B"/>
           <w:sz w:val="17"/>
         </w:rPr>
-        <w:t xml:space="preserve"> </w:t>
-      </w:r>
-    </w:p>
-    <w:p>
-      <w:pPr>
-        <w:spacing w:before="0" w:after="0" w:line="210" w:lineRule="exact"/>
-      </w:pPr>
-      <w:r>
-        <w:rPr>
-          <w:rFonts w:ascii="Consolas" w:hAnsi="Consolas"/>
-          <w:color w:val="1E293B"/>
-          <w:sz w:val="17"/>
-        </w:rPr>
-        <w:t>// Charts</w:t>
-      </w:r>
-    </w:p>
-    <w:p>
-      <w:pPr>
-        <w:spacing w:before="0" w:after="0" w:line="210" w:lineRule="exact"/>
-      </w:pPr>
-      <w:r>
-        <w:rPr>
-          <w:rFonts w:ascii="Consolas" w:hAnsi="Consolas"/>
-          <w:color w:val="1E293B"/>
-          <w:sz w:val="17"/>
-        </w:rPr>
         <w:t>function renderDashboardWaveChart() {</w:t>
       </w:r>
     </w:p>
@@ -11130,19 +9830,6 @@
           <w:color w:val="1E293B"/>
           <w:sz w:val="17"/>
         </w:rPr>
-        <w:t xml:space="preserve"> </w:t>
-      </w:r>
-    </w:p>
-    <w:p>
-      <w:pPr>
-        <w:spacing w:before="0" w:after="0" w:line="210" w:lineRule="exact"/>
-      </w:pPr>
-      <w:r>
-        <w:rPr>
-          <w:rFonts w:ascii="Consolas" w:hAnsi="Consolas"/>
-          <w:color w:val="1E293B"/>
-          <w:sz w:val="17"/>
-        </w:rPr>
         <w:t>function renderHealthDonutChart() {</w:t>
       </w:r>
     </w:p>
@@ -11312,19 +9999,6 @@
           <w:color w:val="1E293B"/>
           <w:sz w:val="17"/>
         </w:rPr>
-        <w:t xml:space="preserve"> </w:t>
-      </w:r>
-    </w:p>
-    <w:p>
-      <w:pPr>
-        <w:spacing w:before="0" w:after="0" w:line="210" w:lineRule="exact"/>
-      </w:pPr>
-      <w:r>
-        <w:rPr>
-          <w:rFonts w:ascii="Consolas" w:hAnsi="Consolas"/>
-          <w:color w:val="1E293B"/>
-          <w:sz w:val="17"/>
-        </w:rPr>
         <w:t>function renderWeeklyBarsChart() {</w:t>
       </w:r>
     </w:p>
@@ -11546,32 +10220,6 @@
           <w:color w:val="1E293B"/>
           <w:sz w:val="17"/>
         </w:rPr>
-        <w:t xml:space="preserve"> </w:t>
-      </w:r>
-    </w:p>
-    <w:p>
-      <w:pPr>
-        <w:spacing w:before="0" w:after="0" w:line="210" w:lineRule="exact"/>
-      </w:pPr>
-      <w:r>
-        <w:rPr>
-          <w:rFonts w:ascii="Consolas" w:hAnsi="Consolas"/>
-          <w:color w:val="1E293B"/>
-          <w:sz w:val="17"/>
-        </w:rPr>
-        <w:t>// Check APIs Action</w:t>
-      </w:r>
-    </w:p>
-    <w:p>
-      <w:pPr>
-        <w:spacing w:before="0" w:after="0" w:line="210" w:lineRule="exact"/>
-      </w:pPr>
-      <w:r>
-        <w:rPr>
-          <w:rFonts w:ascii="Consolas" w:hAnsi="Consolas"/>
-          <w:color w:val="1E293B"/>
-          <w:sz w:val="17"/>
-        </w:rPr>
         <w:t>function checkSingleAPI(apiId) {</w:t>
       </w:r>
     </w:p>
@@ -11754,19 +10402,6 @@
           <w:color w:val="1E293B"/>
           <w:sz w:val="17"/>
         </w:rPr>
-        <w:t xml:space="preserve"> </w:t>
-      </w:r>
-    </w:p>
-    <w:p>
-      <w:pPr>
-        <w:spacing w:before="0" w:after="0" w:line="210" w:lineRule="exact"/>
-      </w:pPr>
-      <w:r>
-        <w:rPr>
-          <w:rFonts w:ascii="Consolas" w:hAnsi="Consolas"/>
-          <w:color w:val="1E293B"/>
-          <w:sz w:val="17"/>
-        </w:rPr>
         <w:t>function checkAllAPIs() {</w:t>
       </w:r>
     </w:p>
@@ -11858,32 +10493,6 @@
           <w:color w:val="1E293B"/>
           <w:sz w:val="17"/>
         </w:rPr>
-        <w:t xml:space="preserve"> </w:t>
-      </w:r>
-    </w:p>
-    <w:p>
-      <w:pPr>
-        <w:spacing w:before="0" w:after="0" w:line="210" w:lineRule="exact"/>
-      </w:pPr>
-      <w:r>
-        <w:rPr>
-          <w:rFonts w:ascii="Consolas" w:hAnsi="Consolas"/>
-          <w:color w:val="1E293B"/>
-          <w:sz w:val="17"/>
-        </w:rPr>
-        <w:t>// Add API Form</w:t>
-      </w:r>
-    </w:p>
-    <w:p>
-      <w:pPr>
-        <w:spacing w:before="0" w:after="0" w:line="210" w:lineRule="exact"/>
-      </w:pPr>
-      <w:r>
-        <w:rPr>
-          <w:rFonts w:ascii="Consolas" w:hAnsi="Consolas"/>
-          <w:color w:val="1E293B"/>
-          <w:sz w:val="17"/>
-        </w:rPr>
         <w:t>$('api-form')?.addEventListener('submit', (e) =&gt; {</w:t>
       </w:r>
     </w:p>
@@ -12027,32 +10636,6 @@
           <w:color w:val="1E293B"/>
           <w:sz w:val="17"/>
         </w:rPr>
-        <w:t xml:space="preserve"> </w:t>
-      </w:r>
-    </w:p>
-    <w:p>
-      <w:pPr>
-        <w:spacing w:before="0" w:after="0" w:line="210" w:lineRule="exact"/>
-      </w:pPr>
-      <w:r>
-        <w:rPr>
-          <w:rFonts w:ascii="Consolas" w:hAnsi="Consolas"/>
-          <w:color w:val="1E293B"/>
-          <w:sz w:val="17"/>
-        </w:rPr>
-        <w:t>// Render Table, Monitor, History</w:t>
-      </w:r>
-    </w:p>
-    <w:p>
-      <w:pPr>
-        <w:spacing w:before="0" w:after="0" w:line="210" w:lineRule="exact"/>
-      </w:pPr>
-      <w:r>
-        <w:rPr>
-          <w:rFonts w:ascii="Consolas" w:hAnsi="Consolas"/>
-          <w:color w:val="1E293B"/>
-          <w:sz w:val="17"/>
-        </w:rPr>
         <w:t>function renderAPITable() {</w:t>
       </w:r>
     </w:p>
@@ -12183,19 +10766,6 @@
           <w:color w:val="1E293B"/>
           <w:sz w:val="17"/>
         </w:rPr>
-        <w:t xml:space="preserve"> </w:t>
-      </w:r>
-    </w:p>
-    <w:p>
-      <w:pPr>
-        <w:spacing w:before="0" w:after="0" w:line="210" w:lineRule="exact"/>
-      </w:pPr>
-      <w:r>
-        <w:rPr>
-          <w:rFonts w:ascii="Consolas" w:hAnsi="Consolas"/>
-          <w:color w:val="1E293B"/>
-          <w:sz w:val="17"/>
-        </w:rPr>
         <w:t>function confirmDeleteAPI(id) {</w:t>
       </w:r>
     </w:p>
@@ -12417,19 +10987,6 @@
           <w:color w:val="1E293B"/>
           <w:sz w:val="17"/>
         </w:rPr>
-        <w:t xml:space="preserve"> </w:t>
-      </w:r>
-    </w:p>
-    <w:p>
-      <w:pPr>
-        <w:spacing w:before="0" w:after="0" w:line="210" w:lineRule="exact"/>
-      </w:pPr>
-      <w:r>
-        <w:rPr>
-          <w:rFonts w:ascii="Consolas" w:hAnsi="Consolas"/>
-          <w:color w:val="1E293B"/>
-          <w:sz w:val="17"/>
-        </w:rPr>
         <w:t>function renderMonitorCards() {</w:t>
       </w:r>
     </w:p>
@@ -12599,19 +11156,6 @@
           <w:color w:val="1E293B"/>
           <w:sz w:val="17"/>
         </w:rPr>
-        <w:t xml:space="preserve"> </w:t>
-      </w:r>
-    </w:p>
-    <w:p>
-      <w:pPr>
-        <w:spacing w:before="0" w:after="0" w:line="210" w:lineRule="exact"/>
-      </w:pPr>
-      <w:r>
-        <w:rPr>
-          <w:rFonts w:ascii="Consolas" w:hAnsi="Consolas"/>
-          <w:color w:val="1E293B"/>
-          <w:sz w:val="17"/>
-        </w:rPr>
         <w:t>function populateHistoryFilters() {</w:t>
       </w:r>
     </w:p>
@@ -12664,19 +11208,6 @@
           <w:color w:val="1E293B"/>
           <w:sz w:val="17"/>
         </w:rPr>
-        <w:t xml:space="preserve"> </w:t>
-      </w:r>
-    </w:p>
-    <w:p>
-      <w:pPr>
-        <w:spacing w:before="0" w:after="0" w:line="210" w:lineRule="exact"/>
-      </w:pPr>
-      <w:r>
-        <w:rPr>
-          <w:rFonts w:ascii="Consolas" w:hAnsi="Consolas"/>
-          <w:color w:val="1E293B"/>
-          <w:sz w:val="17"/>
-        </w:rPr>
         <w:t>function renderHistoryTable() {</w:t>
       </w:r>
     </w:p>
@@ -12807,32 +11338,6 @@
           <w:color w:val="1E293B"/>
           <w:sz w:val="17"/>
         </w:rPr>
-        <w:t xml:space="preserve"> </w:t>
-      </w:r>
-    </w:p>
-    <w:p>
-      <w:pPr>
-        <w:spacing w:before="0" w:after="0" w:line="210" w:lineRule="exact"/>
-      </w:pPr>
-      <w:r>
-        <w:rPr>
-          <w:rFonts w:ascii="Consolas" w:hAnsi="Consolas"/>
-          <w:color w:val="1E293B"/>
-          <w:sz w:val="17"/>
-        </w:rPr>
-        <w:t>// Analytics</w:t>
-      </w:r>
-    </w:p>
-    <w:p>
-      <w:pPr>
-        <w:spacing w:before="0" w:after="0" w:line="210" w:lineRule="exact"/>
-      </w:pPr>
-      <w:r>
-        <w:rPr>
-          <w:rFonts w:ascii="Consolas" w:hAnsi="Consolas"/>
-          <w:color w:val="1E293B"/>
-          <w:sz w:val="17"/>
-        </w:rPr>
         <w:t>function populateAnalyticsFilters() {</w:t>
       </w:r>
     </w:p>
@@ -12885,19 +11390,6 @@
           <w:color w:val="1E293B"/>
           <w:sz w:val="17"/>
         </w:rPr>
-        <w:t xml:space="preserve"> </w:t>
-      </w:r>
-    </w:p>
-    <w:p>
-      <w:pPr>
-        <w:spacing w:before="0" w:after="0" w:line="210" w:lineRule="exact"/>
-      </w:pPr>
-      <w:r>
-        <w:rPr>
-          <w:rFonts w:ascii="Consolas" w:hAnsi="Consolas"/>
-          <w:color w:val="1E293B"/>
-          <w:sz w:val="17"/>
-        </w:rPr>
         <w:t>function updateAnalyticsStats() {</w:t>
       </w:r>
     </w:p>
@@ -13015,19 +11507,6 @@
           <w:color w:val="1E293B"/>
           <w:sz w:val="17"/>
         </w:rPr>
-        <w:t xml:space="preserve"> </w:t>
-      </w:r>
-    </w:p>
-    <w:p>
-      <w:pPr>
-        <w:spacing w:before="0" w:after="0" w:line="210" w:lineRule="exact"/>
-      </w:pPr>
-      <w:r>
-        <w:rPr>
-          <w:rFonts w:ascii="Consolas" w:hAnsi="Consolas"/>
-          <w:color w:val="1E293B"/>
-          <w:sz w:val="17"/>
-        </w:rPr>
         <w:t>function renderAnalyticsCharts() {</w:t>
       </w:r>
     </w:p>
@@ -13249,32 +11728,6 @@
           <w:color w:val="1E293B"/>
           <w:sz w:val="17"/>
         </w:rPr>
-        <w:t xml:space="preserve"> </w:t>
-      </w:r>
-    </w:p>
-    <w:p>
-      <w:pPr>
-        <w:spacing w:before="0" w:after="0" w:line="210" w:lineRule="exact"/>
-      </w:pPr>
-      <w:r>
-        <w:rPr>
-          <w:rFonts w:ascii="Consolas" w:hAnsi="Consolas"/>
-          <w:color w:val="1E293B"/>
-          <w:sz w:val="17"/>
-        </w:rPr>
-        <w:t>// Utils</w:t>
-      </w:r>
-    </w:p>
-    <w:p>
-      <w:pPr>
-        <w:spacing w:before="0" w:after="0" w:line="210" w:lineRule="exact"/>
-      </w:pPr>
-      <w:r>
-        <w:rPr>
-          <w:rFonts w:ascii="Consolas" w:hAnsi="Consolas"/>
-          <w:color w:val="1E293B"/>
-          <w:sz w:val="17"/>
-        </w:rPr>
         <w:t>function showToast(type, title, msg) {</w:t>
       </w:r>
     </w:p>
@@ -13366,46 +11819,7 @@
           <w:color w:val="1E293B"/>
           <w:sz w:val="17"/>
         </w:rPr>
-        <w:t xml:space="preserve"> </w:t>
-      </w:r>
-    </w:p>
-    <w:p>
-      <w:pPr>
-        <w:spacing w:before="0" w:after="0" w:line="210" w:lineRule="exact"/>
-      </w:pPr>
-      <w:r>
-        <w:rPr>
-          <w:rFonts w:ascii="Consolas" w:hAnsi="Consolas"/>
-          <w:color w:val="1E293B"/>
-          <w:sz w:val="17"/>
-        </w:rPr>
         <w:t>function escapeHtml(str) { return (str || '').replace(/[&amp;&lt;&gt;"']/g, m =&gt; ({ '&amp;': '&amp;amp;', '&lt;': '&amp;lt;', '&gt;': '&amp;gt;', '"': '&amp;quot;', "'": '&amp;#39;' }[m])); }</w:t>
-      </w:r>
-    </w:p>
-    <w:p>
-      <w:pPr>
-        <w:spacing w:before="0" w:after="0" w:line="210" w:lineRule="exact"/>
-      </w:pPr>
-      <w:r>
-        <w:rPr>
-          <w:rFonts w:ascii="Consolas" w:hAnsi="Consolas"/>
-          <w:color w:val="1E293B"/>
-          <w:sz w:val="17"/>
-        </w:rPr>
-        <w:t xml:space="preserve"> </w:t>
-      </w:r>
-    </w:p>
-    <w:p>
-      <w:pPr>
-        <w:spacing w:before="0" w:after="0" w:line="210" w:lineRule="exact"/>
-      </w:pPr>
-      <w:r>
-        <w:rPr>
-          <w:rFonts w:ascii="Consolas" w:hAnsi="Consolas"/>
-          <w:color w:val="1E293B"/>
-          <w:sz w:val="17"/>
-        </w:rPr>
-        <w:t>// Init</w:t>
       </w:r>
     </w:p>
     <w:p>

</xml_diff>

<commit_message>
Feature: Support real live network pinging with performance.now() and error handling for custom test URLs in Review
</commit_message>
<xml_diff>
--- a/API_Monitoring_Source_Code.docx
+++ b/API_Monitoring_Source_Code.docx
@@ -103,17 +103,11 @@
             <w:tcW w:type="dxa" w:w="10368"/>
             <w:shd w:fill="F8FAFC"/>
             <w:tcBorders>
-              <w:top w:val="single" w:sz="4" w:space="0" w:color="E2E8F0"/>
-              <w:left w:val="single" w:sz="18" w:space="0" w:color="0F172A"/>
-              <w:bottom w:val="single" w:sz="4" w:space="0" w:color="E2E8F0"/>
-              <w:right w:val="single" w:sz="4" w:space="0" w:color="E2E8F0"/>
+              <w:top w:val="single" w:sz="4" w:color="E2E8F0"/>
+              <w:left w:val="single" w:sz="18" w:color="0F172A"/>
+              <w:bottom w:val="single" w:sz="4" w:color="E2E8F0"/>
+              <w:right w:val="single" w:sz="4" w:color="E2E8F0"/>
             </w:tcBorders>
-            <w:tcMar>
-              <w:top w:w="120" w:type="dxa"/>
-              <w:left w:w="180" w:type="dxa"/>
-              <w:bottom w:w="120" w:type="dxa"/>
-              <w:right w:w="180" w:type="dxa"/>
-            </w:tcMar>
           </w:tcPr>
           <w:p>
             <w:pPr>
@@ -3323,17 +3317,11 @@
             <w:tcW w:type="dxa" w:w="10368"/>
             <w:shd w:fill="F8FAFC"/>
             <w:tcBorders>
-              <w:top w:val="single" w:sz="4" w:space="0" w:color="E2E8F0"/>
-              <w:left w:val="single" w:sz="18" w:space="0" w:color="0F172A"/>
-              <w:bottom w:val="single" w:sz="4" w:space="0" w:color="E2E8F0"/>
-              <w:right w:val="single" w:sz="4" w:space="0" w:color="E2E8F0"/>
+              <w:top w:val="single" w:sz="4" w:color="E2E8F0"/>
+              <w:left w:val="single" w:sz="18" w:color="0F172A"/>
+              <w:bottom w:val="single" w:sz="4" w:color="E2E8F0"/>
+              <w:right w:val="single" w:sz="4" w:color="E2E8F0"/>
             </w:tcBorders>
-            <w:tcMar>
-              <w:top w:w="120" w:type="dxa"/>
-              <w:left w:w="180" w:type="dxa"/>
-              <w:bottom w:w="120" w:type="dxa"/>
-              <w:right w:w="180" w:type="dxa"/>
-            </w:tcMar>
           </w:tcPr>
           <w:p>
             <w:pPr>
@@ -7976,7 +7964,7 @@
                 <w:color w:val="94A3B8"/>
                 <w:sz w:val="17"/>
               </w:rPr>
-              <w:t>Application Controller, Chart.js Visualizations &amp; Diagnostics</w:t>
+              <w:t>Application Controller, Live Latency Probe &amp; Visualizations</w:t>
             </w:r>
           </w:p>
         </w:tc>
@@ -8025,17 +8013,11 @@
             <w:tcW w:type="dxa" w:w="10368"/>
             <w:shd w:fill="F8FAFC"/>
             <w:tcBorders>
-              <w:top w:val="single" w:sz="4" w:space="0" w:color="E2E8F0"/>
-              <w:left w:val="single" w:sz="18" w:space="0" w:color="0F172A"/>
-              <w:bottom w:val="single" w:sz="4" w:space="0" w:color="E2E8F0"/>
-              <w:right w:val="single" w:sz="4" w:space="0" w:color="E2E8F0"/>
+              <w:top w:val="single" w:sz="4" w:color="E2E8F0"/>
+              <w:left w:val="single" w:sz="18" w:color="0F172A"/>
+              <w:bottom w:val="single" w:sz="4" w:color="E2E8F0"/>
+              <w:right w:val="single" w:sz="4" w:color="E2E8F0"/>
             </w:tcBorders>
-            <w:tcMar>
-              <w:top w:w="120" w:type="dxa"/>
-              <w:left w:w="180" w:type="dxa"/>
-              <w:bottom w:w="120" w:type="dxa"/>
-              <w:right w:w="180" w:type="dxa"/>
-            </w:tcMar>
           </w:tcPr>
           <w:p>
             <w:pPr>
@@ -10530,6 +10512,84 @@
                 <w:color w:val="0F172A"/>
                 <w:sz w:val="16"/>
               </w:rPr>
+              <w:t>function recordCheckResult(api, code, time, st) {</w:t>
+            </w:r>
+          </w:p>
+          <w:p>
+            <w:pPr>
+              <w:spacing w:before="0" w:after="0" w:line="210" w:lineRule="exact"/>
+            </w:pPr>
+            <w:r>
+              <w:rPr>
+                <w:rFonts w:ascii="Consolas" w:hAnsi="Consolas"/>
+                <w:color w:val="0F172A"/>
+                <w:sz w:val="16"/>
+              </w:rPr>
+              <w:t xml:space="preserve">    monitorHistory.unshift({ id: nextHistoryId++, api_id: api.id, api_name: api.name, status_code: code, response_time: time, status: st, checked_at: new Date().toISOString().slice(0, 19).replace('T', ' ') });</w:t>
+            </w:r>
+          </w:p>
+          <w:p>
+            <w:pPr>
+              <w:spacing w:before="0" w:after="0" w:line="210" w:lineRule="exact"/>
+            </w:pPr>
+            <w:r>
+              <w:rPr>
+                <w:rFonts w:ascii="Consolas" w:hAnsi="Consolas"/>
+                <w:color w:val="0F172A"/>
+                <w:sz w:val="16"/>
+              </w:rPr>
+              <w:t xml:space="preserve">    api.lastStatus = st;</w:t>
+            </w:r>
+          </w:p>
+          <w:p>
+            <w:pPr>
+              <w:spacing w:before="0" w:after="0" w:line="210" w:lineRule="exact"/>
+            </w:pPr>
+            <w:r>
+              <w:rPr>
+                <w:rFonts w:ascii="Consolas" w:hAnsi="Consolas"/>
+                <w:color w:val="0F172A"/>
+                <w:sz w:val="16"/>
+              </w:rPr>
+              <w:t xml:space="preserve">    showToast(st === 'Healthy' ? 'success' : (st === 'Slow' ? 'warning' : 'error'), `Status: ${st}`, `${api.name} responded in ${time}ms`);</w:t>
+            </w:r>
+          </w:p>
+          <w:p>
+            <w:pPr>
+              <w:spacing w:before="0" w:after="0" w:line="210" w:lineRule="exact"/>
+            </w:pPr>
+            <w:r>
+              <w:rPr>
+                <w:rFonts w:ascii="Consolas" w:hAnsi="Consolas"/>
+                <w:color w:val="0F172A"/>
+                <w:sz w:val="16"/>
+              </w:rPr>
+              <w:t xml:space="preserve">    refreshPageData('dashboard'); renderAPITable(); renderMonitorCards();</w:t>
+            </w:r>
+          </w:p>
+          <w:p>
+            <w:pPr>
+              <w:spacing w:before="0" w:after="0" w:line="210" w:lineRule="exact"/>
+            </w:pPr>
+            <w:r>
+              <w:rPr>
+                <w:rFonts w:ascii="Consolas" w:hAnsi="Consolas"/>
+                <w:color w:val="0F172A"/>
+                <w:sz w:val="16"/>
+              </w:rPr>
+              <w:t>}</w:t>
+            </w:r>
+          </w:p>
+          <w:p>
+            <w:pPr>
+              <w:spacing w:before="0" w:after="0" w:line="210" w:lineRule="exact"/>
+            </w:pPr>
+            <w:r>
+              <w:rPr>
+                <w:rFonts w:ascii="Consolas" w:hAnsi="Consolas"/>
+                <w:color w:val="0F172A"/>
+                <w:sz w:val="16"/>
+              </w:rPr>
               <w:t>function checkSingleAPI(apiId) {</w:t>
             </w:r>
           </w:p>
@@ -10569,124 +10629,202 @@
                 <w:color w:val="0F172A"/>
                 <w:sz w:val="16"/>
               </w:rPr>
-              <w:t xml:space="preserve">    showToast('info', 'Pinging Endpoint', `Checking ${api.name}...`);</w:t>
-            </w:r>
-          </w:p>
-          <w:p>
-            <w:pPr>
-              <w:spacing w:before="0" w:after="0" w:line="210" w:lineRule="exact"/>
-            </w:pPr>
-            <w:r>
-              <w:rPr>
-                <w:rFonts w:ascii="Consolas" w:hAnsi="Consolas"/>
-                <w:color w:val="0F172A"/>
-                <w:sz w:val="16"/>
-              </w:rPr>
-              <w:t xml:space="preserve">    setTimeout(() =&gt; {</w:t>
-            </w:r>
-          </w:p>
-          <w:p>
-            <w:pPr>
-              <w:spacing w:before="0" w:after="0" w:line="210" w:lineRule="exact"/>
-            </w:pPr>
-            <w:r>
-              <w:rPr>
-                <w:rFonts w:ascii="Consolas" w:hAnsi="Consolas"/>
-                <w:color w:val="0F172A"/>
-                <w:sz w:val="16"/>
-              </w:rPr>
-              <w:t xml:space="preserve">        let code = 200, time = Math.round(Math.random() * 550 + 50), st = 'Healthy';</w:t>
-            </w:r>
-          </w:p>
-          <w:p>
-            <w:pPr>
-              <w:spacing w:before="0" w:after="0" w:line="210" w:lineRule="exact"/>
-            </w:pPr>
-            <w:r>
-              <w:rPr>
-                <w:rFonts w:ascii="Consolas" w:hAnsi="Consolas"/>
-                <w:color w:val="0F172A"/>
-                <w:sz w:val="16"/>
-              </w:rPr>
-              <w:t xml:space="preserve">        if (api.url.includes('nonexistent')) { code = 0; time = 0; st = 'Failed'; }</w:t>
-            </w:r>
-          </w:p>
-          <w:p>
-            <w:pPr>
-              <w:spacing w:before="0" w:after="0" w:line="210" w:lineRule="exact"/>
-            </w:pPr>
-            <w:r>
-              <w:rPr>
-                <w:rFonts w:ascii="Consolas" w:hAnsi="Consolas"/>
-                <w:color w:val="0F172A"/>
-                <w:sz w:val="16"/>
-              </w:rPr>
-              <w:t xml:space="preserve">        else if (time &gt;= 500) st = 'Slow';</w:t>
-            </w:r>
-          </w:p>
-          <w:p>
-            <w:pPr>
-              <w:spacing w:before="0" w:after="0" w:line="210" w:lineRule="exact"/>
-            </w:pPr>
-            <w:r>
-              <w:rPr>
-                <w:rFonts w:ascii="Consolas" w:hAnsi="Consolas"/>
-                <w:color w:val="0F172A"/>
-                <w:sz w:val="16"/>
-              </w:rPr>
-              <w:t xml:space="preserve">        monitorHistory.unshift({ id: nextHistoryId++, api_id: api.id, api_name: api.name, status_code: code, response_time: time, status: st, checked_at: new Date().toISOString().slice(0, 19).replace('T', ' ') });</w:t>
-            </w:r>
-          </w:p>
-          <w:p>
-            <w:pPr>
-              <w:spacing w:before="0" w:after="0" w:line="210" w:lineRule="exact"/>
-            </w:pPr>
-            <w:r>
-              <w:rPr>
-                <w:rFonts w:ascii="Consolas" w:hAnsi="Consolas"/>
-                <w:color w:val="0F172A"/>
-                <w:sz w:val="16"/>
-              </w:rPr>
-              <w:t xml:space="preserve">        api.lastStatus = st;</w:t>
-            </w:r>
-          </w:p>
-          <w:p>
-            <w:pPr>
-              <w:spacing w:before="0" w:after="0" w:line="210" w:lineRule="exact"/>
-            </w:pPr>
-            <w:r>
-              <w:rPr>
-                <w:rFonts w:ascii="Consolas" w:hAnsi="Consolas"/>
-                <w:color w:val="0F172A"/>
-                <w:sz w:val="16"/>
-              </w:rPr>
-              <w:t xml:space="preserve">        showToast(st === 'Healthy' ? 'success' : (st === 'Slow' ? 'warning' : 'error'), `Status: ${st}`, `${api.name} responded in ${time}ms`);</w:t>
-            </w:r>
-          </w:p>
-          <w:p>
-            <w:pPr>
-              <w:spacing w:before="0" w:after="0" w:line="210" w:lineRule="exact"/>
-            </w:pPr>
-            <w:r>
-              <w:rPr>
-                <w:rFonts w:ascii="Consolas" w:hAnsi="Consolas"/>
-                <w:color w:val="0F172A"/>
-                <w:sz w:val="16"/>
-              </w:rPr>
-              <w:t xml:space="preserve">        refreshPageData('dashboard'); renderAPITable(); renderMonitorCards();</w:t>
-            </w:r>
-          </w:p>
-          <w:p>
-            <w:pPr>
-              <w:spacing w:before="0" w:after="0" w:line="210" w:lineRule="exact"/>
-            </w:pPr>
-            <w:r>
-              <w:rPr>
-                <w:rFonts w:ascii="Consolas" w:hAnsi="Consolas"/>
-                <w:color w:val="0F172A"/>
-                <w:sz w:val="16"/>
-              </w:rPr>
-              <w:t xml:space="preserve">    }, 450);</w:t>
+              <w:t xml:space="preserve">    showToast('info', 'Pinging Endpoint', `Connecting to ${api.name}...`);</w:t>
+            </w:r>
+          </w:p>
+          <w:p>
+            <w:pPr>
+              <w:spacing w:before="0" w:after="0" w:line="210" w:lineRule="exact"/>
+            </w:pPr>
+            <w:r>
+              <w:rPr>
+                <w:rFonts w:ascii="Consolas" w:hAnsi="Consolas"/>
+                <w:color w:val="0F172A"/>
+                <w:sz w:val="16"/>
+              </w:rPr>
+              <w:t xml:space="preserve">    const t0 = performance.now();</w:t>
+            </w:r>
+          </w:p>
+          <w:p>
+            <w:pPr>
+              <w:spacing w:before="0" w:after="0" w:line="210" w:lineRule="exact"/>
+            </w:pPr>
+            <w:r>
+              <w:rPr>
+                <w:rFonts w:ascii="Consolas" w:hAnsi="Consolas"/>
+                <w:color w:val="0F172A"/>
+                <w:sz w:val="16"/>
+              </w:rPr>
+              <w:t xml:space="preserve">    const ctrl = new AbortController();</w:t>
+            </w:r>
+          </w:p>
+          <w:p>
+            <w:pPr>
+              <w:spacing w:before="0" w:after="0" w:line="210" w:lineRule="exact"/>
+            </w:pPr>
+            <w:r>
+              <w:rPr>
+                <w:rFonts w:ascii="Consolas" w:hAnsi="Consolas"/>
+                <w:color w:val="0F172A"/>
+                <w:sz w:val="16"/>
+              </w:rPr>
+              <w:t xml:space="preserve">    const timer = setTimeout(() =&gt; ctrl.abort(), 5000);</w:t>
+            </w:r>
+          </w:p>
+          <w:p>
+            <w:pPr>
+              <w:spacing w:before="0" w:after="0" w:line="210" w:lineRule="exact"/>
+            </w:pPr>
+            <w:r>
+              <w:rPr>
+                <w:rFonts w:ascii="Consolas" w:hAnsi="Consolas"/>
+                <w:color w:val="0F172A"/>
+                <w:sz w:val="16"/>
+              </w:rPr>
+              <w:t xml:space="preserve">    fetch(api.url, { method: api.method || 'GET', signal: ctrl.signal, mode: 'no-cors' })</w:t>
+            </w:r>
+          </w:p>
+          <w:p>
+            <w:pPr>
+              <w:spacing w:before="0" w:after="0" w:line="210" w:lineRule="exact"/>
+            </w:pPr>
+            <w:r>
+              <w:rPr>
+                <w:rFonts w:ascii="Consolas" w:hAnsi="Consolas"/>
+                <w:color w:val="0F172A"/>
+                <w:sz w:val="16"/>
+              </w:rPr>
+              <w:t xml:space="preserve">        .then(res =&gt; {</w:t>
+            </w:r>
+          </w:p>
+          <w:p>
+            <w:pPr>
+              <w:spacing w:before="0" w:after="0" w:line="210" w:lineRule="exact"/>
+            </w:pPr>
+            <w:r>
+              <w:rPr>
+                <w:rFonts w:ascii="Consolas" w:hAnsi="Consolas"/>
+                <w:color w:val="0F172A"/>
+                <w:sz w:val="16"/>
+              </w:rPr>
+              <w:t xml:space="preserve">            clearTimeout(timer);</w:t>
+            </w:r>
+          </w:p>
+          <w:p>
+            <w:pPr>
+              <w:spacing w:before="0" w:after="0" w:line="210" w:lineRule="exact"/>
+            </w:pPr>
+            <w:r>
+              <w:rPr>
+                <w:rFonts w:ascii="Consolas" w:hAnsi="Consolas"/>
+                <w:color w:val="0F172A"/>
+                <w:sz w:val="16"/>
+              </w:rPr>
+              <w:t xml:space="preserve">            const time = Math.max(12, Math.round(performance.now() - t0));</w:t>
+            </w:r>
+          </w:p>
+          <w:p>
+            <w:pPr>
+              <w:spacing w:before="0" w:after="0" w:line="210" w:lineRule="exact"/>
+            </w:pPr>
+            <w:r>
+              <w:rPr>
+                <w:rFonts w:ascii="Consolas" w:hAnsi="Consolas"/>
+                <w:color w:val="0F172A"/>
+                <w:sz w:val="16"/>
+              </w:rPr>
+              <w:t xml:space="preserve">            const code = res.status || 200;</w:t>
+            </w:r>
+          </w:p>
+          <w:p>
+            <w:pPr>
+              <w:spacing w:before="0" w:after="0" w:line="210" w:lineRule="exact"/>
+            </w:pPr>
+            <w:r>
+              <w:rPr>
+                <w:rFonts w:ascii="Consolas" w:hAnsi="Consolas"/>
+                <w:color w:val="0F172A"/>
+                <w:sz w:val="16"/>
+              </w:rPr>
+              <w:t xml:space="preserve">            const st = time &lt; 500 ? 'Healthy' : 'Slow';</w:t>
+            </w:r>
+          </w:p>
+          <w:p>
+            <w:pPr>
+              <w:spacing w:before="0" w:after="0" w:line="210" w:lineRule="exact"/>
+            </w:pPr>
+            <w:r>
+              <w:rPr>
+                <w:rFonts w:ascii="Consolas" w:hAnsi="Consolas"/>
+                <w:color w:val="0F172A"/>
+                <w:sz w:val="16"/>
+              </w:rPr>
+              <w:t xml:space="preserve">            recordCheckResult(api, code, time, st);</w:t>
+            </w:r>
+          </w:p>
+          <w:p>
+            <w:pPr>
+              <w:spacing w:before="0" w:after="0" w:line="210" w:lineRule="exact"/>
+            </w:pPr>
+            <w:r>
+              <w:rPr>
+                <w:rFonts w:ascii="Consolas" w:hAnsi="Consolas"/>
+                <w:color w:val="0F172A"/>
+                <w:sz w:val="16"/>
+              </w:rPr>
+              <w:t xml:space="preserve">        })</w:t>
+            </w:r>
+          </w:p>
+          <w:p>
+            <w:pPr>
+              <w:spacing w:before="0" w:after="0" w:line="210" w:lineRule="exact"/>
+            </w:pPr>
+            <w:r>
+              <w:rPr>
+                <w:rFonts w:ascii="Consolas" w:hAnsi="Consolas"/>
+                <w:color w:val="0F172A"/>
+                <w:sz w:val="16"/>
+              </w:rPr>
+              <w:t xml:space="preserve">        .catch(() =&gt; {</w:t>
+            </w:r>
+          </w:p>
+          <w:p>
+            <w:pPr>
+              <w:spacing w:before="0" w:after="0" w:line="210" w:lineRule="exact"/>
+            </w:pPr>
+            <w:r>
+              <w:rPr>
+                <w:rFonts w:ascii="Consolas" w:hAnsi="Consolas"/>
+                <w:color w:val="0F172A"/>
+                <w:sz w:val="16"/>
+              </w:rPr>
+              <w:t xml:space="preserve">            clearTimeout(timer);</w:t>
+            </w:r>
+          </w:p>
+          <w:p>
+            <w:pPr>
+              <w:spacing w:before="0" w:after="0" w:line="210" w:lineRule="exact"/>
+            </w:pPr>
+            <w:r>
+              <w:rPr>
+                <w:rFonts w:ascii="Consolas" w:hAnsi="Consolas"/>
+                <w:color w:val="0F172A"/>
+                <w:sz w:val="16"/>
+              </w:rPr>
+              <w:t xml:space="preserve">            recordCheckResult(api, 0, 0, 'Failed');</w:t>
+            </w:r>
+          </w:p>
+          <w:p>
+            <w:pPr>
+              <w:spacing w:before="0" w:after="0" w:line="210" w:lineRule="exact"/>
+            </w:pPr>
+            <w:r>
+              <w:rPr>
+                <w:rFonts w:ascii="Consolas" w:hAnsi="Consolas"/>
+                <w:color w:val="0F172A"/>
+                <w:sz w:val="16"/>
+              </w:rPr>
+              <w:t xml:space="preserve">        });</w:t>
             </w:r>
           </w:p>
           <w:p>

</xml_diff>

<commit_message>
Feature: Multi-user authentication, user-isolated workspaces, and custom analytics dropdown
</commit_message>
<xml_diff>
--- a/API_Monitoring_Source_Code.docx
+++ b/API_Monitoring_Source_Code.docx
@@ -135,6 +135,8 @@
               <w:br/>
               <w:t xml:space="preserve">        &lt;div class="mobile-actions"&gt;</w:t>
               <w:br/>
+              <w:t xml:space="preserve">            &lt;button class="btn-icon" id="mobile-auth-btn" title="Account"&gt;&lt;i class="fas fa-user-circle"&gt;&lt;/i&gt;&lt;/button&gt;</w:t>
+              <w:br/>
               <w:t xml:space="preserve">            &lt;button class="btn-icon" id="mobile-theme-toggle"&gt;&lt;i class="fas fa-moon" id="mobile-theme-icon"&gt;&lt;/i&gt;&lt;/button&gt;</w:t>
               <w:br/>
               <w:t xml:space="preserve">            &lt;button class="btn-icon" id="mobile-check-all"&gt;&lt;i class="fas fa-sync-alt"&gt;&lt;/i&gt;&lt;/button&gt;</w:t>
@@ -187,6 +189,38 @@
               <w:br/>
               <w:t xml:space="preserve">                &lt;/div&gt;</w:t>
               <w:br/>
+              <w:t xml:space="preserve">                &lt;div class="auth-wrap" id="auth-wrap"&gt;</w:t>
+              <w:br/>
+              <w:t xml:space="preserve">                    &lt;button class="auth-icon-btn" id="btn-auth-trigger" title="User Account"&gt;</w:t>
+              <w:br/>
+              <w:t xml:space="preserve">                        &lt;i class="fas fa-user-circle"&gt;&lt;/i&gt;</w:t>
+              <w:br/>
+              <w:t xml:space="preserve">                    &lt;/button&gt;</w:t>
+              <w:br/>
+              <w:t xml:space="preserve">                    &lt;div class="auth-popover" id="auth-popover"&gt;</w:t>
+              <w:br/>
+              <w:t xml:space="preserve">                        &lt;div class="auth-popover-user" id="popover-user-info"&gt;</w:t>
+              <w:br/>
+              <w:t xml:space="preserve">                            &lt;div class="user-avatar" id="popover-avatar"&gt;U&lt;/div&gt;</w:t>
+              <w:br/>
+              <w:t xml:space="preserve">                            &lt;div&gt;</w:t>
+              <w:br/>
+              <w:t xml:space="preserve">                                &lt;div class="user-name" id="popover-name"&gt;User 1&lt;/div&gt;</w:t>
+              <w:br/>
+              <w:t xml:space="preserve">                                &lt;div class="user-email" id="popover-email"&gt;user1@demo.com&lt;/div&gt;</w:t>
+              <w:br/>
+              <w:t xml:space="preserve">                            &lt;/div&gt;</w:t>
+              <w:br/>
+              <w:t xml:space="preserve">                        &lt;/div&gt;</w:t>
+              <w:br/>
+              <w:t xml:space="preserve">                        &lt;div class="auth-popover-divider"&gt;&lt;/div&gt;</w:t>
+              <w:br/>
+              <w:t xml:space="preserve">                        &lt;button class="auth-popover-item text-danger" id="btn-logout"&gt;&lt;i class="fas fa-sign-out-alt"&gt;&lt;/i&gt; Logout&lt;/button&gt;</w:t>
+              <w:br/>
+              <w:t xml:space="preserve">                    &lt;/div&gt;</w:t>
+              <w:br/>
+              <w:t xml:space="preserve">                &lt;/div&gt;</w:t>
+              <w:br/>
               <w:t xml:space="preserve">            &lt;/div&gt;</w:t>
               <w:br/>
               <w:t xml:space="preserve">        &lt;/div&gt;</w:t>
@@ -477,7 +511,23 @@
               <w:br/>
               <w:t xml:space="preserve">                &lt;div&gt;&lt;h2 class="page-title"&gt;Performance Analytics&lt;/h2&gt;&lt;p class="page-subtitle"&gt;Latency metrics and status breakdown&lt;/p&gt;&lt;/div&gt;</w:t>
               <w:br/>
-              <w:t xml:space="preserve">                &lt;select id="analytics-api-filter" class="filter-select"&gt;&lt;option value="all"&gt;All APIs&lt;/option&gt;&lt;/select&gt;</w:t>
+              <w:t xml:space="preserve">                &lt;div class="custom-dropdown-wrap" id="analytics-dropdown-wrap"&gt;</w:t>
+              <w:br/>
+              <w:t xml:space="preserve">                    &lt;button type="button" class="custom-dropdown-btn" id="analytics-dropdown-btn"&gt;</w:t>
+              <w:br/>
+              <w:t xml:space="preserve">                        &lt;i class="fas fa-layer-group"&gt;&lt;/i&gt;</w:t>
+              <w:br/>
+              <w:t xml:space="preserve">                        &lt;span id="analytics-dropdown-label"&gt;All APIs&lt;/span&gt;</w:t>
+              <w:br/>
+              <w:t xml:space="preserve">                        &lt;i class="fas fa-chevron-down arrow-indicator"&gt;&lt;/i&gt;</w:t>
+              <w:br/>
+              <w:t xml:space="preserve">                    &lt;/button&gt;</w:t>
+              <w:br/>
+              <w:t xml:space="preserve">                    &lt;div class="custom-dropdown-menu" id="analytics-dropdown-menu"&gt;&lt;/div&gt;</w:t>
+              <w:br/>
+              <w:t xml:space="preserve">                    &lt;input type="hidden" id="analytics-api-filter" value="all"&gt;</w:t>
+              <w:br/>
+              <w:t xml:space="preserve">                &lt;/div&gt;</w:t>
               <w:br/>
               <w:t xml:space="preserve">            &lt;/div&gt;</w:t>
               <w:br/>
@@ -518,6 +568,84 @@
               <w:t xml:space="preserve">            &lt;div class="modal-body"&gt;&lt;p id="modal-message"&gt;Remove API?&lt;/p&gt;&lt;/div&gt;</w:t>
               <w:br/>
               <w:t xml:space="preserve">            &lt;div class="modal-footer"&gt;&lt;button class="btn btn-outline btn-sm" id="modal-cancel"&gt;Cancel&lt;/button&gt;&lt;button class="btn btn-danger btn-sm" id="modal-confirm"&gt;Confirm&lt;/button&gt;&lt;/div&gt;</w:t>
+              <w:br/>
+              <w:t xml:space="preserve">        &lt;/div&gt;</w:t>
+              <w:br/>
+              <w:t xml:space="preserve">    &lt;/div&gt;</w:t>
+              <w:br/>
+              <w:t xml:space="preserve">    &lt;div class="modal-overlay" id="auth-modal"&gt;</w:t>
+              <w:br/>
+              <w:t xml:space="preserve">        &lt;div class="modal auth-modal-card"&gt;</w:t>
+              <w:br/>
+              <w:t xml:space="preserve">            &lt;div class="modal-header"&gt;</w:t>
+              <w:br/>
+              <w:t xml:space="preserve">                &lt;div class="auth-tabs"&gt;</w:t>
+              <w:br/>
+              <w:t xml:space="preserve">                    &lt;button type="button" class="auth-tab active" id="tab-login"&gt;Sign In&lt;/button&gt;</w:t>
+              <w:br/>
+              <w:t xml:space="preserve">                    &lt;button type="button" class="auth-tab" id="tab-register"&gt;Create Account&lt;/button&gt;</w:t>
+              <w:br/>
+              <w:t xml:space="preserve">                &lt;/div&gt;</w:t>
+              <w:br/>
+              <w:t xml:space="preserve">                &lt;button class="modal-close" id="auth-close"&gt;&amp;times;&lt;/button&gt;</w:t>
+              <w:br/>
+              <w:t xml:space="preserve">            &lt;/div&gt;</w:t>
+              <w:br/>
+              <w:t xml:space="preserve">            &lt;div class="modal-body"&gt;</w:t>
+              <w:br/>
+              <w:t xml:space="preserve">                &lt;form id="login-form" class="auth-form active" autocomplete="off"&gt;</w:t>
+              <w:br/>
+              <w:t xml:space="preserve">                    &lt;div class="form-group"&gt;</w:t>
+              <w:br/>
+              <w:t xml:space="preserve">                        &lt;label for="login-email"&gt;&lt;i class="fas fa-envelope"&gt;&lt;/i&gt; Email Address&lt;/label&gt;</w:t>
+              <w:br/>
+              <w:t xml:space="preserve">                        &lt;input type="email" id="login-email" required placeholder="user1@demo.com"&gt;</w:t>
+              <w:br/>
+              <w:t xml:space="preserve">                    &lt;/div&gt;</w:t>
+              <w:br/>
+              <w:t xml:space="preserve">                    &lt;div class="form-group"&gt;</w:t>
+              <w:br/>
+              <w:t xml:space="preserve">                        &lt;label for="login-password"&gt;&lt;i class="fas fa-lock"&gt;&lt;/i&gt; Password&lt;/label&gt;</w:t>
+              <w:br/>
+              <w:t xml:space="preserve">                        &lt;input type="password" id="login-password" required placeholder="Enter password"&gt;</w:t>
+              <w:br/>
+              <w:t xml:space="preserve">                    &lt;/div&gt;</w:t>
+              <w:br/>
+              <w:t xml:space="preserve">                    &lt;button type="submit" class="btn btn-primary btn-block"&gt;&lt;i class="fas fa-sign-in-alt"&gt;&lt;/i&gt; Sign In&lt;/button&gt;</w:t>
+              <w:br/>
+              <w:t xml:space="preserve">                &lt;/form&gt;</w:t>
+              <w:br/>
+              <w:t xml:space="preserve">                &lt;form id="register-form" class="auth-form" autocomplete="off" style="display:none"&gt;</w:t>
+              <w:br/>
+              <w:t xml:space="preserve">                    &lt;div class="form-group"&gt;</w:t>
+              <w:br/>
+              <w:t xml:space="preserve">                        &lt;label for="reg-name"&gt;&lt;i class="fas fa-user"&gt;&lt;/i&gt; Full Name&lt;/label&gt;</w:t>
+              <w:br/>
+              <w:t xml:space="preserve">                        &lt;input type="text" id="reg-name" required placeholder="e.g. Alex Carter"&gt;</w:t>
+              <w:br/>
+              <w:t xml:space="preserve">                    &lt;/div&gt;</w:t>
+              <w:br/>
+              <w:t xml:space="preserve">                    &lt;div class="form-group"&gt;</w:t>
+              <w:br/>
+              <w:t xml:space="preserve">                        &lt;label for="reg-email"&gt;&lt;i class="fas fa-envelope"&gt;&lt;/i&gt; Email Address&lt;/label&gt;</w:t>
+              <w:br/>
+              <w:t xml:space="preserve">                        &lt;input type="email" id="reg-email" required placeholder="name@example.com"&gt;</w:t>
+              <w:br/>
+              <w:t xml:space="preserve">                    &lt;/div&gt;</w:t>
+              <w:br/>
+              <w:t xml:space="preserve">                    &lt;div class="form-group"&gt;</w:t>
+              <w:br/>
+              <w:t xml:space="preserve">                        &lt;label for="reg-password"&gt;&lt;i class="fas fa-lock"&gt;&lt;/i&gt; Password&lt;/label&gt;</w:t>
+              <w:br/>
+              <w:t xml:space="preserve">                        &lt;input type="password" id="reg-password" required placeholder="Create password"&gt;</w:t>
+              <w:br/>
+              <w:t xml:space="preserve">                    &lt;/div&gt;</w:t>
+              <w:br/>
+              <w:t xml:space="preserve">                    &lt;button type="submit" class="btn btn-primary btn-block"&gt;&lt;i class="fas fa-user-plus"&gt;&lt;/i&gt; Create Account&lt;/button&gt;</w:t>
+              <w:br/>
+              <w:t xml:space="preserve">                &lt;/form&gt;</w:t>
+              <w:br/>
+              <w:t xml:space="preserve">            &lt;/div&gt;</w:t>
               <w:br/>
               <w:t xml:space="preserve">        &lt;/div&gt;</w:t>
               <w:br/>
@@ -1252,6 +1380,136 @@
               <w:br/>
               <w:t>.modal-footer { display: flex; gap: 12px; justify-content: flex-end; padding: 16px 24px; border-top: 1px solid var(--border-subtle); }</w:t>
               <w:br/>
+              <w:t>.auth-wrap { position: relative; }</w:t>
+              <w:br/>
+              <w:t>.auth-icon-btn {</w:t>
+              <w:br/>
+              <w:t xml:space="preserve">    width: 42px; height: 42px; border-radius: 50%;</w:t>
+              <w:br/>
+              <w:t xml:space="preserve">    background: var(--bg-card); border: 1px solid var(--border-subtle);</w:t>
+              <w:br/>
+              <w:t xml:space="preserve">    display: flex; align-items: center; justify-content: center;</w:t>
+              <w:br/>
+              <w:t xml:space="preserve">    color: var(--text-primary); font-size: 1.25rem; transition: var(--transition);</w:t>
+              <w:br/>
+              <w:t xml:space="preserve">    cursor: pointer; box-shadow: var(--shadow-soft);</w:t>
+              <w:br/>
+              <w:t>}</w:t>
+              <w:br/>
+              <w:t>.auth-icon-btn:hover { border-color: var(--coral-primary); color: var(--coral-primary); transform: translateY(-1px); }</w:t>
+              <w:br/>
+              <w:t>.auth-icon-btn.logged-in { background: linear-gradient(135deg, rgba(255,94,98,0.12), rgba(217,70,239,0.12)); border-color: var(--coral-primary); color: var(--coral-primary); }</w:t>
+              <w:br/>
+              <w:t>.auth-popover {</w:t>
+              <w:br/>
+              <w:t xml:space="preserve">    position: absolute; right: 0; top: calc(100% + 10px); width: 230px;</w:t>
+              <w:br/>
+              <w:t xml:space="preserve">    background: var(--bg-card); border: 1px solid var(--border-card); border-radius: var(--radius-lg);</w:t>
+              <w:br/>
+              <w:t xml:space="preserve">    box-shadow: 0 16px 40px rgba(0,0,0,0.16); padding: 14px; display: none; z-index: 1000;</w:t>
+              <w:br/>
+              <w:t xml:space="preserve">    animation: popIn 0.2s cubic-bezier(0.16, 1, 0.3, 1);</w:t>
+              <w:br/>
+              <w:t>}</w:t>
+              <w:br/>
+              <w:t>.auth-popover.active { display: block; }</w:t>
+              <w:br/>
+              <w:t>@keyframes popIn { from { opacity: 0; transform: translateY(-8px) scale(0.96); } to { opacity: 1; transform: translateY(0) scale(1); } }</w:t>
+              <w:br/>
+              <w:t>.auth-popover-user { display: flex; align-items: center; gap: 12px; }</w:t>
+              <w:br/>
+              <w:t>.user-avatar {</w:t>
+              <w:br/>
+              <w:t xml:space="preserve">    width: 38px; height: 38px; border-radius: 50%;</w:t>
+              <w:br/>
+              <w:t xml:space="preserve">    background: linear-gradient(135deg, var(--coral-primary), var(--pink-accent));</w:t>
+              <w:br/>
+              <w:t xml:space="preserve">    color: #fff; font-weight: 800; font-size: 1rem; display: flex; align-items: center; justify-content: center; flex-shrink: 0;</w:t>
+              <w:br/>
+              <w:t>}</w:t>
+              <w:br/>
+              <w:t>.user-name { font-size: 0.9rem; font-weight: 800; color: var(--text-primary); }</w:t>
+              <w:br/>
+              <w:t>.user-email { font-size: 0.74rem; color: var(--text-muted); word-break: break-all; }</w:t>
+              <w:br/>
+              <w:t>.auth-popover-divider { height: 1px; background: var(--border-subtle); margin: 12px 0 8px; }</w:t>
+              <w:br/>
+              <w:t>.auth-popover-item {</w:t>
+              <w:br/>
+              <w:t xml:space="preserve">    width: 100%; display: flex; align-items: center; gap: 10px; padding: 8px 12px;</w:t>
+              <w:br/>
+              <w:t xml:space="preserve">    border-radius: var(--radius-sm); font-size: 0.84rem; font-weight: 700; color: var(--failed);</w:t>
+              <w:br/>
+              <w:t xml:space="preserve">    background: transparent; border: none; cursor: pointer; transition: var(--transition);</w:t>
+              <w:br/>
+              <w:t>}</w:t>
+              <w:br/>
+              <w:t>.auth-popover-item:hover { background: var(--failed-bg); }</w:t>
+              <w:br/>
+              <w:t>.auth-tabs { display: flex; gap: 8px; }</w:t>
+              <w:br/>
+              <w:t>.auth-tab {</w:t>
+              <w:br/>
+              <w:t xml:space="preserve">    padding: 6px 14px; border-radius: var(--radius-pill); font-size: 0.82rem; font-weight: 700;</w:t>
+              <w:br/>
+              <w:t xml:space="preserve">    color: var(--text-muted); background: transparent; border: none; cursor: pointer; transition: var(--transition);</w:t>
+              <w:br/>
+              <w:t>}</w:t>
+              <w:br/>
+              <w:t>.auth-tab.active { background: var(--coral-primary); color: #fff; }</w:t>
+              <w:br/>
+              <w:t>.custom-dropdown-wrap { position: relative; display: inline-block; }</w:t>
+              <w:br/>
+              <w:t>.custom-dropdown-btn {</w:t>
+              <w:br/>
+              <w:t xml:space="preserve">    display: inline-flex; align-items: center; gap: 10px; padding: 9px 18px;</w:t>
+              <w:br/>
+              <w:t xml:space="preserve">    background: var(--bg-card); border: 1.5px solid var(--border-subtle); border-radius: var(--radius-pill);</w:t>
+              <w:br/>
+              <w:t xml:space="preserve">    color: var(--text-primary); font-size: 0.86rem; font-weight: 700; cursor: pointer;</w:t>
+              <w:br/>
+              <w:t xml:space="preserve">    box-shadow: var(--shadow-soft); transition: var(--transition);</w:t>
+              <w:br/>
+              <w:t>}</w:t>
+              <w:br/>
+              <w:t>.custom-dropdown-btn:hover { border-color: var(--coral-primary); background: var(--bg-item-hover); }</w:t>
+              <w:br/>
+              <w:t>.custom-dropdown-btn .arrow-indicator { font-size: 0.75rem; color: var(--text-muted); transition: transform 0.25s ease; }</w:t>
+              <w:br/>
+              <w:t>.custom-dropdown-wrap.open .custom-dropdown-btn .arrow-indicator { transform: rotate(180deg); }</w:t>
+              <w:br/>
+              <w:t>.custom-dropdown-menu {</w:t>
+              <w:br/>
+              <w:t xml:space="preserve">    position: absolute; right: 0; top: calc(100% + 8px); min-width: 220px;</w:t>
+              <w:br/>
+              <w:t xml:space="preserve">    background: var(--bg-card); border: 1.5px solid var(--border-card); border-radius: var(--radius-lg);</w:t>
+              <w:br/>
+              <w:t xml:space="preserve">    box-shadow: 0 16px 45px rgba(0,0,0,0.18); padding: 8px; display: none; z-index: 1050;</w:t>
+              <w:br/>
+              <w:t xml:space="preserve">    max-height: 280px; overflow-y: auto; animation: popIn 0.2s cubic-bezier(0.16, 1, 0.3, 1);</w:t>
+              <w:br/>
+              <w:t>}</w:t>
+              <w:br/>
+              <w:t>.custom-dropdown-wrap.open .custom-dropdown-menu { display: flex; flex-direction: column; gap: 4px; }</w:t>
+              <w:br/>
+              <w:t>.custom-dropdown-item {</w:t>
+              <w:br/>
+              <w:t xml:space="preserve">    display: flex; align-items: center; justify-content: space-between; gap: 12px;</w:t>
+              <w:br/>
+              <w:t xml:space="preserve">    padding: 10px 14px; border-radius: var(--radius-md); font-size: 0.85rem; font-weight: 600;</w:t>
+              <w:br/>
+              <w:t xml:space="preserve">    color: var(--text-primary); cursor: pointer; transition: var(--transition);</w:t>
+              <w:br/>
+              <w:t>}</w:t>
+              <w:br/>
+              <w:t>.custom-dropdown-item:hover { background: var(--bg-item-hover); color: var(--coral-primary); }</w:t>
+              <w:br/>
+              <w:t>.custom-dropdown-item.active { background: rgba(255,94,98,0.1); color: var(--coral-primary); font-weight: 700; }</w:t>
+              <w:br/>
+              <w:t>.custom-dropdown-item .item-left { display: flex; align-items: center; gap: 10px; overflow: hidden; text-overflow: ellipsis; white-space: nowrap; }</w:t>
+              <w:br/>
+              <w:t>.filter-select option { background: var(--bg-card); color: var(--text-primary); padding: 8px; }</w:t>
+              <w:br/>
               <w:t>@media (max-width: 1260px) {</w:t>
               <w:br/>
               <w:t xml:space="preserve">    .ref-dashboard-container { grid-template-columns: 1fr; }</w:t>
@@ -1355,64 +1613,93 @@
                 <w:color w:val="1E293B"/>
                 <w:sz w:val="16"/>
               </w:rPr>
-              <w:t>const DB_APIS = 'api_monitor_endpoints';</w:t>
-              <w:br/>
-              <w:t>const DB_HIST = 'api_monitor_logs';</w:t>
+              <w:t>const DB_APIS = 'api_monitor_endpoints', DB_HIST = 'api_monitor_logs', DB_USERS = 'api_monitor_users', DB_AUTH = 'api_monitor_active_user';</w:t>
+              <w:br/>
+              <w:br/>
+              <w:t>const DEFAULT_USERS = [</w:t>
+              <w:br/>
+              <w:t xml:space="preserve">    { id: 1, name: 'User 1', email: 'user1@demo.com', password: 'password123' },</w:t>
+              <w:br/>
+              <w:t xml:space="preserve">    { id: 2, name: 'User 2', email: 'user2@demo.com', password: 'password123' }</w:t>
+              <w:br/>
+              <w:t>];</w:t>
               <w:br/>
               <w:br/>
               <w:t>const DEFAULT_APIS = [</w:t>
               <w:br/>
-              <w:t xml:space="preserve">    { id: 1, name: 'JSONPlaceholder Users', url: 'https://jsonplaceholder.typicode.com/users', method: 'GET', category: 'Public API', calls: '23.4k', trend: '+8%', trendType: 'up', avatarColor: '#f59e0b', avatarIcon: 'fa-user', created_at: '2026-09-20', lastStatus: 'Healthy' },</w:t>
-              <w:br/>
-              <w:t xml:space="preserve">    { id: 2, name: 'GitHub API Gateway', url: 'https://api.github.com', method: 'GET', category: 'Core Service', calls: '18.2k', trend: '+5%', trendType: 'up', avatarColor: '#e11d48', avatarIcon: 'fa-code-branch', created_at: '2026-09-21', lastStatus: 'Healthy' },</w:t>
-              <w:br/>
-              <w:t xml:space="preserve">    { id: 3, name: 'ReqRes Users &amp; Auth', url: 'https://reqres.in/api/users', method: 'GET', category: 'Auth Service', calls: '9.6k', trend: '-4%', trendType: 'down', avatarColor: '#8b5cf6', avatarIcon: 'fa-shield-alt', created_at: '2026-09-22', lastStatus: 'Slow' },</w:t>
-              <w:br/>
-              <w:t xml:space="preserve">    { id: 4, name: 'HTTPBin Ingestion Post', url: 'https://httpbin.org/post', method: 'POST', category: 'Ingestion', calls: '14.1k', trend: '+12%', trendType: 'up', avatarColor: '#0ea5e9', avatarIcon: 'fa-cloud-upload-alt', created_at: '2026-09-22', lastStatus: 'Healthy' },</w:t>
-              <w:br/>
-              <w:t xml:space="preserve">    { id: 5, name: 'Legacy Billing Microservice', url: 'https://api.nonexistent-domain-xyz.com/data', method: 'GET', category: 'Payments', calls: '1.2k', trend: '-18%', trendType: 'down', avatarColor: '#f97316', avatarIcon: 'fa-exclamation-triangle', created_at: '2026-09-23', lastStatus: 'Failed' },</w:t>
+              <w:t xml:space="preserve">    { id: 1, user_id: 1, name: 'JSONPlaceholder Users', url: 'https://jsonplaceholder.typicode.com/users', method: 'GET', category: 'Public API', calls: '23.4k', trend: '+8%', trendType: 'up', avatarColor: '#f59e0b', avatarIcon: 'fa-user', created_at: '2026-09-20', lastStatus: 'Healthy' },</w:t>
+              <w:br/>
+              <w:t xml:space="preserve">    { id: 2, user_id: 1, name: 'GitHub API Gateway', url: 'https://api.github.com', method: 'GET', category: 'Core Service', calls: '18.2k', trend: '+5%', trendType: 'up', avatarColor: '#e11d48', avatarIcon: 'fa-code-branch', created_at: '2026-09-21', lastStatus: 'Healthy' },</w:t>
+              <w:br/>
+              <w:t xml:space="preserve">    { id: 3, user_id: 1, name: 'ReqRes Users &amp; Auth', url: 'https://reqres.in/api/users', method: 'GET', category: 'Auth Service', calls: '9.6k', trend: '-4%', trendType: 'down', avatarColor: '#8b5cf6', avatarIcon: 'fa-shield-alt', created_at: '2026-09-22', lastStatus: 'Slow' },</w:t>
+              <w:br/>
+              <w:t xml:space="preserve">    { id: 4, user_id: 1, name: 'HTTPBin Ingestion Post', url: 'https://httpbin.org/post', method: 'POST', category: 'Ingestion', calls: '14.1k', trend: '+12%', trendType: 'up', avatarColor: '#0ea5e9', avatarIcon: 'fa-cloud-upload-alt', created_at: '2026-09-22', lastStatus: 'Healthy' },</w:t>
+              <w:br/>
+              <w:t xml:space="preserve">    { id: 5, user_id: 1, name: 'Legacy Billing Microservice', url: 'https://api.nonexistent-domain-xyz.com/data', method: 'GET', category: 'Payments', calls: '1.2k', trend: '-18%', trendType: 'down', avatarColor: '#f97316', avatarIcon: 'fa-exclamation-triangle', created_at: '2026-09-23', lastStatus: 'Failed' },</w:t>
+              <w:br/>
+              <w:t xml:space="preserve">    { id: 101, user_id: 2, name: 'Dog Ceo Random Image', url: 'https://dog.ceo/api/breeds/image/random', method: 'GET', category: 'Public API', calls: '6.4k', trend: '+15%', trendType: 'up', avatarColor: '#10b981', avatarIcon: 'fa-paw', created_at: '2026-09-21', lastStatus: 'Healthy' },</w:t>
+              <w:br/>
+              <w:t xml:space="preserve">    { id: 102, user_id: 2, name: 'CoinGecko Crypto Ping', url: 'https://api.coingecko.com/api/v3/ping', method: 'GET', category: 'Crypto API', calls: '14.2k', trend: '+4%', trendType: 'up', avatarColor: '#f59e0b', avatarIcon: 'fa-coins', created_at: '2026-09-22', lastStatus: 'Healthy' }</w:t>
               <w:br/>
               <w:t>];</w:t>
               <w:br/>
               <w:br/>
               <w:t>const DEFAULT_HIST = [</w:t>
               <w:br/>
-              <w:t xml:space="preserve">    { id: 1, api_id: 1, api_name: 'JSONPlaceholder Users', status_code: 200, response_time: 142, status: 'Healthy', checked_at: '2026-09-25 09:30:00' },</w:t>
-              <w:br/>
-              <w:t xml:space="preserve">    { id: 2, api_id: 2, api_name: 'GitHub API Gateway', status_code: 200, response_time: 289, status: 'Healthy', checked_at: '2026-09-25 09:30:05' },</w:t>
-              <w:br/>
-              <w:t xml:space="preserve">    { id: 3, api_id: 3, api_name: 'ReqRes Users &amp; Auth', status_code: 200, response_time: 823, status: 'Slow', checked_at: '2026-09-25 09:30:10' },</w:t>
-              <w:br/>
-              <w:t xml:space="preserve">    { id: 4, api_id: 4, api_name: 'HTTPBin Ingestion Post', status_code: 200, response_time: 356, status: 'Healthy', checked_at: '2026-09-25 09:30:15' },</w:t>
-              <w:br/>
-              <w:t xml:space="preserve">    { id: 5, api_id: 5, api_name: 'Legacy Billing Microservice', status_code: 0, response_time: 0, status: 'Failed', checked_at: '2026-09-25 09:30:20' },</w:t>
-              <w:br/>
-              <w:t xml:space="preserve">    { id: 6, api_id: 1, api_name: 'JSONPlaceholder Users', status_code: 200, response_time: 178, status: 'Healthy', checked_at: '2026-09-25 08:00:00' },</w:t>
-              <w:br/>
-              <w:t xml:space="preserve">    { id: 7, api_id: 2, api_name: 'GitHub API Gateway', status_code: 200, response_time: 312, status: 'Healthy', checked_at: '2026-09-25 08:00:05' },</w:t>
-              <w:br/>
-              <w:t xml:space="preserve">    { id: 8, api_id: 3, api_name: 'ReqRes Users &amp; Auth', status_code: 200, response_time: 1540, status: 'Slow', checked_at: '2026-09-25 08:00:10' },</w:t>
-              <w:br/>
-              <w:t xml:space="preserve">    { id: 9, api_id: 4, api_name: 'HTTPBin Ingestion Post', status_code: 200, response_time: 410, status: 'Healthy', checked_at: '2026-09-25 08:00:15' },</w:t>
-              <w:br/>
-              <w:t xml:space="preserve">    { id: 10, api_id: 5, api_name: 'Legacy Billing Microservice', status_code: 0, response_time: 0, status: 'Failed', checked_at: '2026-09-25 08:00:20' },</w:t>
+              <w:t xml:space="preserve">    { id: 1, user_id: 1, api_id: 1, api_name: 'JSONPlaceholder Users', status_code: 200, response_time: 142, status: 'Healthy', checked_at: '2026-09-25 09:30:00' },</w:t>
+              <w:br/>
+              <w:t xml:space="preserve">    { id: 2, user_id: 1, api_id: 2, api_name: 'GitHub API Gateway', status_code: 200, response_time: 289, status: 'Healthy', checked_at: '2026-09-25 09:30:05' },</w:t>
+              <w:br/>
+              <w:t xml:space="preserve">    { id: 3, user_id: 1, api_id: 3, api_name: 'ReqRes Users &amp; Auth', status_code: 200, response_time: 823, status: 'Slow', checked_at: '2026-09-25 09:30:10' },</w:t>
+              <w:br/>
+              <w:t xml:space="preserve">    { id: 4, user_id: 1, api_id: 4, api_name: 'HTTPBin Ingestion Post', status_code: 200, response_time: 356, status: 'Healthy', checked_at: '2026-09-25 09:30:15' },</w:t>
+              <w:br/>
+              <w:t xml:space="preserve">    { id: 5, user_id: 1, api_id: 5, api_name: 'Legacy Billing Microservice', status_code: 0, response_time: 0, status: 'Failed', checked_at: '2026-09-25 09:30:20' },</w:t>
+              <w:br/>
+              <w:t xml:space="preserve">    { id: 101, user_id: 2, api_id: 101, api_name: 'Dog Ceo Random Image', status_code: 200, response_time: 195, status: 'Healthy', checked_at: '2026-09-25 10:15:00' },</w:t>
+              <w:br/>
+              <w:t xml:space="preserve">    { id: 102, user_id: 2, api_id: 102, api_name: 'CoinGecko Crypto Ping', status_code: 200, response_time: 310, status: 'Healthy', checked_at: '2026-09-25 10:15:05' }</w:t>
               <w:br/>
               <w:t>];</w:t>
               <w:br/>
               <w:br/>
-              <w:t>let apiList = [];</w:t>
-              <w:br/>
-              <w:t>let monitorHistory = [];</w:t>
+              <w:t>let usersList = [], currentUser = null, apiList = [], monitorHistory = [];</w:t>
+              <w:br/>
+              <w:t>let nextApiId = Date.now(), nextHistoryId = Date.now() + 500, currentTab = 'activity', searchQuery = '', pendingDeleteId = null;</w:t>
+              <w:br/>
+              <w:t>let charts = { wave: null, donut: null, weekly: null, resp: null, dough: null, bar: null };</w:t>
+              <w:br/>
+              <w:t>const $ = (id) =&gt; document.getElementById(id), $$ = (sel) =&gt; document.querySelectorAll(sel);</w:t>
               <w:br/>
               <w:br/>
               <w:t>function loadStorage() {</w:t>
               <w:br/>
               <w:t xml:space="preserve">    try {</w:t>
               <w:br/>
+              <w:t xml:space="preserve">        const u = localStorage.getItem(DB_USERS);</w:t>
+              <w:br/>
+              <w:t xml:space="preserve">        usersList = u ? JSON.parse(u) : [...DEFAULT_USERS];</w:t>
+              <w:br/>
+              <w:t xml:space="preserve">        if (!u) localStorage.setItem(DB_USERS, JSON.stringify(usersList));</w:t>
+              <w:br/>
+              <w:t xml:space="preserve">    } catch (_) { usersList = [...DEFAULT_USERS]; }</w:t>
+              <w:br/>
+              <w:t xml:space="preserve">    try {</w:t>
+              <w:br/>
+              <w:t xml:space="preserve">        const activeId = localStorage.getItem(DB_AUTH);</w:t>
+              <w:br/>
+              <w:t xml:space="preserve">        currentUser = usersList.find(u =&gt; u.id == activeId) || usersList[0];</w:t>
+              <w:br/>
+              <w:t xml:space="preserve">    } catch (_) { currentUser = usersList[0]; }</w:t>
+              <w:br/>
+              <w:t xml:space="preserve">    try {</w:t>
+              <w:br/>
               <w:t xml:space="preserve">        const a = localStorage.getItem(DB_APIS);</w:t>
               <w:br/>
               <w:t xml:space="preserve">        apiList = a ? JSON.parse(a) : [...DEFAULT_APIS];</w:t>
               <w:br/>
+              <w:t xml:space="preserve">        if (!a) localStorage.setItem(DB_APIS, JSON.stringify(apiList));</w:t>
+              <w:br/>
               <w:t xml:space="preserve">    } catch (_) { apiList = [...DEFAULT_APIS]; }</w:t>
               <w:br/>
               <w:t xml:space="preserve">    try {</w:t>
@@ -1421,6 +1708,8 @@
               <w:br/>
               <w:t xml:space="preserve">        monitorHistory = h ? JSON.parse(h) : [...DEFAULT_HIST];</w:t>
               <w:br/>
+              <w:t xml:space="preserve">        if (!h) localStorage.setItem(DB_HIST, JSON.stringify(monitorHistory));</w:t>
+              <w:br/>
               <w:t xml:space="preserve">    } catch (_) { monitorHistory = [...DEFAULT_HIST]; }</w:t>
               <w:br/>
               <w:t>}</w:t>
@@ -1430,22 +1719,190 @@
               <w:br/>
               <w:t xml:space="preserve">    try {</w:t>
               <w:br/>
+              <w:t xml:space="preserve">        localStorage.setItem(DB_USERS, JSON.stringify(usersList));</w:t>
+              <w:br/>
               <w:t xml:space="preserve">        localStorage.setItem(DB_APIS, JSON.stringify(apiList));</w:t>
               <w:br/>
               <w:t xml:space="preserve">        localStorage.setItem(DB_HIST, JSON.stringify(monitorHistory));</w:t>
               <w:br/>
+              <w:t xml:space="preserve">        if (currentUser) localStorage.setItem(DB_AUTH, currentUser.id);</w:t>
+              <w:br/>
+              <w:t xml:space="preserve">        else localStorage.removeItem(DB_AUTH);</w:t>
+              <w:br/>
               <w:t xml:space="preserve">    } catch (_) {}</w:t>
               <w:br/>
               <w:t>}</w:t>
               <w:br/>
               <w:br/>
-              <w:t>let nextApiId = Date.now(), nextHistoryId = Date.now() + 500, currentTab = 'activity', searchQuery = '', pendingDeleteId = null;</w:t>
-              <w:br/>
-              <w:t>let charts = { wave: null, donut: null, weekly: null, resp: null, dough: null, bar: null };</w:t>
-              <w:br/>
-              <w:t>const $ = (id) =&gt; document.getElementById(id);</w:t>
-              <w:br/>
-              <w:t>const $$ = (sel) =&gt; document.querySelectorAll(sel);</w:t>
+              <w:t>const getActiveAPIs = () =&gt; currentUser ? apiList.filter(a =&gt; a.user_id === currentUser.id) : [];</w:t>
+              <w:br/>
+              <w:t>const getActiveHistory = () =&gt; currentUser ? monitorHistory.filter(h =&gt; h.user_id === currentUser.id) : [];</w:t>
+              <w:br/>
+              <w:br/>
+              <w:t>function updateAuthUI() {</w:t>
+              <w:br/>
+              <w:t xml:space="preserve">    const trigger = $('btn-auth-trigger'), popover = $('auth-popover');</w:t>
+              <w:br/>
+              <w:t xml:space="preserve">    if (currentUser) {</w:t>
+              <w:br/>
+              <w:t xml:space="preserve">        if (trigger) {</w:t>
+              <w:br/>
+              <w:t xml:space="preserve">            trigger.classList.add('logged-in');</w:t>
+              <w:br/>
+              <w:t xml:space="preserve">            trigger.innerHTML = `&lt;span style="font-weight:800;font-size:0.88rem"&gt;${currentUser.name.slice(0, 1).toUpperCase()}&lt;/span&gt;`;</w:t>
+              <w:br/>
+              <w:t xml:space="preserve">            trigger.title = `${currentUser.name} (${currentUser.email})`;</w:t>
+              <w:br/>
+              <w:t xml:space="preserve">        }</w:t>
+              <w:br/>
+              <w:t xml:space="preserve">        if ($('popover-avatar')) $('popover-avatar').textContent = currentUser.name.slice(0, 1).toUpperCase();</w:t>
+              <w:br/>
+              <w:t xml:space="preserve">        if ($('popover-name')) $('popover-name').textContent = currentUser.name;</w:t>
+              <w:br/>
+              <w:t xml:space="preserve">        if ($('popover-email')) $('popover-email').textContent = currentUser.email;</w:t>
+              <w:br/>
+              <w:t xml:space="preserve">    } else {</w:t>
+              <w:br/>
+              <w:t xml:space="preserve">        if (trigger) {</w:t>
+              <w:br/>
+              <w:t xml:space="preserve">            trigger.classList.remove('logged-in');</w:t>
+              <w:br/>
+              <w:t xml:space="preserve">            trigger.innerHTML = `&lt;i class="fas fa-user-circle"&gt;&lt;/i&gt;`;</w:t>
+              <w:br/>
+              <w:t xml:space="preserve">            trigger.title = 'Sign In';</w:t>
+              <w:br/>
+              <w:t xml:space="preserve">        }</w:t>
+              <w:br/>
+              <w:t xml:space="preserve">        popover?.classList.remove('active');</w:t>
+              <w:br/>
+              <w:t xml:space="preserve">    }</w:t>
+              <w:br/>
+              <w:t>}</w:t>
+              <w:br/>
+              <w:br/>
+              <w:t>function handleAuthTriggerClick() {</w:t>
+              <w:br/>
+              <w:t xml:space="preserve">    if (currentUser) $('auth-popover')?.classList.toggle('active');</w:t>
+              <w:br/>
+              <w:t xml:space="preserve">    else openAuthModal('login');</w:t>
+              <w:br/>
+              <w:t>}</w:t>
+              <w:br/>
+              <w:t>$('btn-auth-trigger')?.addEventListener('click', (e) =&gt; { e.stopPropagation(); handleAuthTriggerClick(); });</w:t>
+              <w:br/>
+              <w:t>$('mobile-auth-btn')?.addEventListener('click', (e) =&gt; { e.stopPropagation(); handleAuthTriggerClick(); });</w:t>
+              <w:br/>
+              <w:br/>
+              <w:t>function openAuthModal(tab = 'login') { switchAuthTab(tab); $('auth-modal')?.classList.add('active'); }</w:t>
+              <w:br/>
+              <w:t>function closeAuthModal() { $('auth-modal')?.classList.remove('active'); }</w:t>
+              <w:br/>
+              <w:t>$('auth-close')?.addEventListener('click', closeAuthModal);</w:t>
+              <w:br/>
+              <w:br/>
+              <w:t>function switchAuthTab(tab) {</w:t>
+              <w:br/>
+              <w:t xml:space="preserve">    const isLogin = tab === 'login';</w:t>
+              <w:br/>
+              <w:t xml:space="preserve">    $('tab-login')?.classList.toggle('active', isLogin);</w:t>
+              <w:br/>
+              <w:t xml:space="preserve">    $('tab-register')?.classList.toggle('active', !isLogin);</w:t>
+              <w:br/>
+              <w:t xml:space="preserve">    if ($('login-form')) $('login-form').style.display = isLogin ? 'block' : 'none';</w:t>
+              <w:br/>
+              <w:t xml:space="preserve">    if ($('register-form')) $('register-form').style.display = !isLogin ? 'block' : 'none';</w:t>
+              <w:br/>
+              <w:t>}</w:t>
+              <w:br/>
+              <w:t>$('tab-login')?.addEventListener('click', () =&gt; switchAuthTab('login'));</w:t>
+              <w:br/>
+              <w:t>$('tab-register')?.addEventListener('click', () =&gt; switchAuthTab('register'));</w:t>
+              <w:br/>
+              <w:br/>
+              <w:t>$('login-form')?.addEventListener('submit', (e) =&gt; {</w:t>
+              <w:br/>
+              <w:t xml:space="preserve">    e.preventDefault();</w:t>
+              <w:br/>
+              <w:t xml:space="preserve">    const email = $('login-email').value.trim().toLowerCase(), pass = $('login-password').value;</w:t>
+              <w:br/>
+              <w:t xml:space="preserve">    const user = usersList.find(u =&gt; u.email.toLowerCase() === email &amp;&amp; u.password === pass);</w:t>
+              <w:br/>
+              <w:t xml:space="preserve">    if (user) {</w:t>
+              <w:br/>
+              <w:t xml:space="preserve">        currentUser = user;</w:t>
+              <w:br/>
+              <w:t xml:space="preserve">        saveStorage(); updateAuthUI(); closeAuthModal();</w:t>
+              <w:br/>
+              <w:t xml:space="preserve">        showToast('success', 'Logged In', `Welcome back, ${user.name}!`);</w:t>
+              <w:br/>
+              <w:t xml:space="preserve">        $('login-password').value = '';</w:t>
+              <w:br/>
+              <w:t xml:space="preserve">        refreshAllDashboardData();</w:t>
+              <w:br/>
+              <w:t xml:space="preserve">    } else showToast('error', 'Login Failed', 'Invalid email or password.');</w:t>
+              <w:br/>
+              <w:t>});</w:t>
+              <w:br/>
+              <w:br/>
+              <w:t>$('register-form')?.addEventListener('submit', (e) =&gt; {</w:t>
+              <w:br/>
+              <w:t xml:space="preserve">    e.preventDefault();</w:t>
+              <w:br/>
+              <w:t xml:space="preserve">    const name = $('reg-name').value.trim(), email = $('reg-email').value.trim().toLowerCase(), pass = $('reg-password').value;</w:t>
+              <w:br/>
+              <w:t xml:space="preserve">    if (!name || !email || !pass) return showToast('error', 'Error', 'All fields are required.');</w:t>
+              <w:br/>
+              <w:t xml:space="preserve">    if (usersList.some(u =&gt; u.email.toLowerCase() === email)) return showToast('error', 'Exists', 'Email already registered.');</w:t>
+              <w:br/>
+              <w:t xml:space="preserve">    const newUser = { id: Date.now(), name, email, password: pass };</w:t>
+              <w:br/>
+              <w:t xml:space="preserve">    usersList.push(newUser);</w:t>
+              <w:br/>
+              <w:t xml:space="preserve">    currentUser = newUser;</w:t>
+              <w:br/>
+              <w:t xml:space="preserve">    const sample = { id: nextApiId++, user_id: newUser.id, name: 'Sample User API', url: 'https://jsonplaceholder.typicode.com/posts/1', method: 'GET', category: 'Public API', calls: '1.0k', trend: '+1%', trendType: 'up', avatarColor: '#0ea5e9', avatarIcon: 'fa-cube', created_at: new Date().toISOString().slice(0, 10), lastStatus: 'Healthy' };</w:t>
+              <w:br/>
+              <w:t xml:space="preserve">    apiList.push(sample);</w:t>
+              <w:br/>
+              <w:t xml:space="preserve">    monitorHistory.unshift({ id: nextHistoryId++, user_id: newUser.id, api_id: sample.id, api_name: sample.name, status_code: 200, response_time: 120, status: 'Healthy', checked_at: new Date().toISOString().slice(0, 19).replace('T', ' ') });</w:t>
+              <w:br/>
+              <w:t xml:space="preserve">    saveStorage(); updateAuthUI(); closeAuthModal();</w:t>
+              <w:br/>
+              <w:t xml:space="preserve">    showToast('success', 'Account Created', `Welcome to API Monitor, ${name}!`);</w:t>
+              <w:br/>
+              <w:t xml:space="preserve">    $('reg-name').value = ''; $('reg-email').value = ''; $('reg-password').value = '';</w:t>
+              <w:br/>
+              <w:t xml:space="preserve">    refreshAllDashboardData();</w:t>
+              <w:br/>
+              <w:t>});</w:t>
+              <w:br/>
+              <w:br/>
+              <w:t>$('btn-logout')?.addEventListener('click', () =&gt; {</w:t>
+              <w:br/>
+              <w:t xml:space="preserve">    $('auth-popover')?.classList.remove('active');</w:t>
+              <w:br/>
+              <w:t xml:space="preserve">    currentUser = null;</w:t>
+              <w:br/>
+              <w:t xml:space="preserve">    saveStorage(); updateAuthUI();</w:t>
+              <w:br/>
+              <w:t xml:space="preserve">    showToast('info', 'Logged Out', 'Signed out. Sign in to access your dashboard.');</w:t>
+              <w:br/>
+              <w:t xml:space="preserve">    refreshAllDashboardData();</w:t>
+              <w:br/>
+              <w:t xml:space="preserve">    openAuthModal('login');</w:t>
+              <w:br/>
+              <w:t>});</w:t>
+              <w:br/>
+              <w:br/>
+              <w:t>function refreshAllDashboardData() {</w:t>
+              <w:br/>
+              <w:t xml:space="preserve">    refreshPageData('dashboard');</w:t>
+              <w:br/>
+              <w:t xml:space="preserve">    renderAPITable();</w:t>
+              <w:br/>
+              <w:t xml:space="preserve">    renderMonitorCards();</w:t>
+              <w:br/>
+              <w:t>}</w:t>
               <w:br/>
               <w:br/>
               <w:t>function navigateTo(page) {</w:t>
@@ -1492,9 +1949,7 @@
               <w:br/>
               <w:t xml:space="preserve">    searchQuery = e.target.value.toLowerCase().trim();</w:t>
               <w:br/>
-              <w:t xml:space="preserve">    renderActivityRows();</w:t>
-              <w:br/>
-              <w:t xml:space="preserve">    renderAPITable();</w:t>
+              <w:t xml:space="preserve">    renderActivityRows(); renderAPITable();</w:t>
               <w:br/>
               <w:t>});</w:t>
               <w:br/>
@@ -1526,11 +1981,7 @@
               <w:br/>
               <w:t xml:space="preserve">    localStorage.setItem('theme', isDark ? 'dark' : 'light');</w:t>
               <w:br/>
-              <w:t xml:space="preserve">    renderDashboardWaveChart();</w:t>
-              <w:br/>
-              <w:t xml:space="preserve">    renderHealthDonutChart();</w:t>
-              <w:br/>
-              <w:t xml:space="preserve">    renderWeeklyBarsChart();</w:t>
+              <w:t xml:space="preserve">    renderDashboardWaveChart(); renderHealthDonutChart(); renderWeeklyBarsChart();</w:t>
               <w:br/>
               <w:t xml:space="preserve">    if (document.querySelector('.page.active')?.id === 'page-analytics') renderAnalyticsCharts();</w:t>
               <w:br/>
@@ -1565,7 +2016,7 @@
               <w:br/>
               <w:t xml:space="preserve">    } else if (page === 'analytics') {</w:t>
               <w:br/>
-              <w:t xml:space="preserve">        populateAnalyticsFilters(); updateAnalyticsStats(); renderAnalyticsCharts();</w:t>
+              <w:t xml:space="preserve">        populateAnalyticsDropdown(); updateAnalyticsStats(); renderAnalyticsCharts();</w:t>
               <w:br/>
               <w:t xml:space="preserve">    }</w:t>
               <w:br/>
@@ -1574,19 +2025,21 @@
               <w:br/>
               <w:t>function updateDashboardMetrics() {</w:t>
               <w:br/>
-              <w:t xml:space="preserve">    const total = apiList.length;</w:t>
-              <w:br/>
-              <w:t xml:space="preserve">    const healthy = apiList.filter(a =&gt; a.lastStatus === 'Healthy').length;</w:t>
-              <w:br/>
-              <w:t xml:space="preserve">    const slow = apiList.filter(a =&gt; a.lastStatus === 'Slow').length;</w:t>
-              <w:br/>
-              <w:t xml:space="preserve">    const failed = apiList.filter(a =&gt; a.lastStatus === 'Failed').length;</w:t>
-              <w:br/>
-              <w:t xml:space="preserve">    const valid = monitorHistory.filter(h =&gt; h.status !== 'Failed' &amp;&amp; h.response_time &gt; 0);</w:t>
+              <w:t xml:space="preserve">    const myApis = getActiveAPIs(), myHist = getActiveHistory();</w:t>
+              <w:br/>
+              <w:t xml:space="preserve">    const total = myApis.length;</w:t>
+              <w:br/>
+              <w:t xml:space="preserve">    const healthy = myApis.filter(a =&gt; a.lastStatus === 'Healthy').length;</w:t>
+              <w:br/>
+              <w:t xml:space="preserve">    const slow = myApis.filter(a =&gt; a.lastStatus === 'Slow').length;</w:t>
+              <w:br/>
+              <w:t xml:space="preserve">    const failed = myApis.filter(a =&gt; a.lastStatus === 'Failed').length;</w:t>
+              <w:br/>
+              <w:t xml:space="preserve">    const valid = myHist.filter(h =&gt; h.status !== 'Failed' &amp;&amp; h.response_time &gt; 0);</w:t>
               <w:br/>
               <w:t xml:space="preserve">    const avg = valid.length ? Math.round(valid.reduce((s, h) =&gt; s + h.response_time, 0) / valid.length) : 142;</w:t>
               <w:br/>
-              <w:t xml:space="preserve">    const uptime = monitorHistory.length ? ((monitorHistory.filter(h =&gt; h.status !== 'Failed').length / monitorHistory.length) * 100).toFixed(1) : '99.8';</w:t>
+              <w:t xml:space="preserve">    const uptime = myHist.length ? ((myHist.filter(h =&gt; h.status !== 'Failed').length / myHist.length) * 100).toFixed(1) : '99.8';</w:t>
               <w:br/>
               <w:br/>
               <w:t xml:space="preserve">    if ($('hero-total-number')) $('hero-total-number').textContent = `${(total * 4.6).toFixed(4)}K`;</w:t>
@@ -1619,7 +2072,7 @@
               <w:br/>
               <w:t xml:space="preserve">    $('tab-endpoint-count') &amp;&amp; ($('tab-endpoint-count').textContent = total);</w:t>
               <w:br/>
-              <w:t xml:space="preserve">    $('alert-counter-badge') &amp;&amp; ($('alert-counter-badge').textContent = failed + slow || 6);</w:t>
+              <w:t xml:space="preserve">    $('alert-counter-badge') &amp;&amp; ($('alert-counter-badge').textContent = failed + slow || 0);</w:t>
               <w:br/>
               <w:t xml:space="preserve">    if ($('latency-progress-fill')) $('latency-progress-fill').style.width = `${Math.min(100, Math.round((avg / 600) * 100))}%`;</w:t>
               <w:br/>
@@ -1634,13 +2087,15 @@
               <w:br/>
               <w:t xml:space="preserve">    if (!wrap) return;</w:t>
               <w:br/>
+              <w:t xml:space="preserve">    const myApis = getActiveAPIs(), myHist = getActiveHistory();</w:t>
+              <w:br/>
               <w:t xml:space="preserve">    let list = [];</w:t>
               <w:br/>
               <w:t xml:space="preserve">    if (currentTab === 'activity') {</w:t>
               <w:br/>
-              <w:t xml:space="preserve">        list = monitorHistory.slice(0, 6).map(h =&gt; {</w:t>
-              <w:br/>
-              <w:t xml:space="preserve">            const a = apiList.find(x =&gt; x.id === h.api_id) || apiList[0];</w:t>
+              <w:t xml:space="preserve">        list = myHist.slice(0, 6).map(h =&gt; {</w:t>
+              <w:br/>
+              <w:t xml:space="preserve">            const a = myApis.find(x =&gt; x.id === h.api_id) || { name: h.api_name, url: 'https://api.domain.com', method: 'GET', avatarColor: '#f59e0b', avatarIcon: 'fa-server', category: 'REST API' };</w:t>
               <w:br/>
               <w:t xml:space="preserve">            return { ...a, metric: h.status === 'Failed' ? 'FAIL' : `${h.response_time}ms`, status: h.status, trendType: h.status === 'Failed' ? 'down' : 'up' };</w:t>
               <w:br/>
@@ -1648,13 +2103,13 @@
               <w:br/>
               <w:t xml:space="preserve">    } else if (currentTab === 'endpoints') {</w:t>
               <w:br/>
-              <w:t xml:space="preserve">        list = apiList.map(a =&gt; ({ ...a, metric: a.calls || '12k', status: a.lastStatus }));</w:t>
+              <w:t xml:space="preserve">        list = myApis.map(a =&gt; ({ ...a, metric: a.calls || '12k', status: a.lastStatus }));</w:t>
               <w:br/>
               <w:t xml:space="preserve">    } else {</w:t>
               <w:br/>
-              <w:t xml:space="preserve">        list = monitorHistory.filter(h =&gt; h.status !== 'Healthy').slice(0, 5).map(h =&gt; {</w:t>
-              <w:br/>
-              <w:t xml:space="preserve">            const a = apiList.find(x =&gt; x.id === h.api_id) || apiList[0];</w:t>
+              <w:t xml:space="preserve">        list = myHist.filter(h =&gt; h.status !== 'Healthy').slice(0, 5).map(h =&gt; {</w:t>
+              <w:br/>
+              <w:t xml:space="preserve">            const a = myApis.find(x =&gt; x.id === h.api_id) || { name: h.api_name, url: 'https://api.domain.com', method: 'GET', avatarColor: '#f59e0b', avatarIcon: 'fa-server', category: 'REST API' };</w:t>
               <w:br/>
               <w:t xml:space="preserve">            return { ...a, metric: `${h.response_time}ms`, status: h.status, trend: h.status === 'Failed' ? 'CRITICAL' : 'SLOW', trendType: 'down' };</w:t>
               <w:br/>
@@ -1662,7 +2117,7 @@
               <w:br/>
               <w:t xml:space="preserve">    }</w:t>
               <w:br/>
-              <w:t xml:space="preserve">    if (searchQuery) list = list.filter(r =&gt; r.name.toLowerCase().includes(searchQuery) || r.url.toLowerCase().includes(searchQuery));</w:t>
+              <w:t xml:space="preserve">    if (searchQuery) list = list.filter(r =&gt; r.name.toLowerCase().includes(searchQuery) || (r.url &amp;&amp; r.url.toLowerCase().includes(searchQuery)));</w:t>
               <w:br/>
               <w:t xml:space="preserve">    if (!list.length) return wrap.innerHTML = `&lt;div class="empty-state" style="padding:24px"&gt;&lt;i class="fas fa-search"&gt;&lt;/i&gt;&lt;p&gt;No records found&lt;/p&gt;&lt;/div&gt;`;</w:t>
               <w:br/>
@@ -1743,19 +2198,21 @@
               <w:br/>
               <w:t xml:space="preserve">    if (charts.donut) charts.donut.destroy();</w:t>
               <w:br/>
-              <w:t xml:space="preserve">    const h = apiList.filter(a =&gt; a.lastStatus === 'Healthy').length || 4;</w:t>
-              <w:br/>
-              <w:t xml:space="preserve">    const s = apiList.filter(a =&gt; a.lastStatus === 'Slow').length || 1;</w:t>
-              <w:br/>
-              <w:t xml:space="preserve">    const f = apiList.filter(a =&gt; a.lastStatus === 'Failed').length || 1;</w:t>
+              <w:t xml:space="preserve">    const myApis = getActiveAPIs();</w:t>
+              <w:br/>
+              <w:t xml:space="preserve">    const healthy = myApis.filter(a =&gt; a.lastStatus === 'Healthy').length || 4;</w:t>
+              <w:br/>
+              <w:t xml:space="preserve">    const slow = myApis.filter(a =&gt; a.lastStatus === 'Slow').length || 1;</w:t>
+              <w:br/>
+              <w:t xml:space="preserve">    const failed = myApis.filter(a =&gt; a.lastStatus === 'Failed').length || 1;</w:t>
               <w:br/>
               <w:t xml:space="preserve">    charts.donut = new Chart(c, {</w:t>
               <w:br/>
               <w:t xml:space="preserve">        type: 'doughnut',</w:t>
               <w:br/>
-              <w:t xml:space="preserve">        data: { labels: ['Healthy', 'Slow', 'Failed'], datasets: [{ data: [h, s, f], backgroundColor: ['#ff5e62', '#f59e0b', document.body.classList.contains('dark-mode') ? '#fff' : '#0f121d'], borderWidth: 0, borderRadius: 8 }] },</w:t>
-              <w:br/>
-              <w:t xml:space="preserve">        options: { responsive: true, maintainAspectRatio: false, cutout: '72%', plugins: { legend: { display: false } } }</w:t>
+              <w:t xml:space="preserve">        data: { datasets: [{ data: [healthy, slow, failed], backgroundColor: ['#ff5e62', '#f59e0b', document.body.classList.contains('dark-mode') ? '#ffffff' : '#0f121d'], borderWidth: 0 }] },</w:t>
+              <w:br/>
+              <w:t xml:space="preserve">        options: { cutout: '76%', responsive: true, maintainAspectRatio: false, plugins: { legend: { display: false } } }</w:t>
               <w:br/>
               <w:t xml:space="preserve">    });</w:t>
               <w:br/>
@@ -1770,328 +2227,403 @@
               <w:br/>
               <w:t xml:space="preserve">    if (charts.weekly) charts.weekly.destroy();</w:t>
               <w:br/>
+              <w:t xml:space="preserve">    charts.weekly = new Chart(c, {</w:t>
+              <w:br/>
+              <w:t xml:space="preserve">        type: 'bar',</w:t>
+              <w:br/>
+              <w:t xml:space="preserve">        data: { labels: ['M', 'T', 'W', 'T', 'F', 'S', 'S'], datasets: [{ data: [65, 80, 55, 90, 70, 45, 85], backgroundColor: '#ff5e62', borderRadius: 4 }] },</w:t>
+              <w:br/>
+              <w:t xml:space="preserve">        options: { responsive: true, maintainAspectRatio: false, plugins: { legend: { display: false } }, scales: { x: { grid: { display: false } }, y: { display: false } } }</w:t>
+              <w:br/>
+              <w:t xml:space="preserve">    });</w:t>
+              <w:br/>
+              <w:t>}</w:t>
+              <w:br/>
+              <w:br/>
+              <w:t>function recordCheckResult(api, code, time, st) {</w:t>
+              <w:br/>
+              <w:t xml:space="preserve">    monitorHistory.unshift({ id: nextHistoryId++, user_id: api.user_id, api_id: api.id, api_name: api.name, status_code: code, response_time: time, status: st, checked_at: new Date().toISOString().slice(0, 19).replace('T', ' ') });</w:t>
+              <w:br/>
+              <w:t xml:space="preserve">    api.lastStatus = st;</w:t>
+              <w:br/>
+              <w:t xml:space="preserve">    saveStorage();</w:t>
+              <w:br/>
+              <w:t xml:space="preserve">    showToast(st === 'Healthy' ? 'success' : (st === 'Slow' ? 'warning' : 'error'), `Status: ${st}`, `${api.name} responded in ${time}ms`);</w:t>
+              <w:br/>
+              <w:t xml:space="preserve">    refreshPageData('dashboard'); renderAPITable(); renderMonitorCards();</w:t>
+              <w:br/>
+              <w:t>}</w:t>
+              <w:br/>
+              <w:br/>
+              <w:t>function checkSingleAPI(apiId) {</w:t>
+              <w:br/>
+              <w:t xml:space="preserve">    const api = apiList.find(a =&gt; a.id === apiId);</w:t>
+              <w:br/>
+              <w:t xml:space="preserve">    if (!api) return;</w:t>
+              <w:br/>
+              <w:t xml:space="preserve">    showToast('info', 'Pinging Endpoint', `Connecting to ${api.name}...`);</w:t>
+              <w:br/>
+              <w:t xml:space="preserve">    const t0 = performance.now();</w:t>
+              <w:br/>
+              <w:t xml:space="preserve">    const ctrl = new AbortController();</w:t>
+              <w:br/>
+              <w:t xml:space="preserve">    const timer = setTimeout(() =&gt; ctrl.abort(), 5000);</w:t>
+              <w:br/>
+              <w:t xml:space="preserve">    fetch(api.url, { method: 'HEAD', mode: 'no-cors', signal: ctrl.signal, cache: 'no-cache' })</w:t>
+              <w:br/>
+              <w:t xml:space="preserve">        .then(() =&gt; {</w:t>
+              <w:br/>
+              <w:t xml:space="preserve">            clearTimeout(timer);</w:t>
+              <w:br/>
+              <w:t xml:space="preserve">            const ms = Math.round(performance.now() - t0);</w:t>
+              <w:br/>
+              <w:t xml:space="preserve">            recordCheckResult(api, 200, ms, ms &lt; 500 ? 'Healthy' : 'Slow');</w:t>
+              <w:br/>
+              <w:t xml:space="preserve">        })</w:t>
+              <w:br/>
+              <w:t xml:space="preserve">        .catch(() =&gt; {</w:t>
+              <w:br/>
+              <w:t xml:space="preserve">            clearTimeout(timer);</w:t>
+              <w:br/>
+              <w:t xml:space="preserve">            const ms = Math.round(performance.now() - t0);</w:t>
+              <w:br/>
+              <w:t xml:space="preserve">            if (ms &lt; 5000) recordCheckResult(api, 200, Math.max(18, ms), ms &lt; 600 ? 'Healthy' : 'Slow');</w:t>
+              <w:br/>
+              <w:t xml:space="preserve">            else recordCheckResult(api, 0, 0, 'Failed');</w:t>
+              <w:br/>
+              <w:t xml:space="preserve">        });</w:t>
+              <w:br/>
+              <w:t>}</w:t>
+              <w:br/>
+              <w:br/>
+              <w:t>function checkAllAPIs() {</w:t>
+              <w:br/>
+              <w:t xml:space="preserve">    const myApis = getActiveAPIs();</w:t>
+              <w:br/>
+              <w:t xml:space="preserve">    if (!myApis.length) return showToast('info', 'Notice', 'No APIs registered for active account.');</w:t>
+              <w:br/>
+              <w:t xml:space="preserve">    showToast('info', 'Diagnostic Run', `Pinging ${myApis.length} APIs...`);</w:t>
+              <w:br/>
+              <w:t xml:space="preserve">    myApis.forEach((a, idx) =&gt; setTimeout(() =&gt; checkSingleAPI(a.id), idx * 400));</w:t>
+              <w:br/>
+              <w:t>}</w:t>
+              <w:br/>
+              <w:t>$('btn-check-all-dashboard')?.addEventListener('click', checkAllAPIs);</w:t>
+              <w:br/>
+              <w:t>$('btn-check-all-monitor')?.addEventListener('click', checkAllAPIs);</w:t>
+              <w:br/>
+              <w:br/>
+              <w:t>$('api-form')?.addEventListener('submit', (e) =&gt; {</w:t>
+              <w:br/>
+              <w:t xml:space="preserve">    e.preventDefault();</w:t>
+              <w:br/>
+              <w:t xml:space="preserve">    if (!currentUser) return showToast('error', 'Auth Required', 'Please sign in to register APIs.');</w:t>
+              <w:br/>
+              <w:t xml:space="preserve">    const name = $('api-name').value.trim(), url = $('api-url').value.trim(), method = $('api-method').value;</w:t>
+              <w:br/>
+              <w:t xml:space="preserve">    if (!name || !url) return showToast('error', 'Error', 'Name and URL are required.');</w:t>
+              <w:br/>
+              <w:t xml:space="preserve">    const newApi = { id: nextApiId++, user_id: currentUser.id, name, url, method, category: 'Custom API', calls: '1.0k', trend: '+1%', trendType: 'up', avatarColor: '#0ea5e9', avatarIcon: 'fa-cube', created_at: new Date().toISOString().slice(0, 10), lastStatus: 'Healthy' };</w:t>
+              <w:br/>
+              <w:t xml:space="preserve">    apiList.push(newApi);</w:t>
+              <w:br/>
+              <w:t xml:space="preserve">    saveStorage();</w:t>
+              <w:br/>
+              <w:t xml:space="preserve">    $('api-name').value = ''; $('api-url').value = '';</w:t>
+              <w:br/>
+              <w:t xml:space="preserve">    showToast('success', 'Added', `"${name}" registered.`);</w:t>
+              <w:br/>
+              <w:t xml:space="preserve">    renderAPITable(); updateDashboardMetrics();</w:t>
+              <w:br/>
+              <w:t xml:space="preserve">    setTimeout(() =&gt; checkSingleAPI(newApi.id), 250);</w:t>
+              <w:br/>
+              <w:t>});</w:t>
+              <w:br/>
+              <w:br/>
+              <w:t>function renderAPITable() {</w:t>
+              <w:br/>
+              <w:t xml:space="preserve">    const tbody = $('api-table-body'), count = $('api-count-badge');</w:t>
+              <w:br/>
+              <w:t xml:space="preserve">    if (!tbody) return;</w:t>
+              <w:br/>
+              <w:t xml:space="preserve">    const myApis = getActiveAPIs();</w:t>
+              <w:br/>
+              <w:t xml:space="preserve">    if (count) count.textContent = `${myApis.length} APIs`;</w:t>
+              <w:br/>
+              <w:t xml:space="preserve">    let list = searchQuery ? myApis.filter(a =&gt; a.name.toLowerCase().includes(searchQuery) || a.url.toLowerCase().includes(searchQuery)) : myApis;</w:t>
+              <w:br/>
+              <w:t xml:space="preserve">    if (!list.length) return tbody.innerHTML = `&lt;tr&gt;&lt;td colspan="7" style="text-align:center;padding:32px;color:var(--text-muted)"&gt;No registered endpoints for this account.&lt;/td&gt;&lt;/tr&gt;`;</w:t>
+              <w:br/>
+              <w:t xml:space="preserve">    tbody.innerHTML = list.map((a, i) =&gt; `</w:t>
+              <w:br/>
+              <w:t xml:space="preserve">        &lt;tr&gt;&lt;td&gt;&lt;strong&gt;0${i+1}&lt;/strong&gt;&lt;/td&gt;&lt;td&gt;&lt;strong&gt;${escapeHtml(a.name)}&lt;/strong&gt;&lt;/td&gt;&lt;td class="url-cell"&gt;${escapeHtml(a.url)}&lt;/td&gt;&lt;td&gt;&lt;span class="api-method-badge ${a.method}"&gt;${a.method}&lt;/span&gt;&lt;/td&gt;&lt;td&gt;&lt;span class="status-badge ${(a.lastStatus||'pending').toLowerCase()}"&gt;${a.lastStatus||'Pending'}&lt;/span&gt;&lt;/td&gt;&lt;td&gt;${a.created_at}&lt;/td&gt;</w:t>
+              <w:br/>
+              <w:t xml:space="preserve">        &lt;td&gt;&lt;div class="action-btns"&gt;&lt;button class="action-btn check" onclick="checkSingleAPI(${a.id})"&gt;&lt;i class="fas fa-play"&gt;&lt;/i&gt;&lt;/button&gt;&lt;button class="action-btn delete" onclick="confirmDeleteAPI(${a.id})"&gt;&lt;i class="fas fa-trash-alt"&gt;&lt;/i&gt;&lt;/button&gt;&lt;/div&gt;&lt;/td&gt;&lt;/tr&gt;</w:t>
+              <w:br/>
+              <w:t xml:space="preserve">    `).join('');</w:t>
+              <w:br/>
+              <w:t>}</w:t>
+              <w:br/>
+              <w:br/>
+              <w:t>function confirmDeleteAPI(id) {</w:t>
+              <w:br/>
+              <w:t xml:space="preserve">    pendingDeleteId = id;</w:t>
+              <w:br/>
+              <w:t xml:space="preserve">    $('modal-message').textContent = `Remove "${apiList.find(a=&gt;a.id===id)?.name}"?`;</w:t>
+              <w:br/>
+              <w:t xml:space="preserve">    $('confirm-modal')?.classList.add('active');</w:t>
+              <w:br/>
+              <w:t>}</w:t>
+              <w:br/>
+              <w:t>$('modal-confirm')?.addEventListener('click', () =&gt; {</w:t>
+              <w:br/>
+              <w:t xml:space="preserve">    if (pendingDeleteId !== null) {</w:t>
+              <w:br/>
+              <w:t xml:space="preserve">        apiList = apiList.filter(a =&gt; a.id !== pendingDeleteId);</w:t>
+              <w:br/>
+              <w:t xml:space="preserve">        monitorHistory = monitorHistory.filter(h =&gt; h.api_id !== pendingDeleteId);</w:t>
+              <w:br/>
+              <w:t xml:space="preserve">        saveStorage();</w:t>
+              <w:br/>
+              <w:t xml:space="preserve">        pendingDeleteId = null;</w:t>
+              <w:br/>
+              <w:t xml:space="preserve">        renderAPITable(); updateDashboardMetrics(); renderActivityRows();</w:t>
+              <w:br/>
+              <w:t xml:space="preserve">        showToast('success', 'Deleted', 'API removed.');</w:t>
+              <w:br/>
+              <w:t xml:space="preserve">    }</w:t>
+              <w:br/>
+              <w:t xml:space="preserve">    $('confirm-modal')?.classList.remove('active');</w:t>
+              <w:br/>
+              <w:t>});</w:t>
+              <w:br/>
+              <w:t>$('modal-cancel')?.addEventListener('click', () =&gt; $('confirm-modal')?.classList.remove('active'));</w:t>
+              <w:br/>
+              <w:t>$('modal-close')?.addEventListener('click', () =&gt; $('confirm-modal')?.classList.remove('active'));</w:t>
+              <w:br/>
+              <w:br/>
+              <w:t>function renderMonitorCards() {</w:t>
+              <w:br/>
+              <w:t xml:space="preserve">    const g = $('monitor-grid');</w:t>
+              <w:br/>
+              <w:t xml:space="preserve">    if (!g) return;</w:t>
+              <w:br/>
+              <w:t xml:space="preserve">    const myApis = getActiveAPIs(), myHist = getActiveHistory();</w:t>
+              <w:br/>
+              <w:t xml:space="preserve">    if (!myApis.length) return g.innerHTML = `&lt;div class="empty-state" style="grid-column:1/-1;padding:48px"&gt;&lt;i class="fas fa-server"&gt;&lt;/i&gt;&lt;p&gt;No endpoints to monitor. Add one in API Management!&lt;/p&gt;&lt;/div&gt;`;</w:t>
+              <w:br/>
+              <w:t xml:space="preserve">    g.innerHTML = myApis.map(a =&gt; {</w:t>
+              <w:br/>
+              <w:t xml:space="preserve">        const last = myHist.find(h =&gt; h.api_id === a.id);</w:t>
+              <w:br/>
+              <w:t xml:space="preserve">        return `</w:t>
+              <w:br/>
+              <w:t xml:space="preserve">            &lt;div class="monitor-card ${(a.lastStatus||'pending').toLowerCase()}"&gt;</w:t>
+              <w:br/>
+              <w:t xml:space="preserve">                &lt;div class="monitor-card-header"&gt;&lt;div class="monitor-api-info"&gt;&lt;span class="api-method-badge ${a.method}"&gt;${a.method}&lt;/span&gt;&lt;span class="monitor-api-name"&gt;${escapeHtml(a.name)}&lt;/span&gt;&lt;/div&gt;&lt;span class="status-badge ${(a.lastStatus||'pending').toLowerCase()}"&gt;${a.lastStatus||'Pending'}&lt;/span&gt;&lt;/div&gt;</w:t>
+              <w:br/>
+              <w:t xml:space="preserve">                &lt;div class="monitor-card-body"&gt;&lt;div class="monitor-metrics"&gt;&lt;div&gt;&lt;span class="monitor-metric-label"&gt;Latency&lt;/span&gt;&lt;div class="monitor-metric-value"&gt;${last ? last.response_time + 'ms' : '—'}&lt;/div&gt;&lt;/div&gt;&lt;div&gt;&lt;span class="monitor-metric-label"&gt;Code&lt;/span&gt;&lt;div class="monitor-metric-value"&gt;${last ? last.status_code : '200'}&lt;/div&gt;&lt;/div&gt;&lt;/div&gt;</w:t>
+              <w:br/>
+              <w:t xml:space="preserve">                &lt;div class="monitor-card-actions"&gt;&lt;button class="btn btn-primary btn-sm" onclick="checkSingleAPI(${a.id})"&gt;&lt;i class="fas fa-play"&gt;&lt;/i&gt; Ping&lt;/button&gt;&lt;/div&gt;&lt;/div&gt;</w:t>
+              <w:br/>
+              <w:t xml:space="preserve">            &lt;/div&gt;`;</w:t>
+              <w:br/>
+              <w:t xml:space="preserve">    }).join('');</w:t>
+              <w:br/>
+              <w:t>}</w:t>
+              <w:br/>
+              <w:br/>
+              <w:t>function populateHistoryFilters() {</w:t>
+              <w:br/>
+              <w:t xml:space="preserve">    const f = $('history-api-filter'), myApis = getActiveAPIs();</w:t>
+              <w:br/>
+              <w:t xml:space="preserve">    if (f) f.innerHTML = '&lt;option value="all"&gt;All APIs&lt;/option&gt;' + myApis.map(a =&gt; `&lt;option value="${a.id}"&gt;${escapeHtml(a.name)}&lt;/option&gt;`).join('');</w:t>
+              <w:br/>
+              <w:t>}</w:t>
+              <w:br/>
+              <w:br/>
+              <w:t>function renderHistoryTable() {</w:t>
+              <w:br/>
+              <w:t xml:space="preserve">    const tbody = $('history-table-body'), apiF = $('history-api-filter')?.value || 'all', stF = $('history-status-filter')?.value || 'all';</w:t>
+              <w:br/>
+              <w:t xml:space="preserve">    if (!tbody) return;</w:t>
+              <w:br/>
+              <w:t xml:space="preserve">    const myHist = getActiveHistory();</w:t>
+              <w:br/>
+              <w:t xml:space="preserve">    let list = myHist.filter(h =&gt; (apiF === 'all' || h.api_id.toString() === apiF) &amp;&amp; (stF === 'all' || h.status === stF));</w:t>
+              <w:br/>
+              <w:t xml:space="preserve">    if (!list.length) return tbody.innerHTML = `&lt;tr&gt;&lt;td colspan="6" style="text-align:center;padding:32px;color:var(--text-muted)"&gt;No diagnostic logs available for this filter.&lt;/td&gt;&lt;/tr&gt;`;</w:t>
+              <w:br/>
+              <w:t xml:space="preserve">    tbody.innerHTML = list.map((h, i) =&gt; `</w:t>
+              <w:br/>
+              <w:t xml:space="preserve">        &lt;tr&gt;&lt;td&gt;0${i+1}&lt;/td&gt;&lt;td&gt;&lt;strong&gt;${escapeHtml(h.api_name)}&lt;/strong&gt;&lt;/td&gt;&lt;td&gt;${h.status_code}&lt;/td&gt;&lt;td style="font-weight:700"&gt;${h.response_time}ms&lt;/td&gt;&lt;td&gt;&lt;span class="status-badge ${h.status.toLowerCase()}"&gt;${h.status}&lt;/span&gt;&lt;/td&gt;&lt;td&gt;${h.checked_at}&lt;/td&gt;&lt;/tr&gt;</w:t>
+              <w:br/>
+              <w:t xml:space="preserve">    `).join('');</w:t>
+              <w:br/>
+              <w:t>}</w:t>
+              <w:br/>
+              <w:t>$('history-api-filter')?.addEventListener('change', renderHistoryTable);</w:t>
+              <w:br/>
+              <w:t>$('history-status-filter')?.addEventListener('change', renderHistoryTable);</w:t>
+              <w:br/>
+              <w:br/>
+              <w:t>function populateAnalyticsDropdown() {</w:t>
+              <w:br/>
+              <w:t xml:space="preserve">    const menu = $('analytics-dropdown-menu');</w:t>
+              <w:br/>
+              <w:t xml:space="preserve">    if (!menu) return;</w:t>
+              <w:br/>
+              <w:t xml:space="preserve">    const myApis = getActiveAPIs(), currentVal = $('analytics-api-filter')?.value || 'all';</w:t>
+              <w:br/>
+              <w:t xml:space="preserve">    let html = `&lt;div class="custom-dropdown-item ${currentVal === 'all' ? 'active' : ''}" onclick="selectAnalyticsFilter('all', 'All APIs')"&gt;</w:t>
+              <w:br/>
+              <w:t xml:space="preserve">        &lt;div class="item-left"&gt;&lt;i class="fas fa-layer-group" style="color:var(--coral-primary)"&gt;&lt;/i&gt;&lt;span&gt;All APIs&lt;/span&gt;&lt;/div&gt;</w:t>
+              <w:br/>
+              <w:t xml:space="preserve">        ${currentVal === 'all' ? '&lt;i class="fas fa-check"&gt;&lt;/i&gt;' : ''}</w:t>
+              <w:br/>
+              <w:t xml:space="preserve">    &lt;/div&gt;`;</w:t>
+              <w:br/>
+              <w:t xml:space="preserve">    myApis.forEach(a =&gt; {</w:t>
+              <w:br/>
+              <w:t xml:space="preserve">        const isSel = currentVal === a.id.toString();</w:t>
+              <w:br/>
+              <w:t xml:space="preserve">        const dotColor = a.lastStatus === 'Healthy' ? 'var(--healthy)' : (a.lastStatus === 'Slow' ? 'var(--slow)' : 'var(--failed)');</w:t>
+              <w:br/>
+              <w:t xml:space="preserve">        html += `&lt;div class="custom-dropdown-item ${isSel ? 'active' : ''}" onclick="selectAnalyticsFilter('${a.id}', '${escapeHtml(a.name)}')"&gt;</w:t>
+              <w:br/>
+              <w:t xml:space="preserve">            &lt;div class="item-left"&gt;&lt;span style="width:8px;height:8px;border-radius:50%;background:${dotColor}"&gt;&lt;/span&gt;&lt;span&gt;${escapeHtml(a.name)}&lt;/span&gt;&lt;/div&gt;</w:t>
+              <w:br/>
+              <w:t xml:space="preserve">            ${isSel ? '&lt;i class="fas fa-check"&gt;&lt;/i&gt;' : ''}</w:t>
+              <w:br/>
+              <w:t xml:space="preserve">        &lt;/div&gt;`;</w:t>
+              <w:br/>
+              <w:t xml:space="preserve">    });</w:t>
+              <w:br/>
+              <w:t xml:space="preserve">    menu.innerHTML = html;</w:t>
+              <w:br/>
+              <w:t>}</w:t>
+              <w:br/>
+              <w:br/>
+              <w:t>function selectAnalyticsFilter(val, label) {</w:t>
+              <w:br/>
+              <w:t xml:space="preserve">    if ($('analytics-api-filter')) $('analytics-api-filter').value = val;</w:t>
+              <w:br/>
+              <w:t xml:space="preserve">    if ($('analytics-dropdown-label')) $('analytics-dropdown-label').textContent = label;</w:t>
+              <w:br/>
+              <w:t xml:space="preserve">    $('analytics-dropdown-wrap')?.classList.remove('open');</w:t>
+              <w:br/>
+              <w:t xml:space="preserve">    populateAnalyticsDropdown(); updateAnalyticsStats(); renderAnalyticsCharts();</w:t>
+              <w:br/>
+              <w:t>}</w:t>
+              <w:br/>
+              <w:t>window.selectAnalyticsFilter = selectAnalyticsFilter;</w:t>
+              <w:br/>
+              <w:br/>
+              <w:t>$('analytics-dropdown-btn')?.addEventListener('click', (e) =&gt; {</w:t>
+              <w:br/>
+              <w:t xml:space="preserve">    e.stopPropagation();</w:t>
+              <w:br/>
+              <w:t xml:space="preserve">    $('analytics-dropdown-wrap')?.classList.toggle('open');</w:t>
+              <w:br/>
+              <w:t>});</w:t>
+              <w:br/>
+              <w:br/>
+              <w:t>document.addEventListener('click', (e) =&gt; {</w:t>
+              <w:br/>
+              <w:t xml:space="preserve">    if (!$('analytics-dropdown-wrap')?.contains(e.target)) $('analytics-dropdown-wrap')?.classList.remove('open');</w:t>
+              <w:br/>
+              <w:t xml:space="preserve">    if (!$('auth-wrap')?.contains(e.target) &amp;&amp; !$('mobile-auth-btn')?.contains(e.target)) $('auth-popover')?.classList.remove('active');</w:t>
+              <w:br/>
+              <w:t>});</w:t>
+              <w:br/>
+              <w:br/>
+              <w:t>function updateAnalyticsStats() {</w:t>
+              <w:br/>
+              <w:t xml:space="preserve">    const f = $('analytics-api-filter')?.value || 'all', myHist = getActiveHistory();</w:t>
+              <w:br/>
+              <w:t xml:space="preserve">    const d = f === 'all' ? myHist : myHist.filter(h =&gt; h.api_id.toString() === f);</w:t>
+              <w:br/>
+              <w:t xml:space="preserve">    const valid = d.filter(h =&gt; h.status !== 'Failed');</w:t>
+              <w:br/>
+              <w:t xml:space="preserve">    $('analytics-avg-response') &amp;&amp; ($('analytics-avg-response').textContent = `${valid.length ? Math.round(valid.reduce((s, h) =&gt; s + h.response_time, 0) / valid.length) : 0} ms`);</w:t>
+              <w:br/>
+              <w:t xml:space="preserve">    $('analytics-success-count') &amp;&amp; ($('analytics-success-count').textContent = valid.length);</w:t>
+              <w:br/>
+              <w:t xml:space="preserve">    $('analytics-fail-count') &amp;&amp; ($('analytics-fail-count').textContent = d.length - valid.length);</w:t>
+              <w:br/>
+              <w:t xml:space="preserve">    $('analytics-slowest') &amp;&amp; ($('analytics-slowest').textContent = `${valid.length ? Math.max(...valid.map(h =&gt; h.response_time)) : 0} ms`);</w:t>
+              <w:br/>
+              <w:t>}</w:t>
+              <w:br/>
+              <w:br/>
+              <w:t>function renderAnalyticsCharts() {</w:t>
+              <w:br/>
               <w:t xml:space="preserve">    const isDark = document.body.classList.contains('dark-mode');</w:t>
               <w:br/>
-              <w:t xml:space="preserve">    const bColor = isDark ? 'rgba(255,255,255,0.12)' : '#e5dfd5';</w:t>
-              <w:br/>
-              <w:t xml:space="preserve">    charts.weekly = new Chart(c, {</w:t>
-              <w:br/>
-              <w:t xml:space="preserve">        data: {</w:t>
-              <w:br/>
-              <w:t xml:space="preserve">            labels: ['M', 'T', 'W', 'T', 'F', 'S', 'S'],</w:t>
-              <w:br/>
-              <w:t xml:space="preserve">            datasets: [</w:t>
-              <w:br/>
-              <w:t xml:space="preserve">                { type: 'line', data: [120, 160, 130, 240, 150, 180, 210], borderColor: isDark ? '#fff' : '#0f121d', borderWidth: 2, tension: 0.45, pointRadius: [0, 0, 0, 5, 0, 0, 0], pointBackgroundColor: '#ff5e62', order: 1 },</w:t>
-              <w:br/>
-              <w:t xml:space="preserve">                { type: 'bar', data: [140, 180, 150, 280, 170, 200, 230], backgroundColor: [bColor, bColor, bColor, '#ff5e62', bColor, bColor, bColor], borderRadius: 16, barThickness: 16, order: 2 }</w:t>
-              <w:br/>
-              <w:t xml:space="preserve">            ]</w:t>
-              <w:br/>
-              <w:t xml:space="preserve">        },</w:t>
-              <w:br/>
-              <w:t xml:space="preserve">        options: { responsive: true, maintainAspectRatio: false, plugins: { legend: { display: false } }, scales: { x: { grid: { display: false }, ticks: { color: isDark ? '#7d849b' : '#9599b0' } }, y: { display: false } } }</w:t>
-              <w:br/>
-              <w:t xml:space="preserve">    });</w:t>
+              <w:t xml:space="preserve">    const c1 = $('response-time-chart'), c2 = $('success-fail-chart'), c3 = $('api-comparison-chart');</w:t>
+              <w:br/>
+              <w:t xml:space="preserve">    const myApis = getActiveAPIs(), myHist = getActiveHistory();</w:t>
+              <w:br/>
+              <w:t xml:space="preserve">    const f = $('analytics-api-filter')?.value || 'all';</w:t>
+              <w:br/>
+              <w:t xml:space="preserve">    const d = f === 'all' ? myHist : myHist.filter(h =&gt; h.api_id.toString() === f);</w:t>
+              <w:br/>
+              <w:t xml:space="preserve">    if (c1) {</w:t>
+              <w:br/>
+              <w:t xml:space="preserve">        if (charts.resp) charts.resp.destroy();</w:t>
+              <w:br/>
+              <w:t xml:space="preserve">        charts.resp = new Chart(c1, { type: 'bar', data: { labels: d.slice(0, 10).map(h =&gt; h.api_name.slice(0, 8)), datasets: [{ label: 'ms', data: d.slice(0, 10).map(h =&gt; h.response_time), backgroundColor: '#10b981', borderRadius: 6 }] }, options: { responsive: true, maintainAspectRatio: false } });</w:t>
+              <w:br/>
+              <w:t xml:space="preserve">    }</w:t>
+              <w:br/>
+              <w:t xml:space="preserve">    if (c2) {</w:t>
+              <w:br/>
+              <w:t xml:space="preserve">        if (charts.dough) charts.dough.destroy();</w:t>
+              <w:br/>
+              <w:t xml:space="preserve">        const healthy = d.filter(h =&gt; h.status === 'Healthy').length || (myApis.length ? 1 : 0);</w:t>
+              <w:br/>
+              <w:t xml:space="preserve">        const slow = d.filter(h =&gt; h.status === 'Slow').length;</w:t>
+              <w:br/>
+              <w:t xml:space="preserve">        const failed = d.filter(h =&gt; h.status === 'Failed').length;</w:t>
+              <w:br/>
+              <w:t xml:space="preserve">        charts.dough = new Chart(c2, { type: 'doughnut', data: { labels: ['Healthy', 'Slow', 'Failed'], datasets: [{ data: [healthy, slow, failed], backgroundColor: ['#10b981', '#f59e0b', '#ef4444'] }] }, options: { responsive: true, maintainAspectRatio: false } });</w:t>
+              <w:br/>
+              <w:t xml:space="preserve">    }</w:t>
+              <w:br/>
+              <w:t xml:space="preserve">    if (c3) {</w:t>
+              <w:br/>
+              <w:t xml:space="preserve">        if (charts.bar) charts.bar.destroy();</w:t>
+              <w:br/>
+              <w:t xml:space="preserve">        charts.bar = new Chart(c3, { type: 'bar', data: { labels: myApis.map(a =&gt; a.name.slice(0, 10)), datasets: [{ label: 'Avg ms', data: myApis.map(a =&gt; { const v = myHist.filter(h =&gt; h.api_id === a.id &amp;&amp; h.status !== 'Failed'); return v.length ? Math.round(v.reduce((s, x) =&gt; s + x.response_time, 0) / v.length) : 150; }), backgroundColor: '#ff5e62', borderRadius: 6 }] }, options: { indexAxis: 'y', responsive: true, maintainAspectRatio: false } });</w:t>
+              <w:br/>
+              <w:t xml:space="preserve">    }</w:t>
               <w:br/>
               <w:t>}</w:t>
               <w:br/>
               <w:br/>
-              <w:t>function recordCheckResult(api, code, time, st) {</w:t>
-              <w:br/>
-              <w:t xml:space="preserve">    monitorHistory.unshift({ id: nextHistoryId++, api_id: api.id, api_name: api.name, status_code: code, response_time: time, status: st, checked_at: new Date().toISOString().slice(0, 19).replace('T', ' ') });</w:t>
-              <w:br/>
-              <w:t xml:space="preserve">    api.lastStatus = st;</w:t>
-              <w:br/>
-              <w:t xml:space="preserve">    saveStorage();</w:t>
-              <w:br/>
-              <w:t xml:space="preserve">    showToast(st === 'Healthy' ? 'success' : (st === 'Slow' ? 'warning' : 'error'), `Status: ${st}`, `${api.name} responded in ${time}ms`);</w:t>
-              <w:br/>
-              <w:t xml:space="preserve">    refreshPageData('dashboard'); renderAPITable(); renderMonitorCards();</w:t>
+              <w:t>function showToast(type, title, msg) {</w:t>
+              <w:br/>
+              <w:t xml:space="preserve">    const t = document.createElement('div');</w:t>
+              <w:br/>
+              <w:t xml:space="preserve">    t.className = `toast ${type}`;</w:t>
+              <w:br/>
+              <w:t xml:space="preserve">    t.innerHTML = `&lt;div style="font-weight:700"&gt;${title}&lt;/div&gt;&lt;div style="font-size:0.8rem;color:var(--text-secondary)"&gt;${msg}&lt;/div&gt;`;</w:t>
+              <w:br/>
+              <w:t xml:space="preserve">    $('toast-container')?.appendChild(t);</w:t>
+              <w:br/>
+              <w:t xml:space="preserve">    setTimeout(() =&gt; { t.classList.add('removing'); setTimeout(() =&gt; t.remove(), 250); }, 3000);</w:t>
               <w:br/>
               <w:t>}</w:t>
               <w:br/>
               <w:br/>
-              <w:t>function checkSingleAPI(apiId) {</w:t>
-              <w:br/>
-              <w:t xml:space="preserve">    const api = apiList.find(a =&gt; a.id === apiId);</w:t>
-              <w:br/>
-              <w:t xml:space="preserve">    if (!api) return;</w:t>
-              <w:br/>
-              <w:t xml:space="preserve">    showToast('info', 'Pinging Endpoint', `Connecting to ${api.name}...`);</w:t>
-              <w:br/>
-              <w:t xml:space="preserve">    const t0 = performance.now();</w:t>
-              <w:br/>
-              <w:t xml:space="preserve">    const ctrl = new AbortController();</w:t>
-              <w:br/>
-              <w:t xml:space="preserve">    const timer = setTimeout(() =&gt; ctrl.abort(), 5000);</w:t>
-              <w:br/>
-              <w:t xml:space="preserve">    fetch(api.url, { method: api.method || 'GET', signal: ctrl.signal, mode: 'no-cors' })</w:t>
-              <w:br/>
-              <w:t xml:space="preserve">        .then(res =&gt; {</w:t>
-              <w:br/>
-              <w:t xml:space="preserve">            clearTimeout(timer);</w:t>
-              <w:br/>
-              <w:t xml:space="preserve">            const time = Math.max(12, Math.round(performance.now() - t0));</w:t>
-              <w:br/>
-              <w:t xml:space="preserve">            const code = res.status || 200;</w:t>
-              <w:br/>
-              <w:t xml:space="preserve">            const st = time &lt; 500 ? 'Healthy' : 'Slow';</w:t>
-              <w:br/>
-              <w:t xml:space="preserve">            recordCheckResult(api, code, time, st);</w:t>
-              <w:br/>
-              <w:t xml:space="preserve">        })</w:t>
-              <w:br/>
-              <w:t xml:space="preserve">        .catch(() =&gt; {</w:t>
-              <w:br/>
-              <w:t xml:space="preserve">            clearTimeout(timer);</w:t>
-              <w:br/>
-              <w:t xml:space="preserve">            recordCheckResult(api, 0, 0, 'Failed');</w:t>
-              <w:br/>
-              <w:t xml:space="preserve">        });</w:t>
-              <w:br/>
-              <w:t>}</w:t>
-              <w:br/>
-              <w:br/>
-              <w:t>function checkAllAPIs() {</w:t>
-              <w:br/>
-              <w:t xml:space="preserve">    if (!apiList.length) return showToast('info', 'Notice', 'No APIs registered.');</w:t>
-              <w:br/>
-              <w:t xml:space="preserve">    showToast('info', 'Diagnostic Run', `Pinging ${apiList.length} APIs...`);</w:t>
-              <w:br/>
-              <w:t xml:space="preserve">    apiList.forEach((api, idx) =&gt; setTimeout(() =&gt; checkSingleAPI(api.id), idx * 300));</w:t>
-              <w:br/>
-              <w:t>}</w:t>
-              <w:br/>
-              <w:t>$('btn-check-all-dashboard')?.addEventListener('click', checkAllAPIs);</w:t>
-              <w:br/>
-              <w:t>$('btn-check-all-monitor')?.addEventListener('click', checkAllAPIs);</w:t>
-              <w:br/>
-              <w:br/>
-              <w:t>$('api-form')?.addEventListener('submit', (e) =&gt; {</w:t>
-              <w:br/>
-              <w:t xml:space="preserve">    e.preventDefault();</w:t>
-              <w:br/>
-              <w:t xml:space="preserve">    const name = $('api-name').value.trim(), url = $('api-url').value.trim(), method = $('api-method').value;</w:t>
-              <w:br/>
-              <w:t xml:space="preserve">    if (!name || !url) return showToast('error', 'Error', 'Name and URL are required.');</w:t>
-              <w:br/>
-              <w:t xml:space="preserve">    const newApi = { id: nextApiId++, name, url, method, category: 'Custom API', calls: '1.0k', trend: '+1%', trendType: 'up', avatarColor: '#0ea5e9', avatarIcon: 'fa-cube', created_at: new Date().toISOString().slice(0, 10), lastStatus: 'Healthy' };</w:t>
-              <w:br/>
-              <w:t xml:space="preserve">    apiList.push(newApi);</w:t>
-              <w:br/>
-              <w:t xml:space="preserve">    saveStorage();</w:t>
-              <w:br/>
-              <w:t xml:space="preserve">    $('api-name').value = ''; $('api-url').value = '';</w:t>
-              <w:br/>
-              <w:t xml:space="preserve">    showToast('success', 'Added', `"${name}" registered.`);</w:t>
-              <w:br/>
-              <w:t xml:space="preserve">    renderAPITable(); updateDashboardMetrics();</w:t>
-              <w:br/>
-              <w:t xml:space="preserve">    setTimeout(() =&gt; checkSingleAPI(newApi.id), 250);</w:t>
-              <w:br/>
-              <w:t>});</w:t>
-              <w:br/>
-              <w:br/>
-              <w:t>function renderAPITable() {</w:t>
-              <w:br/>
-              <w:t xml:space="preserve">    const tbody = $('api-table-body'), count = $('api-count-badge');</w:t>
-              <w:br/>
-              <w:t xml:space="preserve">    if (!tbody) return;</w:t>
-              <w:br/>
-              <w:t xml:space="preserve">    if (count) count.textContent = `${apiList.length} APIs`;</w:t>
-              <w:br/>
-              <w:t xml:space="preserve">    let list = searchQuery ? apiList.filter(a =&gt; a.name.toLowerCase().includes(searchQuery) || a.url.toLowerCase().includes(searchQuery)) : apiList;</w:t>
-              <w:br/>
-              <w:t xml:space="preserve">    tbody.innerHTML = list.map((a, i) =&gt; `</w:t>
-              <w:br/>
-              <w:t xml:space="preserve">        &lt;tr&gt;&lt;td&gt;&lt;strong&gt;0${i+1}&lt;/strong&gt;&lt;/td&gt;&lt;td&gt;&lt;strong&gt;${escapeHtml(a.name)}&lt;/strong&gt;&lt;/td&gt;&lt;td class="url-cell"&gt;${escapeHtml(a.url)}&lt;/td&gt;&lt;td&gt;&lt;span class="api-method-badge ${a.method}"&gt;${a.method}&lt;/span&gt;&lt;/td&gt;&lt;td&gt;&lt;span class="status-badge ${(a.lastStatus||'pending').toLowerCase()}"&gt;${a.lastStatus||'Pending'}&lt;/span&gt;&lt;/td&gt;&lt;td&gt;${a.created_at}&lt;/td&gt;</w:t>
-              <w:br/>
-              <w:t xml:space="preserve">        &lt;td&gt;&lt;div class="action-btns"&gt;&lt;button class="action-btn check" onclick="checkSingleAPI(${a.id})"&gt;&lt;i class="fas fa-play"&gt;&lt;/i&gt;&lt;/button&gt;&lt;button class="action-btn delete" onclick="confirmDeleteAPI(${a.id})"&gt;&lt;i class="fas fa-trash-alt"&gt;&lt;/i&gt;&lt;/button&gt;&lt;/div&gt;&lt;/td&gt;&lt;/tr&gt;</w:t>
-              <w:br/>
-              <w:t xml:space="preserve">    `).join('');</w:t>
-              <w:br/>
-              <w:t>}</w:t>
-              <w:br/>
-              <w:br/>
-              <w:t>function confirmDeleteAPI(id) {</w:t>
-              <w:br/>
-              <w:t xml:space="preserve">    pendingDeleteId = id;</w:t>
-              <w:br/>
-              <w:t xml:space="preserve">    $('modal-message').textContent = `Remove "${apiList.find(a=&gt;a.id===id)?.name}"?`;</w:t>
-              <w:br/>
-              <w:t xml:space="preserve">    $('confirm-modal')?.classList.add('active');</w:t>
-              <w:br/>
-              <w:t>}</w:t>
-              <w:br/>
-              <w:t>$('modal-confirm')?.addEventListener('click', () =&gt; {</w:t>
-              <w:br/>
-              <w:t xml:space="preserve">    if (pendingDeleteId !== null) {</w:t>
-              <w:br/>
-              <w:t xml:space="preserve">        apiList = apiList.filter(a =&gt; a.id !== pendingDeleteId);</w:t>
-              <w:br/>
-              <w:t xml:space="preserve">        monitorHistory = monitorHistory.filter(h =&gt; h.api_id !== pendingDeleteId);</w:t>
-              <w:br/>
-              <w:t xml:space="preserve">        saveStorage();</w:t>
-              <w:br/>
-              <w:t xml:space="preserve">        pendingDeleteId = null;</w:t>
-              <w:br/>
-              <w:t xml:space="preserve">        renderAPITable(); updateDashboardMetrics(); renderActivityRows();</w:t>
-              <w:br/>
-              <w:t xml:space="preserve">        showToast('success', 'Deleted', 'API removed.');</w:t>
-              <w:br/>
-              <w:t xml:space="preserve">    }</w:t>
-              <w:br/>
-              <w:t xml:space="preserve">    $('confirm-modal')?.classList.remove('active');</w:t>
-              <w:br/>
-              <w:t>});</w:t>
-              <w:br/>
-              <w:t>$('modal-cancel')?.addEventListener('click', () =&gt; $('confirm-modal')?.classList.remove('active'));</w:t>
-              <w:br/>
-              <w:t>$('modal-close')?.addEventListener('click', () =&gt; $('confirm-modal')?.classList.remove('active'));</w:t>
-              <w:br/>
-              <w:br/>
-              <w:t>function renderMonitorCards() {</w:t>
-              <w:br/>
-              <w:t xml:space="preserve">    const g = $('monitor-grid');</w:t>
-              <w:br/>
-              <w:t xml:space="preserve">    if (!g) return;</w:t>
-              <w:br/>
-              <w:t xml:space="preserve">    g.innerHTML = apiList.map(a =&gt; {</w:t>
-              <w:br/>
-              <w:t xml:space="preserve">        const last = monitorHistory.find(h =&gt; h.api_id === a.id);</w:t>
-              <w:br/>
-              <w:t xml:space="preserve">        return `</w:t>
-              <w:br/>
-              <w:t xml:space="preserve">            &lt;div class="monitor-card ${(a.lastStatus||'pending').toLowerCase()}"&gt;</w:t>
-              <w:br/>
-              <w:t xml:space="preserve">                &lt;div class="monitor-card-header"&gt;&lt;div class="monitor-api-info"&gt;&lt;span class="api-method-badge ${a.method}"&gt;${a.method}&lt;/span&gt;&lt;span class="monitor-api-name"&gt;${escapeHtml(a.name)}&lt;/span&gt;&lt;/div&gt;&lt;span class="status-badge ${(a.lastStatus||'pending').toLowerCase()}"&gt;${a.lastStatus||'Pending'}&lt;/span&gt;&lt;/div&gt;</w:t>
-              <w:br/>
-              <w:t xml:space="preserve">                &lt;div class="monitor-card-body"&gt;&lt;div class="monitor-metrics"&gt;&lt;div&gt;&lt;span class="monitor-metric-label"&gt;Latency&lt;/span&gt;&lt;div class="monitor-metric-value"&gt;${last ? last.response_time + 'ms' : '—'}&lt;/div&gt;&lt;/div&gt;&lt;div&gt;&lt;span class="monitor-metric-label"&gt;Code&lt;/span&gt;&lt;div class="monitor-metric-value"&gt;${last ? last.status_code : '200'}&lt;/div&gt;&lt;/div&gt;&lt;/div&gt;</w:t>
-              <w:br/>
-              <w:t xml:space="preserve">                &lt;div class="monitor-card-actions"&gt;&lt;button class="btn btn-primary btn-sm" onclick="checkSingleAPI(${a.id})"&gt;&lt;i class="fas fa-play"&gt;&lt;/i&gt; Ping&lt;/button&gt;&lt;/div&gt;&lt;/div&gt;</w:t>
-              <w:br/>
-              <w:t xml:space="preserve">            &lt;/div&gt;`;</w:t>
-              <w:br/>
-              <w:t xml:space="preserve">    }).join('');</w:t>
-              <w:br/>
-              <w:t>}</w:t>
-              <w:br/>
-              <w:br/>
-              <w:t>function populateHistoryFilters() {</w:t>
-              <w:br/>
-              <w:t xml:space="preserve">    const f = $('history-api-filter');</w:t>
-              <w:br/>
-              <w:t xml:space="preserve">    if (f) f.innerHTML = '&lt;option value="all"&gt;All APIs&lt;/option&gt;' + apiList.map(a =&gt; `&lt;option value="${a.id}"&gt;${escapeHtml(a.name)}&lt;/option&gt;`).join('');</w:t>
-              <w:br/>
-              <w:t>}</w:t>
-              <w:br/>
-              <w:br/>
-              <w:t>function renderHistoryTable() {</w:t>
-              <w:br/>
-              <w:t xml:space="preserve">    const tbody = $('history-table-body'), apiF = $('history-api-filter')?.value || 'all', stF = $('history-status-filter')?.value || 'all';</w:t>
-              <w:br/>
-              <w:t xml:space="preserve">    if (!tbody) return;</w:t>
-              <w:br/>
-              <w:t xml:space="preserve">    let list = monitorHistory.filter(h =&gt; (apiF === 'all' || h.api_id.toString() === apiF) &amp;&amp; (stF === 'all' || h.status === stF));</w:t>
-              <w:br/>
-              <w:t xml:space="preserve">    tbody.innerHTML = list.map((h, i) =&gt; `</w:t>
-              <w:br/>
-              <w:t xml:space="preserve">        &lt;tr&gt;&lt;td&gt;0${i+1}&lt;/td&gt;&lt;td&gt;&lt;strong&gt;${escapeHtml(h.api_name)}&lt;/strong&gt;&lt;/td&gt;&lt;td&gt;${h.status_code}&lt;/td&gt;&lt;td style="font-weight:700"&gt;${h.response_time}ms&lt;/td&gt;&lt;td&gt;&lt;span class="status-badge ${h.status.toLowerCase()}"&gt;${h.status}&lt;/span&gt;&lt;/td&gt;&lt;td&gt;${h.checked_at}&lt;/td&gt;&lt;/tr&gt;</w:t>
-              <w:br/>
-              <w:t xml:space="preserve">    `).join('');</w:t>
-              <w:br/>
-              <w:t>}</w:t>
-              <w:br/>
-              <w:t>$('history-api-filter')?.addEventListener('change', renderHistoryTable);</w:t>
-              <w:br/>
-              <w:t>$('history-status-filter')?.addEventListener('change', renderHistoryTable);</w:t>
-              <w:br/>
-              <w:br/>
-              <w:t>function populateAnalyticsFilters() {</w:t>
-              <w:br/>
-              <w:t xml:space="preserve">    const f = $('analytics-api-filter');</w:t>
-              <w:br/>
-              <w:t xml:space="preserve">    if (f) f.innerHTML = '&lt;option value="all"&gt;All APIs&lt;/option&gt;' + apiList.map(a =&gt; `&lt;option value="${a.id}"&gt;${escapeHtml(a.name)}&lt;/option&gt;`).join('');</w:t>
-              <w:br/>
-              <w:t>}</w:t>
-              <w:br/>
-              <w:br/>
-              <w:t>function updateAnalyticsStats() {</w:t>
-              <w:br/>
-              <w:t xml:space="preserve">    const f = $('analytics-api-filter')?.value || 'all';</w:t>
-              <w:br/>
-              <w:t xml:space="preserve">    const d = f === 'all' ? monitorHistory : monitorHistory.filter(h =&gt; h.api_id.toString() === f);</w:t>
-              <w:br/>
-              <w:t xml:space="preserve">    const valid = d.filter(h =&gt; h.status !== 'Failed');</w:t>
-              <w:br/>
-              <w:t xml:space="preserve">    $('analytics-avg-response') &amp;&amp; ($('analytics-avg-response').textContent = `${valid.length ? Math.round(valid.reduce((s, h) =&gt; s + h.response_time, 0) / valid.length) : 0} ms`);</w:t>
-              <w:br/>
-              <w:t xml:space="preserve">    $('analytics-success-count') &amp;&amp; ($('analytics-success-count').textContent = valid.length);</w:t>
-              <w:br/>
-              <w:t xml:space="preserve">    $('analytics-fail-count') &amp;&amp; ($('analytics-fail-count').textContent = d.length - valid.length);</w:t>
-              <w:br/>
-              <w:t xml:space="preserve">    $('analytics-slowest') &amp;&amp; ($('analytics-slowest').textContent = `${valid.length ? Math.max(...valid.map(h =&gt; h.response_time)) : 0} ms`);</w:t>
-              <w:br/>
-              <w:t>}</w:t>
-              <w:br/>
-              <w:br/>
-              <w:t>function renderAnalyticsCharts() {</w:t>
-              <w:br/>
-              <w:t xml:space="preserve">    const isDark = document.body.classList.contains('dark-mode'), textColor = isDark ? '#9da4be' : '#575c75';</w:t>
-              <w:br/>
-              <w:t xml:space="preserve">    const c1 = $('response-time-chart'), c2 = $('success-fail-chart'), c3 = $('api-comparison-chart');</w:t>
-              <w:br/>
-              <w:t xml:space="preserve">    if (c1) {</w:t>
-              <w:br/>
-              <w:t xml:space="preserve">        if (charts.resp) charts.resp.destroy();</w:t>
-              <w:br/>
-              <w:t xml:space="preserve">        charts.resp = new Chart(c1, { type: 'bar', data: { labels: monitorHistory.slice(0, 10).map(h =&gt; h.api_name.slice(0, 8)), datasets: [{ label: 'ms', data: monitorHistory.slice(0, 10).map(h =&gt; h.response_time), backgroundColor: '#10b981', borderRadius: 6 }] }, options: { responsive: true, maintainAspectRatio: false } });</w:t>
-              <w:br/>
-              <w:t xml:space="preserve">    }</w:t>
-              <w:br/>
-              <w:t xml:space="preserve">    if (c2) {</w:t>
-              <w:br/>
-              <w:t xml:space="preserve">        if (charts.dough) charts.dough.destroy();</w:t>
-              <w:br/>
-              <w:t xml:space="preserve">        charts.dough = new Chart(c2, { type: 'doughnut', data: { labels: ['Healthy', 'Slow', 'Failed'], datasets: [{ data: [8, 3, 1], backgroundColor: ['#10b981', '#f59e0b', '#ef4444'] }] }, options: { responsive: true, maintainAspectRatio: false } });</w:t>
-              <w:br/>
-              <w:t xml:space="preserve">    }</w:t>
-              <w:br/>
-              <w:t xml:space="preserve">    if (c3) {</w:t>
-              <w:br/>
-              <w:t xml:space="preserve">        if (charts.bar) charts.bar.destroy();</w:t>
-              <w:br/>
-              <w:t xml:space="preserve">        charts.bar = new Chart(c3, { type: 'bar', data: { labels: apiList.map(a =&gt; a.name.slice(0, 10)), datasets: [{ label: 'Avg ms', data: [142, 289, 823, 356, 0], backgroundColor: '#ff5e62', borderRadius: 6 }] }, options: { indexAxis: 'y', responsive: true, maintainAspectRatio: false } });</w:t>
-              <w:br/>
-              <w:t xml:space="preserve">    }</w:t>
-              <w:br/>
-              <w:t>}</w:t>
-              <w:br/>
-              <w:t>$('analytics-api-filter')?.addEventListener('change', () =&gt; { updateAnalyticsStats(); renderAnalyticsCharts(); });</w:t>
-              <w:br/>
-              <w:br/>
-              <w:t>function showToast(type, title, msg) {</w:t>
-              <w:br/>
-              <w:t xml:space="preserve">    const t = document.createElement('div');</w:t>
-              <w:br/>
-              <w:t xml:space="preserve">    t.className = `toast ${type}`;</w:t>
-              <w:br/>
-              <w:t xml:space="preserve">    t.innerHTML = `&lt;div style="font-weight:700"&gt;${title}&lt;/div&gt;&lt;div style="font-size:0.8rem;color:var(--text-secondary)"&gt;${msg}&lt;/div&gt;`;</w:t>
-              <w:br/>
-              <w:t xml:space="preserve">    $('toast-container')?.appendChild(t);</w:t>
-              <w:br/>
-              <w:t xml:space="preserve">    setTimeout(() =&gt; { t.classList.add('removing'); setTimeout(() =&gt; t.remove(), 250); }, 3000);</w:t>
-              <w:br/>
-              <w:t>}</w:t>
-              <w:br/>
-              <w:br/>
               <w:t>function escapeHtml(str) { return (str || '').replace(/[&amp;&lt;&gt;"']/g, m =&gt; ({ '&amp;': '&amp;amp;', '&lt;': '&amp;lt;', '&gt;': '&amp;gt;', '"': '&amp;quot;', "'": '&amp;#39;' }[m])); }</w:t>
               <w:br/>
               <w:br/>
               <w:t>document.addEventListener('DOMContentLoaded', () =&gt; {</w:t>
               <w:br/>
               <w:t xml:space="preserve">    loadStorage();</w:t>
+              <w:br/>
+              <w:t xml:space="preserve">    updateAuthUI();</w:t>
               <w:br/>
               <w:t xml:space="preserve">    refreshPageData('dashboard');</w:t>
               <w:br/>

</xml_diff>